<commit_message>
New-site manual: Python libraries per component
Co-Authored-By: Claude Opus 5.5 <noreply@anthropic.com>
</commit_message>
<xml_diff>
--- a/docs/new-site-manual.docx
+++ b/docs/new-site-manual.docx
@@ -3456,6 +3456,808 @@
         </w:tc>
       </w:tr>
     </w:tbl>
+    <w:p>
+      <w:pPr>
+        <w:pStyle w:val="BodyText"/>
+        <w:bidi w:val="0"/>
+        <w:jc w:val="left"/>
+        <w:rPr/>
+      </w:pPr>
+      <w:r>
+        <w:rPr>
+          <w:rStyle w:val="Strong"/>
+        </w:rPr>
+        <w:t>Python libraries</w:t>
+      </w:r>
+    </w:p>
+    <w:tbl>
+      <w:tblPr>
+        <w:tblW w:w="5000" w:type="pct"/>
+        <w:jc w:val="left"/>
+        <w:tblInd w:w="60" w:type="dxa"/>
+        <w:tblLayout w:type="fixed"/>
+        <w:tblCellMar>
+          <w:top w:w="60" w:type="dxa"/>
+          <w:left w:w="60" w:type="dxa"/>
+          <w:bottom w:w="60" w:type="dxa"/>
+          <w:right w:w="60" w:type="dxa"/>
+        </w:tblCellMar>
+      </w:tblPr>
+      <w:tblGrid>
+        <w:gridCol w:w="3407"/>
+        <w:gridCol w:w="4132"/>
+        <w:gridCol w:w="3800"/>
+      </w:tblGrid>
+      <w:tr>
+        <w:trPr>
+          <w:tblHeader w:val="true"/>
+        </w:trPr>
+        <w:tc>
+          <w:tcPr>
+            <w:tcW w:w="3407" w:type="dxa"/>
+            <w:tcBorders>
+              <w:top w:val="single" w:sz="6" w:space="0" w:color="808080"/>
+              <w:left w:val="single" w:sz="6" w:space="0" w:color="808080"/>
+              <w:bottom w:val="single" w:sz="2" w:space="0" w:color="808080"/>
+              <w:right w:val="single" w:sz="6" w:space="0" w:color="808080"/>
+            </w:tcBorders>
+            <w:vAlign w:val="center"/>
+          </w:tcPr>
+          <w:p>
+            <w:pPr>
+              <w:pStyle w:val="TableHeading"/>
+              <w:suppressLineNumbers/>
+              <w:shd w:fill="DDEBF7" w:val="clear"/>
+              <w:bidi w:val="0"/>
+              <w:spacing w:before="0" w:after="283"/>
+              <w:jc w:val="center"/>
+              <w:rPr/>
+            </w:pPr>
+            <w:r>
+              <w:rPr/>
+              <w:t>Where</w:t>
+            </w:r>
+          </w:p>
+        </w:tc>
+        <w:tc>
+          <w:tcPr>
+            <w:tcW w:w="4132" w:type="dxa"/>
+            <w:tcBorders>
+              <w:top w:val="single" w:sz="6" w:space="0" w:color="808080"/>
+              <w:left w:val="single" w:sz="2" w:space="0" w:color="808080"/>
+              <w:bottom w:val="single" w:sz="2" w:space="0" w:color="808080"/>
+              <w:right w:val="single" w:sz="6" w:space="0" w:color="808080"/>
+            </w:tcBorders>
+            <w:vAlign w:val="center"/>
+          </w:tcPr>
+          <w:p>
+            <w:pPr>
+              <w:pStyle w:val="TableHeading"/>
+              <w:suppressLineNumbers/>
+              <w:shd w:fill="DDEBF7" w:val="clear"/>
+              <w:bidi w:val="0"/>
+              <w:spacing w:before="0" w:after="283"/>
+              <w:jc w:val="center"/>
+              <w:rPr/>
+            </w:pPr>
+            <w:r>
+              <w:rPr/>
+              <w:t>Libraries (pinned version)</w:t>
+            </w:r>
+          </w:p>
+        </w:tc>
+        <w:tc>
+          <w:tcPr>
+            <w:tcW w:w="3800" w:type="dxa"/>
+            <w:tcBorders>
+              <w:top w:val="single" w:sz="6" w:space="0" w:color="808080"/>
+              <w:left w:val="single" w:sz="2" w:space="0" w:color="808080"/>
+              <w:bottom w:val="single" w:sz="2" w:space="0" w:color="808080"/>
+              <w:right w:val="single" w:sz="6" w:space="0" w:color="808080"/>
+            </w:tcBorders>
+            <w:vAlign w:val="center"/>
+          </w:tcPr>
+          <w:p>
+            <w:pPr>
+              <w:pStyle w:val="TableHeading"/>
+              <w:suppressLineNumbers/>
+              <w:shd w:fill="DDEBF7" w:val="clear"/>
+              <w:bidi w:val="0"/>
+              <w:spacing w:before="0" w:after="283"/>
+              <w:jc w:val="center"/>
+              <w:rPr/>
+            </w:pPr>
+            <w:r>
+              <w:rPr/>
+              <w:t>Installed by</w:t>
+            </w:r>
+          </w:p>
+        </w:tc>
+      </w:tr>
+      <w:tr>
+        <w:trPr/>
+        <w:tc>
+          <w:tcPr>
+            <w:tcW w:w="3407" w:type="dxa"/>
+            <w:tcBorders>
+              <w:left w:val="single" w:sz="6" w:space="0" w:color="808080"/>
+              <w:bottom w:val="single" w:sz="2" w:space="0" w:color="808080"/>
+              <w:right w:val="single" w:sz="6" w:space="0" w:color="808080"/>
+            </w:tcBorders>
+            <w:vAlign w:val="center"/>
+          </w:tcPr>
+          <w:p>
+            <w:pPr>
+              <w:pStyle w:val="TableContents"/>
+              <w:bidi w:val="0"/>
+              <w:spacing w:before="0" w:after="283"/>
+              <w:jc w:val="left"/>
+              <w:rPr/>
+            </w:pPr>
+            <w:r>
+              <w:rPr/>
+              <w:t>Pi – gateway (</w:t>
+            </w:r>
+            <w:r>
+              <w:rPr>
+                <w:rStyle w:val="SourceText"/>
+              </w:rPr>
+              <w:t>gateway/requirements.txt</w:t>
+            </w:r>
+            <w:r>
+              <w:rPr/>
+              <w:t>)</w:t>
+            </w:r>
+          </w:p>
+        </w:tc>
+        <w:tc>
+          <w:tcPr>
+            <w:tcW w:w="4132" w:type="dxa"/>
+            <w:tcBorders>
+              <w:left w:val="single" w:sz="2" w:space="0" w:color="808080"/>
+              <w:bottom w:val="single" w:sz="2" w:space="0" w:color="808080"/>
+              <w:right w:val="single" w:sz="6" w:space="0" w:color="808080"/>
+            </w:tcBorders>
+            <w:vAlign w:val="center"/>
+          </w:tcPr>
+          <w:p>
+            <w:pPr>
+              <w:pStyle w:val="TableContents"/>
+              <w:bidi w:val="0"/>
+              <w:spacing w:before="0" w:after="283"/>
+              <w:jc w:val="left"/>
+              <w:rPr/>
+            </w:pPr>
+            <w:r>
+              <w:rPr>
+                <w:rStyle w:val="SourceText"/>
+              </w:rPr>
+              <w:t>pymodbus</w:t>
+            </w:r>
+            <w:r>
+              <w:rPr/>
+              <w:t xml:space="preserve"> 3.15.0, </w:t>
+            </w:r>
+            <w:r>
+              <w:rPr>
+                <w:rStyle w:val="SourceText"/>
+              </w:rPr>
+              <w:t>pyserial</w:t>
+            </w:r>
+            <w:r>
+              <w:rPr/>
+              <w:t xml:space="preserve"> 3.5, </w:t>
+            </w:r>
+            <w:r>
+              <w:rPr>
+                <w:rStyle w:val="SourceText"/>
+              </w:rPr>
+              <w:t>psutil</w:t>
+            </w:r>
+            <w:r>
+              <w:rPr/>
+              <w:t xml:space="preserve"> 7.2.2, </w:t>
+            </w:r>
+            <w:r>
+              <w:rPr>
+                <w:rStyle w:val="SourceText"/>
+              </w:rPr>
+              <w:t>awsiotsdk</w:t>
+            </w:r>
+            <w:r>
+              <w:rPr/>
+              <w:t xml:space="preserve"> 1.31.0, </w:t>
+            </w:r>
+            <w:r>
+              <w:rPr>
+                <w:rStyle w:val="SourceText"/>
+              </w:rPr>
+              <w:t>awscrt</w:t>
+            </w:r>
+            <w:r>
+              <w:rPr/>
+              <w:t xml:space="preserve"> 0.36.1</w:t>
+            </w:r>
+          </w:p>
+        </w:tc>
+        <w:tc>
+          <w:tcPr>
+            <w:tcW w:w="3800" w:type="dxa"/>
+            <w:tcBorders>
+              <w:left w:val="single" w:sz="2" w:space="0" w:color="808080"/>
+              <w:bottom w:val="single" w:sz="2" w:space="0" w:color="808080"/>
+              <w:right w:val="single" w:sz="6" w:space="0" w:color="808080"/>
+            </w:tcBorders>
+            <w:vAlign w:val="center"/>
+          </w:tcPr>
+          <w:p>
+            <w:pPr>
+              <w:pStyle w:val="TableContents"/>
+              <w:bidi w:val="0"/>
+              <w:spacing w:before="0" w:after="283"/>
+              <w:jc w:val="left"/>
+              <w:rPr/>
+            </w:pPr>
+            <w:r>
+              <w:rPr>
+                <w:rStyle w:val="SourceText"/>
+              </w:rPr>
+              <w:t>install.sh</w:t>
+            </w:r>
+            <w:r>
+              <w:rPr/>
+              <w:t xml:space="preserve">; </w:t>
+            </w:r>
+            <w:r>
+              <w:rPr>
+                <w:rStyle w:val="SourceText"/>
+              </w:rPr>
+              <w:t>push_site.sh</w:t>
+            </w:r>
+            <w:r>
+              <w:rPr/>
+              <w:t xml:space="preserve"> updates them when the file changes</w:t>
+            </w:r>
+          </w:p>
+        </w:tc>
+      </w:tr>
+      <w:tr>
+        <w:trPr/>
+        <w:tc>
+          <w:tcPr>
+            <w:tcW w:w="3407" w:type="dxa"/>
+            <w:tcBorders>
+              <w:left w:val="single" w:sz="6" w:space="0" w:color="808080"/>
+              <w:bottom w:val="single" w:sz="2" w:space="0" w:color="808080"/>
+              <w:right w:val="single" w:sz="6" w:space="0" w:color="808080"/>
+            </w:tcBorders>
+            <w:vAlign w:val="center"/>
+          </w:tcPr>
+          <w:p>
+            <w:pPr>
+              <w:pStyle w:val="TableContents"/>
+              <w:bidi w:val="0"/>
+              <w:spacing w:before="0" w:after="283"/>
+              <w:jc w:val="left"/>
+              <w:rPr/>
+            </w:pPr>
+            <w:r>
+              <w:rPr/>
+              <w:t>Pi – OLED, optional (</w:t>
+            </w:r>
+            <w:r>
+              <w:rPr>
+                <w:rStyle w:val="SourceText"/>
+              </w:rPr>
+              <w:t>gateway/requirements-oled.txt</w:t>
+            </w:r>
+            <w:r>
+              <w:rPr/>
+              <w:t>)</w:t>
+            </w:r>
+          </w:p>
+        </w:tc>
+        <w:tc>
+          <w:tcPr>
+            <w:tcW w:w="4132" w:type="dxa"/>
+            <w:tcBorders>
+              <w:left w:val="single" w:sz="2" w:space="0" w:color="808080"/>
+              <w:bottom w:val="single" w:sz="2" w:space="0" w:color="808080"/>
+              <w:right w:val="single" w:sz="6" w:space="0" w:color="808080"/>
+            </w:tcBorders>
+            <w:vAlign w:val="center"/>
+          </w:tcPr>
+          <w:p>
+            <w:pPr>
+              <w:pStyle w:val="TableContents"/>
+              <w:bidi w:val="0"/>
+              <w:spacing w:before="0" w:after="283"/>
+              <w:jc w:val="left"/>
+              <w:rPr/>
+            </w:pPr>
+            <w:r>
+              <w:rPr>
+                <w:rStyle w:val="SourceText"/>
+              </w:rPr>
+              <w:t>luma.oled</w:t>
+            </w:r>
+            <w:r>
+              <w:rPr/>
+              <w:t xml:space="preserve"> 3.16.0 (+ </w:t>
+            </w:r>
+            <w:r>
+              <w:rPr>
+                <w:rStyle w:val="SourceText"/>
+              </w:rPr>
+              <w:t>Pillow</w:t>
+            </w:r>
+            <w:r>
+              <w:rPr/>
+              <w:t xml:space="preserve">, </w:t>
+            </w:r>
+            <w:r>
+              <w:rPr>
+                <w:rStyle w:val="SourceText"/>
+              </w:rPr>
+              <w:t>smbus2</w:t>
+            </w:r>
+            <w:r>
+              <w:rPr/>
+              <w:t>)</w:t>
+            </w:r>
+          </w:p>
+        </w:tc>
+        <w:tc>
+          <w:tcPr>
+            <w:tcW w:w="3800" w:type="dxa"/>
+            <w:tcBorders>
+              <w:left w:val="single" w:sz="2" w:space="0" w:color="808080"/>
+              <w:bottom w:val="single" w:sz="2" w:space="0" w:color="808080"/>
+              <w:right w:val="single" w:sz="6" w:space="0" w:color="808080"/>
+            </w:tcBorders>
+            <w:vAlign w:val="center"/>
+          </w:tcPr>
+          <w:p>
+            <w:pPr>
+              <w:pStyle w:val="TableContents"/>
+              <w:bidi w:val="0"/>
+              <w:spacing w:before="0" w:after="283"/>
+              <w:jc w:val="left"/>
+              <w:rPr/>
+            </w:pPr>
+            <w:r>
+              <w:rPr/>
+              <w:t>same</w:t>
+            </w:r>
+          </w:p>
+        </w:tc>
+      </w:tr>
+      <w:tr>
+        <w:trPr/>
+        <w:tc>
+          <w:tcPr>
+            <w:tcW w:w="3407" w:type="dxa"/>
+            <w:tcBorders>
+              <w:left w:val="single" w:sz="6" w:space="0" w:color="808080"/>
+              <w:bottom w:val="single" w:sz="2" w:space="0" w:color="808080"/>
+              <w:right w:val="single" w:sz="6" w:space="0" w:color="808080"/>
+            </w:tcBorders>
+            <w:vAlign w:val="center"/>
+          </w:tcPr>
+          <w:p>
+            <w:pPr>
+              <w:pStyle w:val="TableContents"/>
+              <w:bidi w:val="0"/>
+              <w:spacing w:before="0" w:after="283"/>
+              <w:jc w:val="left"/>
+              <w:rPr/>
+            </w:pPr>
+            <w:r>
+              <w:rPr/>
+              <w:t>Pi – AKVO Modbus Tool</w:t>
+            </w:r>
+          </w:p>
+        </w:tc>
+        <w:tc>
+          <w:tcPr>
+            <w:tcW w:w="4132" w:type="dxa"/>
+            <w:tcBorders>
+              <w:left w:val="single" w:sz="2" w:space="0" w:color="808080"/>
+              <w:bottom w:val="single" w:sz="2" w:space="0" w:color="808080"/>
+              <w:right w:val="single" w:sz="6" w:space="0" w:color="808080"/>
+            </w:tcBorders>
+            <w:vAlign w:val="center"/>
+          </w:tcPr>
+          <w:p>
+            <w:pPr>
+              <w:pStyle w:val="TableContents"/>
+              <w:bidi w:val="0"/>
+              <w:spacing w:before="0" w:after="283"/>
+              <w:jc w:val="left"/>
+              <w:rPr/>
+            </w:pPr>
+            <w:r>
+              <w:rPr>
+                <w:rStyle w:val="SourceText"/>
+              </w:rPr>
+              <w:t>customtkinter</w:t>
+            </w:r>
+            <w:r>
+              <w:rPr/>
+              <w:t xml:space="preserve">, </w:t>
+            </w:r>
+            <w:r>
+              <w:rPr>
+                <w:rStyle w:val="SourceText"/>
+              </w:rPr>
+              <w:t>darkdetect</w:t>
+            </w:r>
+            <w:r>
+              <w:rPr/>
+              <w:t xml:space="preserve">, </w:t>
+            </w:r>
+            <w:r>
+              <w:rPr>
+                <w:rStyle w:val="SourceText"/>
+              </w:rPr>
+              <w:t>Pillow</w:t>
+            </w:r>
+            <w:r>
+              <w:rPr/>
+              <w:t xml:space="preserve">, </w:t>
+            </w:r>
+            <w:r>
+              <w:rPr>
+                <w:rStyle w:val="SourceText"/>
+              </w:rPr>
+              <w:t>pymodbus</w:t>
+            </w:r>
+            <w:r>
+              <w:rPr/>
+              <w:t xml:space="preserve">, </w:t>
+            </w:r>
+            <w:r>
+              <w:rPr>
+                <w:rStyle w:val="SourceText"/>
+              </w:rPr>
+              <w:t>pyserial</w:t>
+            </w:r>
+            <w:r>
+              <w:rPr/>
+              <w:t xml:space="preserve">, </w:t>
+            </w:r>
+            <w:r>
+              <w:rPr>
+                <w:rStyle w:val="SourceText"/>
+              </w:rPr>
+              <w:t>openpyxl</w:t>
+            </w:r>
+            <w:r>
+              <w:rPr/>
+              <w:t xml:space="preserve">, </w:t>
+            </w:r>
+            <w:r>
+              <w:rPr>
+                <w:rStyle w:val="SourceText"/>
+              </w:rPr>
+              <w:t>pandas</w:t>
+            </w:r>
+          </w:p>
+        </w:tc>
+        <w:tc>
+          <w:tcPr>
+            <w:tcW w:w="3800" w:type="dxa"/>
+            <w:tcBorders>
+              <w:left w:val="single" w:sz="2" w:space="0" w:color="808080"/>
+              <w:bottom w:val="single" w:sz="2" w:space="0" w:color="808080"/>
+              <w:right w:val="single" w:sz="6" w:space="0" w:color="808080"/>
+            </w:tcBorders>
+            <w:vAlign w:val="center"/>
+          </w:tcPr>
+          <w:p>
+            <w:pPr>
+              <w:pStyle w:val="TableContents"/>
+              <w:bidi w:val="0"/>
+              <w:spacing w:before="0" w:after="283"/>
+              <w:jc w:val="left"/>
+              <w:rPr/>
+            </w:pPr>
+            <w:r>
+              <w:rPr>
+                <w:rStyle w:val="SourceText"/>
+              </w:rPr>
+              <w:t>akvo-modbus-setup</w:t>
+            </w:r>
+            <w:r>
+              <w:rPr/>
+              <w:t xml:space="preserve"> (run by </w:t>
+            </w:r>
+            <w:r>
+              <w:rPr>
+                <w:rStyle w:val="SourceText"/>
+              </w:rPr>
+              <w:t>push_site.sh</w:t>
+            </w:r>
+            <w:r>
+              <w:rPr/>
+              <w:t>)</w:t>
+            </w:r>
+          </w:p>
+        </w:tc>
+      </w:tr>
+      <w:tr>
+        <w:trPr/>
+        <w:tc>
+          <w:tcPr>
+            <w:tcW w:w="3407" w:type="dxa"/>
+            <w:tcBorders>
+              <w:left w:val="single" w:sz="6" w:space="0" w:color="808080"/>
+              <w:bottom w:val="single" w:sz="2" w:space="0" w:color="808080"/>
+              <w:right w:val="single" w:sz="6" w:space="0" w:color="808080"/>
+            </w:tcBorders>
+            <w:vAlign w:val="center"/>
+          </w:tcPr>
+          <w:p>
+            <w:pPr>
+              <w:pStyle w:val="TableContents"/>
+              <w:bidi w:val="0"/>
+              <w:spacing w:before="0" w:after="283"/>
+              <w:jc w:val="left"/>
+              <w:rPr/>
+            </w:pPr>
+            <w:r>
+              <w:rPr/>
+              <w:t>Your computer – VenkoDemo tools and tests</w:t>
+            </w:r>
+          </w:p>
+        </w:tc>
+        <w:tc>
+          <w:tcPr>
+            <w:tcW w:w="4132" w:type="dxa"/>
+            <w:tcBorders>
+              <w:left w:val="single" w:sz="2" w:space="0" w:color="808080"/>
+              <w:bottom w:val="single" w:sz="2" w:space="0" w:color="808080"/>
+              <w:right w:val="single" w:sz="6" w:space="0" w:color="808080"/>
+            </w:tcBorders>
+            <w:vAlign w:val="center"/>
+          </w:tcPr>
+          <w:p>
+            <w:pPr>
+              <w:pStyle w:val="TableContents"/>
+              <w:bidi w:val="0"/>
+              <w:spacing w:before="0" w:after="283"/>
+              <w:jc w:val="left"/>
+              <w:rPr/>
+            </w:pPr>
+            <w:r>
+              <w:rPr>
+                <w:rStyle w:val="SourceText"/>
+              </w:rPr>
+              <w:t>boto3</w:t>
+            </w:r>
+            <w:r>
+              <w:rPr/>
+              <w:t xml:space="preserve">, </w:t>
+            </w:r>
+            <w:r>
+              <w:rPr>
+                <w:rStyle w:val="SourceText"/>
+              </w:rPr>
+              <w:t>openpyxl</w:t>
+            </w:r>
+            <w:r>
+              <w:rPr/>
+              <w:t xml:space="preserve">, </w:t>
+            </w:r>
+            <w:r>
+              <w:rPr>
+                <w:rStyle w:val="SourceText"/>
+              </w:rPr>
+              <w:t>jinja2</w:t>
+            </w:r>
+            <w:r>
+              <w:rPr/>
+              <w:t xml:space="preserve">, </w:t>
+            </w:r>
+            <w:r>
+              <w:rPr>
+                <w:rStyle w:val="SourceText"/>
+              </w:rPr>
+              <w:t>tzdata</w:t>
+            </w:r>
+            <w:r>
+              <w:rPr/>
+              <w:t xml:space="preserve">, </w:t>
+            </w:r>
+            <w:r>
+              <w:rPr>
+                <w:rStyle w:val="SourceText"/>
+              </w:rPr>
+              <w:t>pytest</w:t>
+            </w:r>
+          </w:p>
+        </w:tc>
+        <w:tc>
+          <w:tcPr>
+            <w:tcW w:w="3800" w:type="dxa"/>
+            <w:tcBorders>
+              <w:left w:val="single" w:sz="2" w:space="0" w:color="808080"/>
+              <w:bottom w:val="single" w:sz="2" w:space="0" w:color="808080"/>
+              <w:right w:val="single" w:sz="6" w:space="0" w:color="808080"/>
+            </w:tcBorders>
+            <w:vAlign w:val="center"/>
+          </w:tcPr>
+          <w:p>
+            <w:pPr>
+              <w:pStyle w:val="TableContents"/>
+              <w:bidi w:val="0"/>
+              <w:spacing w:before="0" w:after="283"/>
+              <w:jc w:val="left"/>
+              <w:rPr/>
+            </w:pPr>
+            <w:r>
+              <w:rPr/>
+              <w:t xml:space="preserve">you: </w:t>
+            </w:r>
+            <w:r>
+              <w:rPr>
+                <w:rStyle w:val="SourceText"/>
+              </w:rPr>
+              <w:t>pip install -r backend/requirements.txt boto3 pytest</w:t>
+            </w:r>
+            <w:r>
+              <w:rPr/>
+              <w:t xml:space="preserve"> in a venv</w:t>
+            </w:r>
+          </w:p>
+        </w:tc>
+      </w:tr>
+      <w:tr>
+        <w:trPr/>
+        <w:tc>
+          <w:tcPr>
+            <w:tcW w:w="3407" w:type="dxa"/>
+            <w:tcBorders>
+              <w:left w:val="single" w:sz="6" w:space="0" w:color="808080"/>
+              <w:bottom w:val="single" w:sz="6" w:space="0" w:color="808080"/>
+              <w:right w:val="single" w:sz="6" w:space="0" w:color="808080"/>
+            </w:tcBorders>
+            <w:vAlign w:val="center"/>
+          </w:tcPr>
+          <w:p>
+            <w:pPr>
+              <w:pStyle w:val="TableContents"/>
+              <w:bidi w:val="0"/>
+              <w:spacing w:before="0" w:after="283"/>
+              <w:jc w:val="left"/>
+              <w:rPr/>
+            </w:pPr>
+            <w:r>
+              <w:rPr/>
+              <w:t>AWS Lambda</w:t>
+            </w:r>
+          </w:p>
+        </w:tc>
+        <w:tc>
+          <w:tcPr>
+            <w:tcW w:w="4132" w:type="dxa"/>
+            <w:tcBorders>
+              <w:left w:val="single" w:sz="2" w:space="0" w:color="808080"/>
+              <w:bottom w:val="single" w:sz="6" w:space="0" w:color="808080"/>
+              <w:right w:val="single" w:sz="6" w:space="0" w:color="808080"/>
+            </w:tcBorders>
+            <w:vAlign w:val="center"/>
+          </w:tcPr>
+          <w:p>
+            <w:pPr>
+              <w:pStyle w:val="TableContents"/>
+              <w:bidi w:val="0"/>
+              <w:spacing w:before="0" w:after="283"/>
+              <w:jc w:val="left"/>
+              <w:rPr/>
+            </w:pPr>
+            <w:r>
+              <w:rPr>
+                <w:rStyle w:val="SourceText"/>
+              </w:rPr>
+              <w:t>openpyxl</w:t>
+            </w:r>
+            <w:r>
+              <w:rPr/>
+              <w:t xml:space="preserve">, </w:t>
+            </w:r>
+            <w:r>
+              <w:rPr>
+                <w:rStyle w:val="SourceText"/>
+              </w:rPr>
+              <w:t>jinja2</w:t>
+            </w:r>
+            <w:r>
+              <w:rPr/>
+              <w:t xml:space="preserve">, </w:t>
+            </w:r>
+            <w:r>
+              <w:rPr>
+                <w:rStyle w:val="SourceText"/>
+              </w:rPr>
+              <w:t>tzdata</w:t>
+            </w:r>
+            <w:r>
+              <w:rPr/>
+              <w:t xml:space="preserve"> (</w:t>
+            </w:r>
+            <w:r>
+              <w:rPr>
+                <w:rStyle w:val="SourceText"/>
+              </w:rPr>
+              <w:t>backend/requirements.txt</w:t>
+            </w:r>
+            <w:r>
+              <w:rPr/>
+              <w:t xml:space="preserve">); </w:t>
+            </w:r>
+            <w:r>
+              <w:rPr>
+                <w:rStyle w:val="SourceText"/>
+              </w:rPr>
+              <w:t>boto3</w:t>
+            </w:r>
+            <w:r>
+              <w:rPr/>
+              <w:t xml:space="preserve"> comes with the runtime</w:t>
+            </w:r>
+          </w:p>
+        </w:tc>
+        <w:tc>
+          <w:tcPr>
+            <w:tcW w:w="3800" w:type="dxa"/>
+            <w:tcBorders>
+              <w:left w:val="single" w:sz="2" w:space="0" w:color="808080"/>
+              <w:bottom w:val="single" w:sz="6" w:space="0" w:color="808080"/>
+              <w:right w:val="single" w:sz="6" w:space="0" w:color="808080"/>
+            </w:tcBorders>
+            <w:vAlign w:val="center"/>
+          </w:tcPr>
+          <w:p>
+            <w:pPr>
+              <w:pStyle w:val="TableContents"/>
+              <w:bidi w:val="0"/>
+              <w:spacing w:before="0" w:after="283"/>
+              <w:jc w:val="left"/>
+              <w:rPr/>
+            </w:pPr>
+            <w:r>
+              <w:rPr>
+                <w:rStyle w:val="SourceText"/>
+              </w:rPr>
+              <w:t>sam build</w:t>
+            </w:r>
+          </w:p>
+        </w:tc>
+      </w:tr>
+    </w:tbl>
+    <w:p>
+      <w:pPr>
+        <w:pStyle w:val="BodyText"/>
+        <w:bidi w:val="0"/>
+        <w:jc w:val="left"/>
+        <w:rPr/>
+      </w:pPr>
+      <w:r>
+        <w:rPr/>
+        <w:t xml:space="preserve">The local dashboard and </w:t>
+      </w:r>
+      <w:r>
+        <w:rPr>
+          <w:rStyle w:val="SourceText"/>
+        </w:rPr>
+        <w:t>config_manager.py</w:t>
+      </w:r>
+      <w:r>
+        <w:rPr/>
+        <w:t xml:space="preserve"> need only the Python standard library.</w:t>
+      </w:r>
+    </w:p>
     <w:p>
       <w:pPr>
         <w:pStyle w:val="BodyText"/>

</xml_diff>

<commit_message>
Add site akvo01005 stack config; manual: create wifi.csv in step 4
samconfig: [akvo01005] section with its own topics, buckets and Glue DB.
Manual step 4 now says how to create sites/<key>/wifi.csv (copy from
cmd4 or start empty), since step 3 copies only the four config CSVs.

Co-Authored-By: Claude Opus 5.5 <noreply@anthropic.com>
</commit_message>
<xml_diff>
--- a/docs/new-site-manual.docx
+++ b/docs/new-site-manual.docx
@@ -6124,7 +6124,17 @@
       </w:r>
       <w:r>
         <w:rPr/>
-        <w:t xml:space="preserve">, which is git-ignored like the certificates and never reaches </w:t>
+        <w:t xml:space="preserve"> — next to </w:t>
+      </w:r>
+      <w:r>
+        <w:rPr>
+          <w:rStyle w:val="SourceText"/>
+        </w:rPr>
+        <w:t>config_data/</w:t>
+      </w:r>
+      <w:r>
+        <w:rPr/>
+        <w:t xml:space="preserve">, not inside it — which is git-ignored like the certificates and never reaches </w:t>
       </w:r>
       <w:r>
         <w:rPr>
@@ -6134,6 +6144,85 @@
       </w:r>
       <w:r>
         <w:rPr/>
+        <w:t>. Step 3 doesn't copy it; create it from the Akvo_Green root:</w:t>
+      </w:r>
+    </w:p>
+    <w:p>
+      <w:pPr>
+        <w:pStyle w:val="PreformattedText"/>
+        <w:bidi w:val="0"/>
+        <w:jc w:val="left"/>
+        <w:rPr/>
+      </w:pPr>
+      <w:r>
+        <w:rPr>
+          <w:rStyle w:val="SourceText"/>
+        </w:rPr>
+        <w:t>cp sites/cmd4/wifi.csv sites/$KEY/wifi.csv     # same networks as cmd4: keeps their passwords</w:t>
+      </w:r>
+    </w:p>
+    <w:p>
+      <w:pPr>
+        <w:pStyle w:val="PreformattedText"/>
+        <w:bidi w:val="0"/>
+        <w:jc w:val="left"/>
+        <w:rPr/>
+      </w:pPr>
+      <w:r>
+        <w:rPr>
+          <w:rStyle w:val="SourceText"/>
+        </w:rPr>
+        <w:t># or start empty for other networks:</w:t>
+      </w:r>
+    </w:p>
+    <w:p>
+      <w:pPr>
+        <w:pStyle w:val="PreformattedText"/>
+        <w:bidi w:val="0"/>
+        <w:jc w:val="left"/>
+        <w:rPr/>
+      </w:pPr>
+      <w:r>
+        <w:rPr>
+          <w:rStyle w:val="SourceText"/>
+        </w:rPr>
+        <w:t>printf 'ssid,password\n' &gt; sites/$KEY/wifi.csv</w:t>
+      </w:r>
+    </w:p>
+    <w:p>
+      <w:pPr>
+        <w:pStyle w:val="PreformattedText"/>
+        <w:bidi w:val="0"/>
+        <w:spacing w:before="0" w:after="283"/>
+        <w:jc w:val="left"/>
+        <w:rPr/>
+      </w:pPr>
+      <w:r>
+        <w:rPr>
+          <w:rStyle w:val="SourceText"/>
+        </w:rPr>
+        <w:t>chmod 600 sites/$KEY/wifi.csv</w:t>
+      </w:r>
+    </w:p>
+    <w:p>
+      <w:pPr>
+        <w:pStyle w:val="BodyText"/>
+        <w:bidi w:val="0"/>
+        <w:jc w:val="left"/>
+        <w:rPr/>
+      </w:pPr>
+      <w:r>
+        <w:rPr/>
+        <w:t xml:space="preserve">Then edit it with a text editor so it has one row per SSID in </w:t>
+      </w:r>
+      <w:r>
+        <w:rPr>
+          <w:rStyle w:val="SourceText"/>
+        </w:rPr>
+        <w:t>system.csv</w:t>
+      </w:r>
+      <w:r>
+        <w:rPr/>
         <w:t>:</w:t>
       </w:r>
     </w:p>
@@ -6178,21 +6267,6 @@
           <w:rStyle w:val="SourceText"/>
         </w:rPr>
         <w:t>Oficina,your-oficina-password</w:t>
-      </w:r>
-    </w:p>
-    <w:p>
-      <w:pPr>
-        <w:pStyle w:val="PreformattedText"/>
-        <w:bidi w:val="0"/>
-        <w:spacing w:before="0" w:after="283"/>
-        <w:jc w:val="left"/>
-        <w:rPr/>
-      </w:pPr>
-      <w:r>
-        <w:rPr>
-          <w:rStyle w:val="SourceText"/>
-        </w:rPr>
-        <w:t>chmod 600 sites/$KEY/wifi.csv</w:t>
       </w:r>
     </w:p>
     <w:p>
@@ -6503,7 +6577,7 @@
         <w:rPr>
           <w:rStyle w:val="SourceText"/>
         </w:rPr>
-        <w:t>{ "Version": "2012-10-17", "Statement": [</w:t>
+        <w:t>{ "Version": "2012-10-17", "tatement": [</w:t>
       </w:r>
     </w:p>
     <w:p>

</xml_diff>

<commit_message>
New-site manual: OLED settings in display.csv, oled_test/oled_sim tools
Co-Authored-By: Claude Opus 5.5 <noreply@anthropic.com>
</commit_message>
<xml_diff>
--- a/docs/new-site-manual.docx
+++ b/docs/new-site-manual.docx
@@ -2201,8 +2201,8 @@
         </w:tblCellMar>
       </w:tblPr>
       <w:tblGrid>
-        <w:gridCol w:w="5177"/>
-        <w:gridCol w:w="6162"/>
+        <w:gridCol w:w="6147"/>
+        <w:gridCol w:w="5192"/>
       </w:tblGrid>
       <w:tr>
         <w:trPr>
@@ -2210,7 +2210,7 @@
         </w:trPr>
         <w:tc>
           <w:tcPr>
-            <w:tcW w:w="5177" w:type="dxa"/>
+            <w:tcW w:w="6147" w:type="dxa"/>
             <w:tcBorders>
               <w:top w:val="single" w:sz="6" w:space="0" w:color="808080"/>
               <w:left w:val="single" w:sz="6" w:space="0" w:color="808080"/>
@@ -2237,7 +2237,7 @@
         </w:tc>
         <w:tc>
           <w:tcPr>
-            <w:tcW w:w="6162" w:type="dxa"/>
+            <w:tcW w:w="5192" w:type="dxa"/>
             <w:tcBorders>
               <w:top w:val="single" w:sz="6" w:space="0" w:color="808080"/>
               <w:left w:val="single" w:sz="2" w:space="0" w:color="808080"/>
@@ -2267,7 +2267,7 @@
         <w:trPr/>
         <w:tc>
           <w:tcPr>
-            <w:tcW w:w="5177" w:type="dxa"/>
+            <w:tcW w:w="6147" w:type="dxa"/>
             <w:tcBorders>
               <w:left w:val="single" w:sz="6" w:space="0" w:color="808080"/>
               <w:bottom w:val="single" w:sz="2" w:space="0" w:color="808080"/>
@@ -2291,7 +2291,7 @@
         </w:tc>
         <w:tc>
           <w:tcPr>
-            <w:tcW w:w="6162" w:type="dxa"/>
+            <w:tcW w:w="5192" w:type="dxa"/>
             <w:tcBorders>
               <w:left w:val="single" w:sz="2" w:space="0" w:color="808080"/>
               <w:bottom w:val="single" w:sz="2" w:space="0" w:color="808080"/>
@@ -2318,7 +2318,7 @@
         <w:trPr/>
         <w:tc>
           <w:tcPr>
-            <w:tcW w:w="5177" w:type="dxa"/>
+            <w:tcW w:w="6147" w:type="dxa"/>
             <w:tcBorders>
               <w:left w:val="single" w:sz="6" w:space="0" w:color="808080"/>
               <w:bottom w:val="single" w:sz="2" w:space="0" w:color="808080"/>
@@ -2342,7 +2342,7 @@
         </w:tc>
         <w:tc>
           <w:tcPr>
-            <w:tcW w:w="6162" w:type="dxa"/>
+            <w:tcW w:w="5192" w:type="dxa"/>
             <w:tcBorders>
               <w:left w:val="single" w:sz="2" w:space="0" w:color="808080"/>
               <w:bottom w:val="single" w:sz="2" w:space="0" w:color="808080"/>
@@ -2369,7 +2369,7 @@
         <w:trPr/>
         <w:tc>
           <w:tcPr>
-            <w:tcW w:w="5177" w:type="dxa"/>
+            <w:tcW w:w="6147" w:type="dxa"/>
             <w:tcBorders>
               <w:left w:val="single" w:sz="6" w:space="0" w:color="808080"/>
               <w:bottom w:val="single" w:sz="2" w:space="0" w:color="808080"/>
@@ -2393,7 +2393,7 @@
         </w:tc>
         <w:tc>
           <w:tcPr>
-            <w:tcW w:w="6162" w:type="dxa"/>
+            <w:tcW w:w="5192" w:type="dxa"/>
             <w:tcBorders>
               <w:left w:val="single" w:sz="2" w:space="0" w:color="808080"/>
               <w:bottom w:val="single" w:sz="2" w:space="0" w:color="808080"/>
@@ -2440,7 +2440,7 @@
         <w:trPr/>
         <w:tc>
           <w:tcPr>
-            <w:tcW w:w="5177" w:type="dxa"/>
+            <w:tcW w:w="6147" w:type="dxa"/>
             <w:tcBorders>
               <w:left w:val="single" w:sz="6" w:space="0" w:color="808080"/>
               <w:bottom w:val="single" w:sz="2" w:space="0" w:color="808080"/>
@@ -2464,7 +2464,7 @@
         </w:tc>
         <w:tc>
           <w:tcPr>
-            <w:tcW w:w="6162" w:type="dxa"/>
+            <w:tcW w:w="5192" w:type="dxa"/>
             <w:tcBorders>
               <w:left w:val="single" w:sz="2" w:space="0" w:color="808080"/>
               <w:bottom w:val="single" w:sz="2" w:space="0" w:color="808080"/>
@@ -2491,7 +2491,7 @@
         <w:trPr/>
         <w:tc>
           <w:tcPr>
-            <w:tcW w:w="5177" w:type="dxa"/>
+            <w:tcW w:w="6147" w:type="dxa"/>
             <w:tcBorders>
               <w:left w:val="single" w:sz="6" w:space="0" w:color="808080"/>
               <w:bottom w:val="single" w:sz="2" w:space="0" w:color="808080"/>
@@ -2515,7 +2515,7 @@
         </w:tc>
         <w:tc>
           <w:tcPr>
-            <w:tcW w:w="6162" w:type="dxa"/>
+            <w:tcW w:w="5192" w:type="dxa"/>
             <w:tcBorders>
               <w:left w:val="single" w:sz="2" w:space="0" w:color="808080"/>
               <w:bottom w:val="single" w:sz="2" w:space="0" w:color="808080"/>
@@ -2542,7 +2542,7 @@
         <w:trPr/>
         <w:tc>
           <w:tcPr>
-            <w:tcW w:w="5177" w:type="dxa"/>
+            <w:tcW w:w="6147" w:type="dxa"/>
             <w:tcBorders>
               <w:left w:val="single" w:sz="6" w:space="0" w:color="808080"/>
               <w:bottom w:val="single" w:sz="2" w:space="0" w:color="808080"/>
@@ -2566,7 +2566,7 @@
         </w:tc>
         <w:tc>
           <w:tcPr>
-            <w:tcW w:w="6162" w:type="dxa"/>
+            <w:tcW w:w="5192" w:type="dxa"/>
             <w:tcBorders>
               <w:left w:val="single" w:sz="2" w:space="0" w:color="808080"/>
               <w:bottom w:val="single" w:sz="2" w:space="0" w:color="808080"/>
@@ -2593,7 +2593,7 @@
         <w:trPr/>
         <w:tc>
           <w:tcPr>
-            <w:tcW w:w="5177" w:type="dxa"/>
+            <w:tcW w:w="6147" w:type="dxa"/>
             <w:tcBorders>
               <w:left w:val="single" w:sz="6" w:space="0" w:color="808080"/>
               <w:bottom w:val="single" w:sz="6" w:space="0" w:color="808080"/>
@@ -2611,13 +2611,13 @@
             </w:pPr>
             <w:r>
               <w:rPr/>
-              <w:t>Optional: 1.54" I2C OLED (SSD1309), monitor + HDMI cable, keyboard/mouse</w:t>
-            </w:r>
-          </w:p>
-        </w:tc>
-        <w:tc>
-          <w:tcPr>
-            <w:tcW w:w="6162" w:type="dxa"/>
+              <w:t>Optional: 1.54" 128×64 I2C OLED (sold as SSD1309; often really SH1106), monitor + HDMI cable, keyboard/mouse</w:t>
+            </w:r>
+          </w:p>
+        </w:tc>
+        <w:tc>
+          <w:tcPr>
+            <w:tcW w:w="5192" w:type="dxa"/>
             <w:tcBorders>
               <w:left w:val="single" w:sz="2" w:space="0" w:color="808080"/>
               <w:bottom w:val="single" w:sz="6" w:space="0" w:color="808080"/>
@@ -5403,23 +5403,23 @@
       </w:pPr>
       <w:r>
         <w:rPr/>
-        <w:t xml:space="preserve">Optional OLED: add </w:t>
-      </w:r>
-      <w:r>
-        <w:rPr>
-          <w:rStyle w:val="SourceText"/>
-        </w:rPr>
-        <w:t>display_enabled,display_driver,display_address</w:t>
-      </w:r>
-      <w:r>
-        <w:rPr/>
-        <w:t xml:space="preserve"> = </w:t>
-      </w:r>
-      <w:r>
-        <w:rPr>
-          <w:rStyle w:val="SourceText"/>
-        </w:rPr>
-        <w:t>1,ssd1309,0x3C</w:t>
+        <w:t xml:space="preserve">Optional OLED: its settings go in their own file, </w:t>
+      </w:r>
+      <w:r>
+        <w:rPr>
+          <w:rStyle w:val="SourceText"/>
+        </w:rPr>
+        <w:t>display.csv</w:t>
+      </w:r>
+      <w:r>
+        <w:rPr/>
+        <w:t xml:space="preserve"> (below), not in </w:t>
+      </w:r>
+      <w:r>
+        <w:rPr>
+          <w:rStyle w:val="SourceText"/>
+        </w:rPr>
+        <w:t>system.csv</w:t>
       </w:r>
       <w:r>
         <w:rPr/>
@@ -6032,14 +6032,34 @@
         <w:rPr/>
       </w:pPr>
       <w:r>
-        <w:rPr/>
-        <w:t>Build and validate:</w:t>
+        <w:rPr>
+          <w:rStyle w:val="SourceText"/>
+        </w:rPr>
+        <w:t>display.csv</w:t>
+      </w:r>
+      <w:r>
+        <w:rPr/>
+        <w:t xml:space="preserve"> – optional, only with an OLED wired (no file = display off):</w:t>
       </w:r>
     </w:p>
     <w:p>
       <w:pPr>
         <w:pStyle w:val="PreformattedText"/>
         <w:bidi w:val="0"/>
+        <w:jc w:val="left"/>
+        <w:rPr/>
+      </w:pPr>
+      <w:r>
+        <w:rPr>
+          <w:rStyle w:val="SourceText"/>
+        </w:rPr>
+        <w:t>enabled,driver,address,column_offset,font,sensor_repeats</w:t>
+      </w:r>
+    </w:p>
+    <w:p>
+      <w:pPr>
+        <w:pStyle w:val="PreformattedText"/>
+        <w:bidi w:val="0"/>
         <w:spacing w:before="0" w:after="283"/>
         <w:jc w:val="left"/>
         <w:rPr/>
@@ -6048,225 +6068,7 @@
         <w:rPr>
           <w:rStyle w:val="SourceText"/>
         </w:rPr>
-        <w:t>cd gateway &amp;&amp; python3 config_manager.py build --config-dir ../sites/$KEY/config_data &amp;&amp; cd ..</w:t>
-      </w:r>
-    </w:p>
-    <w:p>
-      <w:pPr>
-        <w:pStyle w:val="BodyText"/>
-        <w:bidi w:val="0"/>
-        <w:jc w:val="left"/>
-        <w:rPr/>
-      </w:pPr>
-      <w:r>
-        <w:rPr/>
-        <w:t xml:space="preserve">Expected: </w:t>
-      </w:r>
-      <w:r>
-        <w:rPr>
-          <w:rStyle w:val="SourceText"/>
-        </w:rPr>
-        <w:t>Loaded N devices</w:t>
-      </w:r>
-      <w:r>
-        <w:rPr/>
-        <w:t xml:space="preserve"> and </w:t>
-      </w:r>
-      <w:r>
-        <w:rPr>
-          <w:rStyle w:val="SourceText"/>
-        </w:rPr>
-        <w:t>Validation successful</w:t>
-      </w:r>
-      <w:r>
-        <w:rPr/>
-        <w:t>.</w:t>
-      </w:r>
-    </w:p>
-    <w:p>
-      <w:pPr>
-        <w:pStyle w:val="Heading2"/>
-        <w:bidi w:val="0"/>
-        <w:jc w:val="left"/>
-        <w:rPr/>
-      </w:pPr>
-      <w:r>
-        <w:rPr/>
-        <w:t>Step 4 – WiFi networks (optional)</w:t>
-      </w:r>
-    </w:p>
-    <w:p>
-      <w:pPr>
-        <w:pStyle w:val="BodyText"/>
-        <w:bidi w:val="0"/>
-        <w:jc w:val="left"/>
-        <w:rPr/>
-      </w:pPr>
-      <w:r>
-        <w:rPr/>
-        <w:t xml:space="preserve">The Pi can know two WiFi networks, preferred first; you change them from your computer instead of re-imaging the SD card. Only the SSIDs go in </w:t>
-      </w:r>
-      <w:r>
-        <w:rPr>
-          <w:rStyle w:val="SourceText"/>
-        </w:rPr>
-        <w:t>system.csv</w:t>
-      </w:r>
-      <w:r>
-        <w:rPr/>
-        <w:t xml:space="preserve"> (step 3). The passwords go in </w:t>
-      </w:r>
-      <w:r>
-        <w:rPr>
-          <w:rStyle w:val="SourceText"/>
-        </w:rPr>
-        <w:t>sites/$KEY/wifi.csv</w:t>
-      </w:r>
-      <w:r>
-        <w:rPr/>
-        <w:t xml:space="preserve"> — next to </w:t>
-      </w:r>
-      <w:r>
-        <w:rPr>
-          <w:rStyle w:val="SourceText"/>
-        </w:rPr>
-        <w:t>config_data/</w:t>
-      </w:r>
-      <w:r>
-        <w:rPr/>
-        <w:t xml:space="preserve">, not inside it — which is git-ignored like the certificates and never reaches </w:t>
-      </w:r>
-      <w:r>
-        <w:rPr>
-          <w:rStyle w:val="SourceText"/>
-        </w:rPr>
-        <w:t>config.json</w:t>
-      </w:r>
-      <w:r>
-        <w:rPr/>
-        <w:t>. Step 3 doesn't copy it; create it from the Akvo_Green root:</w:t>
-      </w:r>
-    </w:p>
-    <w:p>
-      <w:pPr>
-        <w:pStyle w:val="PreformattedText"/>
-        <w:bidi w:val="0"/>
-        <w:jc w:val="left"/>
-        <w:rPr/>
-      </w:pPr>
-      <w:r>
-        <w:rPr>
-          <w:rStyle w:val="SourceText"/>
-        </w:rPr>
-        <w:t>cp sites/cmd4/wifi.csv sites/$KEY/wifi.csv     # same networks as cmd4: keeps their passwords</w:t>
-      </w:r>
-    </w:p>
-    <w:p>
-      <w:pPr>
-        <w:pStyle w:val="PreformattedText"/>
-        <w:bidi w:val="0"/>
-        <w:jc w:val="left"/>
-        <w:rPr/>
-      </w:pPr>
-      <w:r>
-        <w:rPr>
-          <w:rStyle w:val="SourceText"/>
-        </w:rPr>
-        <w:t># or start empty for other networks:</w:t>
-      </w:r>
-    </w:p>
-    <w:p>
-      <w:pPr>
-        <w:pStyle w:val="PreformattedText"/>
-        <w:bidi w:val="0"/>
-        <w:jc w:val="left"/>
-        <w:rPr/>
-      </w:pPr>
-      <w:r>
-        <w:rPr>
-          <w:rStyle w:val="SourceText"/>
-        </w:rPr>
-        <w:t>printf 'ssid,password\n' &gt; sites/$KEY/wifi.csv</w:t>
-      </w:r>
-    </w:p>
-    <w:p>
-      <w:pPr>
-        <w:pStyle w:val="PreformattedText"/>
-        <w:bidi w:val="0"/>
-        <w:spacing w:before="0" w:after="283"/>
-        <w:jc w:val="left"/>
-        <w:rPr/>
-      </w:pPr>
-      <w:r>
-        <w:rPr>
-          <w:rStyle w:val="SourceText"/>
-        </w:rPr>
-        <w:t>chmod 600 sites/$KEY/wifi.csv</w:t>
-      </w:r>
-    </w:p>
-    <w:p>
-      <w:pPr>
-        <w:pStyle w:val="BodyText"/>
-        <w:bidi w:val="0"/>
-        <w:jc w:val="left"/>
-        <w:rPr/>
-      </w:pPr>
-      <w:r>
-        <w:rPr/>
-        <w:t xml:space="preserve">Then edit it with a text editor so it has one row per SSID in </w:t>
-      </w:r>
-      <w:r>
-        <w:rPr>
-          <w:rStyle w:val="SourceText"/>
-        </w:rPr>
-        <w:t>system.csv</w:t>
-      </w:r>
-      <w:r>
-        <w:rPr/>
-        <w:t>:</w:t>
-      </w:r>
-    </w:p>
-    <w:p>
-      <w:pPr>
-        <w:pStyle w:val="PreformattedText"/>
-        <w:bidi w:val="0"/>
-        <w:jc w:val="left"/>
-        <w:rPr/>
-      </w:pPr>
-      <w:r>
-        <w:rPr>
-          <w:rStyle w:val="SourceText"/>
-        </w:rPr>
-        <w:t>ssid,password</w:t>
-      </w:r>
-    </w:p>
-    <w:p>
-      <w:pPr>
-        <w:pStyle w:val="PreformattedText"/>
-        <w:bidi w:val="0"/>
-        <w:jc w:val="left"/>
-        <w:rPr/>
-      </w:pPr>
-      <w:r>
-        <w:rPr>
-          <w:rStyle w:val="SourceText"/>
-        </w:rPr>
-        <w:t>Planta,your-planta-password</w:t>
-      </w:r>
-    </w:p>
-    <w:p>
-      <w:pPr>
-        <w:pStyle w:val="PreformattedText"/>
-        <w:bidi w:val="0"/>
-        <w:spacing w:before="0" w:after="283"/>
-        <w:jc w:val="left"/>
-        <w:rPr/>
-      </w:pPr>
-      <w:r>
-        <w:rPr>
-          <w:rStyle w:val="SourceText"/>
-        </w:rPr>
-        <w:t>Oficina,your-oficina-password</w:t>
+        <w:t>1,sh1106,0x3C,3,3x5,2</w:t>
       </w:r>
     </w:p>
     <w:p>
@@ -6288,17 +6090,47 @@
       </w:pPr>
       <w:r>
         <w:rPr/>
-        <w:t xml:space="preserve">One row per SSID in </w:t>
-      </w:r>
-      <w:r>
-        <w:rPr>
-          <w:rStyle w:val="SourceText"/>
-        </w:rPr>
-        <w:t>system.csv</w:t>
-      </w:r>
-      <w:r>
-        <w:rPr/>
-        <w:t xml:space="preserve">; an empty password means an open network. </w:t>
+        <w:t xml:space="preserve">Find </w:t>
+      </w:r>
+      <w:r>
+        <w:rPr>
+          <w:rStyle w:val="SourceText"/>
+        </w:rPr>
+        <w:t>driver</w:t>
+      </w:r>
+      <w:r>
+        <w:rPr/>
+        <w:t xml:space="preserve"> (and for </w:t>
+      </w:r>
+      <w:r>
+        <w:rPr>
+          <w:rStyle w:val="SourceText"/>
+        </w:rPr>
+        <w:t>sh1106</w:t>
+      </w:r>
+      <w:r>
+        <w:rPr/>
+        <w:t xml:space="preserve"> the </w:t>
+      </w:r>
+      <w:r>
+        <w:rPr>
+          <w:rStyle w:val="SourceText"/>
+        </w:rPr>
+        <w:t>column_offset</w:t>
+      </w:r>
+      <w:r>
+        <w:rPr/>
+        <w:t xml:space="preserve">) on the Pi with </w:t>
+      </w:r>
+      <w:r>
+        <w:rPr>
+          <w:rStyle w:val="SourceText"/>
+        </w:rPr>
+        <w:t>tools/oled_test.py</w:t>
+      </w:r>
+      <w:r>
+        <w:rPr/>
+        <w:t xml:space="preserve">; the 1.54" boards sold as SSD1309 have been SH1106 with offset 3. </w:t>
       </w:r>
     </w:p>
     <w:p>
@@ -6313,87 +6145,126 @@
           <w:tab w:val="left" w:pos="709" w:leader="none"/>
         </w:tabs>
         <w:bidi w:val="0"/>
-        <w:spacing w:before="0" w:after="0"/>
         <w:ind w:hanging="283" w:left="709"/>
         <w:jc w:val="left"/>
         <w:rPr/>
       </w:pPr>
       <w:r>
         <w:rPr/>
-        <w:t xml:space="preserve">WPA passwords are 8–63 characters. A placeholder like </w:t>
-      </w:r>
-      <w:r>
-        <w:rPr>
-          <w:rStyle w:val="SourceText"/>
-        </w:rPr>
-        <w:t>CHANGE_ME</w:t>
-      </w:r>
-      <w:r>
-        <w:rPr/>
-        <w:t xml:space="preserve"> is refused on push. </w:t>
+        <w:t xml:space="preserve">To tune the screens, open the simulator on the site: </w:t>
+      </w:r>
+      <w:r>
+        <w:rPr>
+          <w:rStyle w:val="SourceText"/>
+        </w:rPr>
+        <w:t>python3 tools/oled_sim.py $KEY</w:t>
+      </w:r>
+      <w:r>
+        <w:rPr/>
+        <w:t xml:space="preserve"> (after the build below). Its </w:t>
+      </w:r>
+      <w:r>
+        <w:rPr>
+          <w:rStyle w:val="Strong"/>
+        </w:rPr>
+        <w:t>Exportar display.csv</w:t>
+      </w:r>
+      <w:r>
+        <w:rPr/>
+        <w:t xml:space="preserve"> writes this file; all columns are in </w:t>
+      </w:r>
+      <w:r>
+        <w:rPr>
+          <w:rStyle w:val="SourceText"/>
+        </w:rPr>
+        <w:t>docs/edge_node_config/CONFIGURATION.md</w:t>
+      </w:r>
+      <w:r>
+        <w:rPr/>
+        <w:t xml:space="preserve">. </w:t>
       </w:r>
     </w:p>
     <w:p>
       <w:pPr>
         <w:pStyle w:val="BodyText"/>
-        <w:numPr>
-          <w:ilvl w:val="0"/>
-          <w:numId w:val="11"/>
-        </w:numPr>
-        <w:tabs>
-          <w:tab w:val="clear" w:pos="1134"/>
-          <w:tab w:val="left" w:pos="709" w:leader="none"/>
-        </w:tabs>
-        <w:bidi w:val="0"/>
-        <w:spacing w:before="0" w:after="0"/>
-        <w:ind w:hanging="283" w:left="709"/>
-        <w:jc w:val="left"/>
-        <w:rPr/>
-      </w:pPr>
-      <w:r>
-        <w:rPr/>
-        <w:t xml:space="preserve">On the next push (step 8) they become NetworkManager profiles </w:t>
-      </w:r>
-      <w:r>
-        <w:rPr>
-          <w:rStyle w:val="SourceText"/>
-        </w:rPr>
-        <w:t>akvo-wifi1</w:t>
-      </w:r>
-      <w:r>
-        <w:rPr/>
-        <w:t xml:space="preserve"> (priority 20) and </w:t>
-      </w:r>
-      <w:r>
-        <w:rPr>
-          <w:rStyle w:val="SourceText"/>
-        </w:rPr>
-        <w:t>akvo-wifi2</w:t>
-      </w:r>
-      <w:r>
-        <w:rPr/>
-        <w:t xml:space="preserve"> (priority 10). The current connection isn't dropped; the Pi switches when its network goes away or at the next reboot. </w:t>
+        <w:bidi w:val="0"/>
+        <w:jc w:val="left"/>
+        <w:rPr/>
+      </w:pPr>
+      <w:r>
+        <w:rPr/>
+        <w:t>Build and validate:</w:t>
+      </w:r>
+    </w:p>
+    <w:p>
+      <w:pPr>
+        <w:pStyle w:val="PreformattedText"/>
+        <w:bidi w:val="0"/>
+        <w:spacing w:before="0" w:after="283"/>
+        <w:jc w:val="left"/>
+        <w:rPr/>
+      </w:pPr>
+      <w:r>
+        <w:rPr>
+          <w:rStyle w:val="SourceText"/>
+        </w:rPr>
+        <w:t>cd gateway &amp;&amp; python3 config_manager.py build --config-dir ../sites/$KEY/config_data &amp;&amp; cd ..</w:t>
       </w:r>
     </w:p>
     <w:p>
       <w:pPr>
         <w:pStyle w:val="BodyText"/>
-        <w:numPr>
-          <w:ilvl w:val="0"/>
-          <w:numId w:val="11"/>
-        </w:numPr>
-        <w:tabs>
-          <w:tab w:val="clear" w:pos="1134"/>
-          <w:tab w:val="left" w:pos="709" w:leader="none"/>
-        </w:tabs>
-        <w:bidi w:val="0"/>
-        <w:ind w:hanging="283" w:left="709"/>
-        <w:jc w:val="left"/>
-        <w:rPr/>
-      </w:pPr>
-      <w:r>
-        <w:rPr/>
-        <w:t xml:space="preserve">To change WiFi later: edit </w:t>
+        <w:bidi w:val="0"/>
+        <w:jc w:val="left"/>
+        <w:rPr/>
+      </w:pPr>
+      <w:r>
+        <w:rPr/>
+        <w:t xml:space="preserve">Expected: </w:t>
+      </w:r>
+      <w:r>
+        <w:rPr>
+          <w:rStyle w:val="SourceText"/>
+        </w:rPr>
+        <w:t>Loaded N devices</w:t>
+      </w:r>
+      <w:r>
+        <w:rPr/>
+        <w:t xml:space="preserve"> and </w:t>
+      </w:r>
+      <w:r>
+        <w:rPr>
+          <w:rStyle w:val="SourceText"/>
+        </w:rPr>
+        <w:t>Validation successful</w:t>
+      </w:r>
+      <w:r>
+        <w:rPr/>
+        <w:t>.</w:t>
+      </w:r>
+    </w:p>
+    <w:p>
+      <w:pPr>
+        <w:pStyle w:val="Heading2"/>
+        <w:bidi w:val="0"/>
+        <w:jc w:val="left"/>
+        <w:rPr/>
+      </w:pPr>
+      <w:r>
+        <w:rPr/>
+        <w:t>Step 4 – WiFi networks (optional)</w:t>
+      </w:r>
+    </w:p>
+    <w:p>
+      <w:pPr>
+        <w:pStyle w:val="BodyText"/>
+        <w:bidi w:val="0"/>
+        <w:jc w:val="left"/>
+        <w:rPr/>
+      </w:pPr>
+      <w:r>
+        <w:rPr/>
+        <w:t xml:space="preserve">The Pi can know two WiFi networks, preferred first; you change them from your computer instead of re-imaging the SD card. Only the SSIDs go in </w:t>
       </w:r>
       <w:r>
         <w:rPr>
@@ -6403,29 +6274,94 @@
       </w:r>
       <w:r>
         <w:rPr/>
-        <w:t xml:space="preserve"> and </w:t>
-      </w:r>
-      <w:r>
-        <w:rPr>
-          <w:rStyle w:val="SourceText"/>
-        </w:rPr>
-        <w:t>wifi.csv</w:t>
-      </w:r>
-      <w:r>
-        <w:rPr/>
-        <w:t xml:space="preserve">, rebuild, push. </w:t>
-      </w:r>
-    </w:p>
-    <w:p>
-      <w:pPr>
-        <w:pStyle w:val="Heading2"/>
-        <w:bidi w:val="0"/>
-        <w:jc w:val="left"/>
-        <w:rPr/>
-      </w:pPr>
-      <w:r>
-        <w:rPr/>
-        <w:t>Step 5 – IoT certificate, policy and thing (AWS)</w:t>
+        <w:t xml:space="preserve"> (step 3). The passwords go in </w:t>
+      </w:r>
+      <w:r>
+        <w:rPr>
+          <w:rStyle w:val="SourceText"/>
+        </w:rPr>
+        <w:t>sites/$KEY/wifi.csv</w:t>
+      </w:r>
+      <w:r>
+        <w:rPr/>
+        <w:t xml:space="preserve"> — next to </w:t>
+      </w:r>
+      <w:r>
+        <w:rPr>
+          <w:rStyle w:val="SourceText"/>
+        </w:rPr>
+        <w:t>config_data/</w:t>
+      </w:r>
+      <w:r>
+        <w:rPr/>
+        <w:t xml:space="preserve">, not inside it — which is git-ignored like the certificates and never reaches </w:t>
+      </w:r>
+      <w:r>
+        <w:rPr>
+          <w:rStyle w:val="SourceText"/>
+        </w:rPr>
+        <w:t>config.json</w:t>
+      </w:r>
+      <w:r>
+        <w:rPr/>
+        <w:t>. Step 3 doesn't copy it; create it from the Akvo_Green root:</w:t>
+      </w:r>
+    </w:p>
+    <w:p>
+      <w:pPr>
+        <w:pStyle w:val="PreformattedText"/>
+        <w:bidi w:val="0"/>
+        <w:jc w:val="left"/>
+        <w:rPr/>
+      </w:pPr>
+      <w:r>
+        <w:rPr>
+          <w:rStyle w:val="SourceText"/>
+        </w:rPr>
+        <w:t>cp sites/cmd4/wifi.csv sites/$KEY/wifi.csv     # same networks as cmd4: keeps their passwords</w:t>
+      </w:r>
+    </w:p>
+    <w:p>
+      <w:pPr>
+        <w:pStyle w:val="PreformattedText"/>
+        <w:bidi w:val="0"/>
+        <w:jc w:val="left"/>
+        <w:rPr/>
+      </w:pPr>
+      <w:r>
+        <w:rPr>
+          <w:rStyle w:val="SourceText"/>
+        </w:rPr>
+        <w:t># or start empty for other networks:</w:t>
+      </w:r>
+    </w:p>
+    <w:p>
+      <w:pPr>
+        <w:pStyle w:val="PreformattedText"/>
+        <w:bidi w:val="0"/>
+        <w:jc w:val="left"/>
+        <w:rPr/>
+      </w:pPr>
+      <w:r>
+        <w:rPr>
+          <w:rStyle w:val="SourceText"/>
+        </w:rPr>
+        <w:t>printf 'ssid,password\n' &gt; sites/$KEY/wifi.csv</w:t>
+      </w:r>
+    </w:p>
+    <w:p>
+      <w:pPr>
+        <w:pStyle w:val="PreformattedText"/>
+        <w:bidi w:val="0"/>
+        <w:spacing w:before="0" w:after="283"/>
+        <w:jc w:val="left"/>
+        <w:rPr/>
+      </w:pPr>
+      <w:r>
+        <w:rPr>
+          <w:rStyle w:val="SourceText"/>
+        </w:rPr>
+        <w:t>chmod 600 sites/$KEY/wifi.csv</w:t>
       </w:r>
     </w:p>
     <w:p>
@@ -6437,37 +6373,17 @@
       </w:pPr>
       <w:r>
         <w:rPr/>
-        <w:t xml:space="preserve">Each Pi gets its own certificate and a policy that only lets it connect as </w:t>
-      </w:r>
-      <w:r>
-        <w:rPr>
-          <w:rStyle w:val="SourceText"/>
-        </w:rPr>
-        <w:t>$CLIENT</w:t>
-      </w:r>
-      <w:r>
-        <w:rPr/>
-        <w:t xml:space="preserve"> and publish to </w:t>
-      </w:r>
-      <w:r>
-        <w:rPr>
-          <w:rStyle w:val="SourceText"/>
-        </w:rPr>
-        <w:t>VENKO/$KEY/*</w:t>
-      </w:r>
-      <w:r>
-        <w:rPr/>
-        <w:t xml:space="preserve">. The private key can only be downloaded now; it goes in </w:t>
-      </w:r>
-      <w:r>
-        <w:rPr>
-          <w:rStyle w:val="SourceText"/>
-        </w:rPr>
-        <w:t>sites/$KEY/certs/</w:t>
-      </w:r>
-      <w:r>
-        <w:rPr/>
-        <w:t xml:space="preserve"> (git-ignored) and on the Pi, nowhere else. Run from the Akvo_Green root:</w:t>
+        <w:t xml:space="preserve">Then edit it with a text editor so it has one row per SSID in </w:t>
+      </w:r>
+      <w:r>
+        <w:rPr>
+          <w:rStyle w:val="SourceText"/>
+        </w:rPr>
+        <w:t>system.csv</w:t>
+      </w:r>
+      <w:r>
+        <w:rPr/>
+        <w:t>:</w:t>
       </w:r>
     </w:p>
     <w:p>
@@ -6481,7 +6397,7 @@
         <w:rPr>
           <w:rStyle w:val="SourceText"/>
         </w:rPr>
-        <w:t>mkdir -p sites/$KEY/certs &amp;&amp; cd sites/$KEY/certs &amp;&amp; umask 077</w:t>
+        <w:t>ssid,password</w:t>
       </w:r>
     </w:p>
     <w:p>
@@ -6495,205 +6411,13 @@
         <w:rPr>
           <w:rStyle w:val="SourceText"/>
         </w:rPr>
-        <w:t>aws iot create-keys-and-certificate --set-as-active \</w:t>
+        <w:t>Planta,your-planta-password</w:t>
       </w:r>
     </w:p>
     <w:p>
       <w:pPr>
         <w:pStyle w:val="PreformattedText"/>
         <w:bidi w:val="0"/>
-        <w:jc w:val="left"/>
-        <w:rPr/>
-      </w:pPr>
-      <w:r>
-        <w:rPr>
-          <w:rStyle w:val="SourceText"/>
-        </w:rPr>
-        <w:t xml:space="preserve">  </w:t>
-      </w:r>
-      <w:r>
-        <w:rPr>
-          <w:rStyle w:val="SourceText"/>
-        </w:rPr>
-        <w:t>--certificate-pem-outfile certificate.pem.crt --private-key-outfile private.pem.key \</w:t>
-      </w:r>
-    </w:p>
-    <w:p>
-      <w:pPr>
-        <w:pStyle w:val="PreformattedText"/>
-        <w:bidi w:val="0"/>
-        <w:jc w:val="left"/>
-        <w:rPr/>
-      </w:pPr>
-      <w:r>
-        <w:rPr>
-          <w:rStyle w:val="SourceText"/>
-        </w:rPr>
-        <w:t xml:space="preserve">  </w:t>
-      </w:r>
-      <w:r>
-        <w:rPr>
-          <w:rStyle w:val="SourceText"/>
-        </w:rPr>
-        <w:t>--query certificateArn --output text &gt; cert.arn</w:t>
-      </w:r>
-    </w:p>
-    <w:p>
-      <w:pPr>
-        <w:pStyle w:val="PreformattedText"/>
-        <w:bidi w:val="0"/>
-        <w:jc w:val="left"/>
-        <w:rPr/>
-      </w:pPr>
-      <w:r>
-        <w:rPr>
-          <w:rStyle w:val="SourceText"/>
-        </w:rPr>
-        <w:t>cp ../../cmd4/certs/AmazonRootCA1.pem .</w:t>
-      </w:r>
-    </w:p>
-    <w:p>
-      <w:pPr>
-        <w:pStyle w:val="PreformattedText"/>
-        <w:bidi w:val="0"/>
-        <w:jc w:val="left"/>
-        <w:rPr/>
-      </w:pPr>
-      <w:r>
-        <w:rPr>
-          <w:rStyle w:val="SourceText"/>
-        </w:rPr>
-        <w:t>cat &gt; policy.json &lt;&lt;JSON</w:t>
-      </w:r>
-    </w:p>
-    <w:p>
-      <w:pPr>
-        <w:pStyle w:val="PreformattedText"/>
-        <w:bidi w:val="0"/>
-        <w:jc w:val="left"/>
-        <w:rPr/>
-      </w:pPr>
-      <w:r>
-        <w:rPr>
-          <w:rStyle w:val="SourceText"/>
-        </w:rPr>
-        <w:t>{ "Version": "2012-10-17", "tatement": [</w:t>
-      </w:r>
-    </w:p>
-    <w:p>
-      <w:pPr>
-        <w:pStyle w:val="PreformattedText"/>
-        <w:bidi w:val="0"/>
-        <w:jc w:val="left"/>
-        <w:rPr/>
-      </w:pPr>
-      <w:r>
-        <w:rPr>
-          <w:rStyle w:val="SourceText"/>
-        </w:rPr>
-        <w:t xml:space="preserve">  </w:t>
-      </w:r>
-      <w:r>
-        <w:rPr>
-          <w:rStyle w:val="SourceText"/>
-        </w:rPr>
-        <w:t>{ "Effect": "Allow", "Action": "iot:Connect", "Resource": "arn:aws:iot:us-east-1:$ACCT:client/$CLIENT" },</w:t>
-      </w:r>
-    </w:p>
-    <w:p>
-      <w:pPr>
-        <w:pStyle w:val="PreformattedText"/>
-        <w:bidi w:val="0"/>
-        <w:jc w:val="left"/>
-        <w:rPr/>
-      </w:pPr>
-      <w:r>
-        <w:rPr>
-          <w:rStyle w:val="SourceText"/>
-        </w:rPr>
-        <w:t xml:space="preserve">  </w:t>
-      </w:r>
-      <w:r>
-        <w:rPr>
-          <w:rStyle w:val="SourceText"/>
-        </w:rPr>
-        <w:t>{ "Effect": "Allow", "Action": "iot:Publish", "Resource": "arn:aws:iot:us-east-1:$ACCT:topic/VENKO/$KEY/*" } ] }</w:t>
-      </w:r>
-    </w:p>
-    <w:p>
-      <w:pPr>
-        <w:pStyle w:val="PreformattedText"/>
-        <w:bidi w:val="0"/>
-        <w:jc w:val="left"/>
-        <w:rPr/>
-      </w:pPr>
-      <w:r>
-        <w:rPr>
-          <w:rStyle w:val="SourceText"/>
-        </w:rPr>
-        <w:t>JSON</w:t>
-      </w:r>
-    </w:p>
-    <w:p>
-      <w:pPr>
-        <w:pStyle w:val="PreformattedText"/>
-        <w:bidi w:val="0"/>
-        <w:jc w:val="left"/>
-        <w:rPr/>
-      </w:pPr>
-      <w:r>
-        <w:rPr>
-          <w:rStyle w:val="SourceText"/>
-        </w:rPr>
-        <w:t>aws iot create-policy --policy-name venko-$KEY-gateway --policy-document file://policy.json</w:t>
-      </w:r>
-    </w:p>
-    <w:p>
-      <w:pPr>
-        <w:pStyle w:val="PreformattedText"/>
-        <w:bidi w:val="0"/>
-        <w:jc w:val="left"/>
-        <w:rPr/>
-      </w:pPr>
-      <w:r>
-        <w:rPr>
-          <w:rStyle w:val="SourceText"/>
-        </w:rPr>
-        <w:t>aws iot attach-policy --policy-name venko-$KEY-gateway --target "$(cat cert.arn)"</w:t>
-      </w:r>
-    </w:p>
-    <w:p>
-      <w:pPr>
-        <w:pStyle w:val="PreformattedText"/>
-        <w:bidi w:val="0"/>
-        <w:jc w:val="left"/>
-        <w:rPr/>
-      </w:pPr>
-      <w:r>
-        <w:rPr>
-          <w:rStyle w:val="SourceText"/>
-        </w:rPr>
-        <w:t>aws iot create-thing --thing-name $CLIENT</w:t>
-      </w:r>
-    </w:p>
-    <w:p>
-      <w:pPr>
-        <w:pStyle w:val="PreformattedText"/>
-        <w:bidi w:val="0"/>
-        <w:jc w:val="left"/>
-        <w:rPr/>
-      </w:pPr>
-      <w:r>
-        <w:rPr>
-          <w:rStyle w:val="SourceText"/>
-        </w:rPr>
-        <w:t>aws iot attach-thing-principal --thing-name $CLIENT --principal "$(cat cert.arn)"</w:t>
-      </w:r>
-    </w:p>
-    <w:p>
-      <w:pPr>
-        <w:pStyle w:val="PreformattedText"/>
-        <w:bidi w:val="0"/>
         <w:spacing w:before="0" w:after="283"/>
         <w:jc w:val="left"/>
         <w:rPr/>
@@ -6702,422 +6426,7 @@
         <w:rPr>
           <w:rStyle w:val="SourceText"/>
         </w:rPr>
-        <w:t>cd ../../..</w:t>
-      </w:r>
-    </w:p>
-    <w:p>
-      <w:pPr>
-        <w:pStyle w:val="BodyText"/>
-        <w:bidi w:val="0"/>
-        <w:jc w:val="left"/>
-        <w:rPr/>
-      </w:pPr>
-      <w:r>
-        <w:rPr/>
-        <w:t xml:space="preserve">Result: five files in </w:t>
-      </w:r>
-      <w:r>
-        <w:rPr>
-          <w:rStyle w:val="SourceText"/>
-        </w:rPr>
-        <w:t>sites/plant5/certs/</w:t>
-      </w:r>
-      <w:r>
-        <w:rPr/>
-        <w:t xml:space="preserve">, all mode </w:t>
-      </w:r>
-      <w:r>
-        <w:rPr>
-          <w:rStyle w:val="SourceText"/>
-        </w:rPr>
-        <w:t>600</w:t>
-      </w:r>
-      <w:r>
-        <w:rPr/>
-        <w:t xml:space="preserve"> — </w:t>
-      </w:r>
-      <w:r>
-        <w:rPr>
-          <w:rStyle w:val="SourceText"/>
-        </w:rPr>
-        <w:t>certificate.pem.crt</w:t>
-      </w:r>
-      <w:r>
-        <w:rPr/>
-        <w:t xml:space="preserve">, </w:t>
-      </w:r>
-      <w:r>
-        <w:rPr>
-          <w:rStyle w:val="SourceText"/>
-        </w:rPr>
-        <w:t>private.pem.key</w:t>
-      </w:r>
-      <w:r>
-        <w:rPr/>
-        <w:t xml:space="preserve">, </w:t>
-      </w:r>
-      <w:r>
-        <w:rPr>
-          <w:rStyle w:val="SourceText"/>
-        </w:rPr>
-        <w:t>AmazonRootCA1.pem</w:t>
-      </w:r>
-      <w:r>
-        <w:rPr/>
-        <w:t xml:space="preserve">, </w:t>
-      </w:r>
-      <w:r>
-        <w:rPr>
-          <w:rStyle w:val="SourceText"/>
-        </w:rPr>
-        <w:t>cert.arn</w:t>
-      </w:r>
-      <w:r>
-        <w:rPr/>
-        <w:t xml:space="preserve">, </w:t>
-      </w:r>
-      <w:r>
-        <w:rPr>
-          <w:rStyle w:val="SourceText"/>
-        </w:rPr>
-        <w:t>policy.json</w:t>
-      </w:r>
-      <w:r>
-        <w:rPr/>
-        <w:t xml:space="preserve">. </w:t>
-      </w:r>
-      <w:r>
-        <w:rPr>
-          <w:rStyle w:val="SourceText"/>
-        </w:rPr>
-        <w:t>CLIENT</w:t>
-      </w:r>
-      <w:r>
-        <w:rPr/>
-        <w:t xml:space="preserve"> must equal </w:t>
-      </w:r>
-      <w:r>
-        <w:rPr>
-          <w:rStyle w:val="SourceText"/>
-        </w:rPr>
-        <w:t>client_id</w:t>
-      </w:r>
-      <w:r>
-        <w:rPr/>
-        <w:t xml:space="preserve"> in </w:t>
-      </w:r>
-      <w:r>
-        <w:rPr>
-          <w:rStyle w:val="SourceText"/>
-        </w:rPr>
-        <w:t>aws.csv</w:t>
-      </w:r>
-      <w:r>
-        <w:rPr/>
-        <w:t xml:space="preserve">, and </w:t>
-      </w:r>
-      <w:r>
-        <w:rPr>
-          <w:rStyle w:val="SourceText"/>
-        </w:rPr>
-        <w:t>KEY</w:t>
-      </w:r>
-      <w:r>
-        <w:rPr/>
-        <w:t xml:space="preserve"> the key in its topics.</w:t>
-      </w:r>
-    </w:p>
-    <w:p>
-      <w:pPr>
-        <w:pStyle w:val="Heading2"/>
-        <w:bidi w:val="0"/>
-        <w:jc w:val="left"/>
-        <w:rPr/>
-      </w:pPr>
-      <w:r>
-        <w:rPr/>
-        <w:t>Step 6 – AWS stack (VenkoDemo)</w:t>
-      </w:r>
-    </w:p>
-    <w:p>
-      <w:pPr>
-        <w:pStyle w:val="BodyText"/>
-        <w:bidi w:val="0"/>
-        <w:jc w:val="left"/>
-        <w:rPr/>
-      </w:pPr>
-      <w:r>
-        <w:rPr/>
-        <w:t xml:space="preserve">One CloudFormation stack per site holds the storage, API, reports and dashboard. Add the site's section to </w:t>
-      </w:r>
-      <w:r>
-        <w:rPr>
-          <w:rStyle w:val="SourceText"/>
-        </w:rPr>
-        <w:t>VenkoDemo/infra/samconfig.toml</w:t>
-      </w:r>
-      <w:r>
-        <w:rPr/>
-        <w:t xml:space="preserve"> (copy </w:t>
-      </w:r>
-      <w:r>
-        <w:rPr>
-          <w:rStyle w:val="SourceText"/>
-        </w:rPr>
-        <w:t>[cmd4.*]</w:t>
-      </w:r>
-      <w:r>
-        <w:rPr/>
-        <w:t xml:space="preserve">, replace every </w:t>
-      </w:r>
-      <w:r>
-        <w:rPr>
-          <w:rStyle w:val="SourceText"/>
-        </w:rPr>
-        <w:t>cmd4</w:t>
-      </w:r>
-      <w:r>
-        <w:rPr/>
-        <w:t xml:space="preserve">, set </w:t>
-      </w:r>
-      <w:r>
-        <w:rPr>
-          <w:rStyle w:val="SourceText"/>
-        </w:rPr>
-        <w:t>PartitionStartDate</w:t>
-      </w:r>
-      <w:r>
-        <w:rPr/>
-        <w:t xml:space="preserve"> to today, keep </w:t>
-      </w:r>
-      <w:r>
-        <w:rPr>
-          <w:rStyle w:val="SourceText"/>
-        </w:rPr>
-        <w:t>AllowedOrigin</w:t>
-      </w:r>
-      <w:r>
-        <w:rPr/>
-        <w:t xml:space="preserve"> at </w:t>
-      </w:r>
-      <w:r>
-        <w:rPr>
-          <w:rStyle w:val="SourceText"/>
-        </w:rPr>
-        <w:t>*</w:t>
-      </w:r>
-      <w:r>
-        <w:rPr/>
-        <w:t xml:space="preserve"> until step 7):</w:t>
-      </w:r>
-    </w:p>
-    <w:p>
-      <w:pPr>
-        <w:pStyle w:val="PreformattedText"/>
-        <w:bidi w:val="0"/>
-        <w:jc w:val="left"/>
-        <w:rPr/>
-      </w:pPr>
-      <w:r>
-        <w:rPr>
-          <w:rStyle w:val="SourceText"/>
-        </w:rPr>
-        <w:t>[plant5.deploy.parameters]</w:t>
-      </w:r>
-    </w:p>
-    <w:p>
-      <w:pPr>
-        <w:pStyle w:val="PreformattedText"/>
-        <w:bidi w:val="0"/>
-        <w:jc w:val="left"/>
-        <w:rPr/>
-      </w:pPr>
-      <w:r>
-        <w:rPr>
-          <w:rStyle w:val="SourceText"/>
-        </w:rPr>
-        <w:t>stack_name = "venko-plant5"</w:t>
-      </w:r>
-    </w:p>
-    <w:p>
-      <w:pPr>
-        <w:pStyle w:val="PreformattedText"/>
-        <w:bidi w:val="0"/>
-        <w:jc w:val="left"/>
-        <w:rPr/>
-      </w:pPr>
-      <w:r>
-        <w:rPr>
-          <w:rStyle w:val="SourceText"/>
-        </w:rPr>
-        <w:t>resolve_s3 = true</w:t>
-      </w:r>
-    </w:p>
-    <w:p>
-      <w:pPr>
-        <w:pStyle w:val="PreformattedText"/>
-        <w:bidi w:val="0"/>
-        <w:jc w:val="left"/>
-        <w:rPr/>
-      </w:pPr>
-      <w:r>
-        <w:rPr>
-          <w:rStyle w:val="SourceText"/>
-        </w:rPr>
-        <w:t>s3_prefix = "venko-plant5"</w:t>
-      </w:r>
-    </w:p>
-    <w:p>
-      <w:pPr>
-        <w:pStyle w:val="PreformattedText"/>
-        <w:bidi w:val="0"/>
-        <w:jc w:val="left"/>
-        <w:rPr/>
-      </w:pPr>
-      <w:r>
-        <w:rPr>
-          <w:rStyle w:val="SourceText"/>
-        </w:rPr>
-        <w:t>region = "us-east-1"</w:t>
-      </w:r>
-    </w:p>
-    <w:p>
-      <w:pPr>
-        <w:pStyle w:val="PreformattedText"/>
-        <w:bidi w:val="0"/>
-        <w:jc w:val="left"/>
-        <w:rPr/>
-      </w:pPr>
-      <w:r>
-        <w:rPr>
-          <w:rStyle w:val="SourceText"/>
-        </w:rPr>
-        <w:t>confirm_changeset = true</w:t>
-      </w:r>
-    </w:p>
-    <w:p>
-      <w:pPr>
-        <w:pStyle w:val="PreformattedText"/>
-        <w:bidi w:val="0"/>
-        <w:jc w:val="left"/>
-        <w:rPr/>
-      </w:pPr>
-      <w:r>
-        <w:rPr>
-          <w:rStyle w:val="SourceText"/>
-        </w:rPr>
-        <w:t>capabilities = "CAPABILITY_IAM"</w:t>
-      </w:r>
-    </w:p>
-    <w:p>
-      <w:pPr>
-        <w:pStyle w:val="PreformattedText"/>
-        <w:bidi w:val="0"/>
-        <w:jc w:val="left"/>
-        <w:rPr/>
-      </w:pPr>
-      <w:r>
-        <w:rPr>
-          <w:rStyle w:val="SourceText"/>
-        </w:rPr>
-        <w:t>parameter_overrides = "DataTopic=\"VENKO/plant5/data\" SystemTopic=\"VENKO/plant5/system\" PartitionStartDate=\"2026-10-13\" AllowedOrigin=\"*\" ReportTimezone=\"America/Mexico_City\" GlueDatabaseName=\"venko_plant5\" DataBucketName=\"venko-plant5-884520769610-us-east-1\" WebBucketName=\"venko-plant5-web-884520769610\""</w:t>
-      </w:r>
-    </w:p>
-    <w:p>
-      <w:pPr>
-        <w:pStyle w:val="PreformattedText"/>
-        <w:bidi w:val="0"/>
-        <w:jc w:val="left"/>
-        <w:rPr/>
-      </w:pPr>
-      <w:r>
-        <w:rPr>
-          <w:rStyle w:val="SourceText"/>
-        </w:rPr>
-        <w:t>image_repositories = []</w:t>
-      </w:r>
-    </w:p>
-    <w:p>
-      <w:pPr>
-        <w:pStyle w:val="PreformattedText"/>
-        <w:bidi w:val="0"/>
-        <w:jc w:val="left"/>
-        <w:rPr/>
-      </w:pPr>
-      <w:r>
-        <w:rPr/>
-      </w:r>
-    </w:p>
-    <w:p>
-      <w:pPr>
-        <w:pStyle w:val="PreformattedText"/>
-        <w:bidi w:val="0"/>
-        <w:jc w:val="left"/>
-        <w:rPr/>
-      </w:pPr>
-      <w:r>
-        <w:rPr>
-          <w:rStyle w:val="SourceText"/>
-        </w:rPr>
-        <w:t>[plant5.global.parameters]</w:t>
-      </w:r>
-    </w:p>
-    <w:p>
-      <w:pPr>
-        <w:pStyle w:val="PreformattedText"/>
-        <w:bidi w:val="0"/>
-        <w:spacing w:before="0" w:after="283"/>
-        <w:jc w:val="left"/>
-        <w:rPr/>
-      </w:pPr>
-      <w:r>
-        <w:rPr>
-          <w:rStyle w:val="SourceText"/>
-        </w:rPr>
-        <w:t>region = "us-east-1"</w:t>
-      </w:r>
-    </w:p>
-    <w:p>
-      <w:pPr>
-        <w:pStyle w:val="PreformattedText"/>
-        <w:bidi w:val="0"/>
-        <w:jc w:val="left"/>
-        <w:rPr/>
-      </w:pPr>
-      <w:r>
-        <w:rPr>
-          <w:rStyle w:val="SourceText"/>
-        </w:rPr>
-        <w:t>cd ~/git_reps/claude/projects/Venko/VenkoDemo/infra</w:t>
-      </w:r>
-    </w:p>
-    <w:p>
-      <w:pPr>
-        <w:pStyle w:val="PreformattedText"/>
-        <w:bidi w:val="0"/>
-        <w:jc w:val="left"/>
-        <w:rPr/>
-      </w:pPr>
-      <w:r>
-        <w:rPr>
-          <w:rStyle w:val="SourceText"/>
-        </w:rPr>
-        <w:t>sam build --template template.yaml</w:t>
-      </w:r>
-    </w:p>
-    <w:p>
-      <w:pPr>
-        <w:pStyle w:val="PreformattedText"/>
-        <w:bidi w:val="0"/>
-        <w:spacing w:before="0" w:after="283"/>
-        <w:jc w:val="left"/>
-        <w:rPr/>
-      </w:pPr>
-      <w:r>
-        <w:rPr>
-          <w:rStyle w:val="SourceText"/>
-        </w:rPr>
-        <w:t>sam deploy --config-env $KEY</w:t>
+        <w:t>Oficina,your-oficina-password</w:t>
       </w:r>
     </w:p>
     <w:p>
@@ -7139,7 +6448,17 @@
       </w:pPr>
       <w:r>
         <w:rPr/>
-        <w:t xml:space="preserve">Bucket names are lowercase only. </w:t>
+        <w:t xml:space="preserve">One row per SSID in </w:t>
+      </w:r>
+      <w:r>
+        <w:rPr>
+          <w:rStyle w:val="SourceText"/>
+        </w:rPr>
+        <w:t>system.csv</w:t>
+      </w:r>
+      <w:r>
+        <w:rPr/>
+        <w:t xml:space="preserve">; an empty password means an open network. </w:t>
       </w:r>
     </w:p>
     <w:p>
@@ -7161,57 +6480,17 @@
       </w:pPr>
       <w:r>
         <w:rPr/>
-        <w:t xml:space="preserve">When it ends with </w:t>
-      </w:r>
-      <w:r>
-        <w:rPr>
-          <w:rStyle w:val="SourceText"/>
-        </w:rPr>
-        <w:t>CREATE_COMPLETE</w:t>
-      </w:r>
-      <w:r>
-        <w:rPr/>
-        <w:t xml:space="preserve">, copy the </w:t>
-      </w:r>
-      <w:r>
-        <w:rPr>
-          <w:rStyle w:val="SourceText"/>
-        </w:rPr>
-        <w:t>DashboardUrl</w:t>
-      </w:r>
-      <w:r>
-        <w:rPr/>
-        <w:t xml:space="preserve"> output (e.g. </w:t>
-      </w:r>
-      <w:r>
-        <w:rPr>
-          <w:rStyle w:val="SourceText"/>
-        </w:rPr>
-        <w:t>https://d1f1ymj0tb4k52.cloudfront.net</w:t>
-      </w:r>
-      <w:r>
-        <w:rPr/>
-        <w:t xml:space="preserve">) into </w:t>
-      </w:r>
-      <w:r>
-        <w:rPr>
-          <w:rStyle w:val="SourceText"/>
-        </w:rPr>
-        <w:t>aws.csv</w:t>
-      </w:r>
-      <w:r>
-        <w:rPr/>
-        <w:t xml:space="preserve">'s </w:t>
-      </w:r>
-      <w:r>
-        <w:rPr>
-          <w:rStyle w:val="SourceText"/>
-        </w:rPr>
-        <w:t>dashboard_url</w:t>
-      </w:r>
-      <w:r>
-        <w:rPr/>
-        <w:t xml:space="preserve"> and rerun the build from step 3. </w:t>
+        <w:t xml:space="preserve">WPA passwords are 8–63 characters. A placeholder like </w:t>
+      </w:r>
+      <w:r>
+        <w:rPr>
+          <w:rStyle w:val="SourceText"/>
+        </w:rPr>
+        <w:t>CHANGE_ME</w:t>
+      </w:r>
+      <w:r>
+        <w:rPr/>
+        <w:t xml:space="preserve"> is refused on push. </w:t>
       </w:r>
     </w:p>
     <w:p>
@@ -7226,23 +6505,75 @@
           <w:tab w:val="left" w:pos="709" w:leader="none"/>
         </w:tabs>
         <w:bidi w:val="0"/>
+        <w:spacing w:before="0" w:after="0"/>
         <w:ind w:hanging="283" w:left="709"/>
         <w:jc w:val="left"/>
         <w:rPr/>
       </w:pPr>
       <w:r>
         <w:rPr/>
-        <w:t xml:space="preserve">Never change </w:t>
-      </w:r>
-      <w:r>
-        <w:rPr>
-          <w:rStyle w:val="SourceText"/>
-        </w:rPr>
-        <w:t>DataBucketName</w:t>
-      </w:r>
-      <w:r>
-        <w:rPr/>
-        <w:t xml:space="preserve"> on an existing stack: the old bucket is kept and a new empty one is created. </w:t>
+        <w:t xml:space="preserve">On the next push (step 8) they become NetworkManager profiles </w:t>
+      </w:r>
+      <w:r>
+        <w:rPr>
+          <w:rStyle w:val="SourceText"/>
+        </w:rPr>
+        <w:t>akvo-wifi1</w:t>
+      </w:r>
+      <w:r>
+        <w:rPr/>
+        <w:t xml:space="preserve"> (priority 20) and </w:t>
+      </w:r>
+      <w:r>
+        <w:rPr>
+          <w:rStyle w:val="SourceText"/>
+        </w:rPr>
+        <w:t>akvo-wifi2</w:t>
+      </w:r>
+      <w:r>
+        <w:rPr/>
+        <w:t xml:space="preserve"> (priority 10). The current connection isn't dropped; the Pi switches when its network goes away or at the next reboot. </w:t>
+      </w:r>
+    </w:p>
+    <w:p>
+      <w:pPr>
+        <w:pStyle w:val="BodyText"/>
+        <w:numPr>
+          <w:ilvl w:val="0"/>
+          <w:numId w:val="12"/>
+        </w:numPr>
+        <w:tabs>
+          <w:tab w:val="clear" w:pos="1134"/>
+          <w:tab w:val="left" w:pos="709" w:leader="none"/>
+        </w:tabs>
+        <w:bidi w:val="0"/>
+        <w:ind w:hanging="283" w:left="709"/>
+        <w:jc w:val="left"/>
+        <w:rPr/>
+      </w:pPr>
+      <w:r>
+        <w:rPr/>
+        <w:t xml:space="preserve">To change WiFi later: edit </w:t>
+      </w:r>
+      <w:r>
+        <w:rPr>
+          <w:rStyle w:val="SourceText"/>
+        </w:rPr>
+        <w:t>system.csv</w:t>
+      </w:r>
+      <w:r>
+        <w:rPr/>
+        <w:t xml:space="preserve"> and </w:t>
+      </w:r>
+      <w:r>
+        <w:rPr>
+          <w:rStyle w:val="SourceText"/>
+        </w:rPr>
+        <w:t>wifi.csv</w:t>
+      </w:r>
+      <w:r>
+        <w:rPr/>
+        <w:t xml:space="preserve">, rebuild, push. </w:t>
       </w:r>
     </w:p>
     <w:p>
@@ -7254,7 +6585,7 @@
       </w:pPr>
       <w:r>
         <w:rPr/>
-        <w:t>Step 7 – Dashboard labels, publish and CORS</w:t>
+        <w:t>Step 5 – IoT certificate, policy and thing (AWS)</w:t>
       </w:r>
     </w:p>
     <w:p>
@@ -7266,17 +6597,37 @@
       </w:pPr>
       <w:r>
         <w:rPr/>
-        <w:t xml:space="preserve">The dashboard reads the sensor list from the gateway's </w:t>
-      </w:r>
-      <w:r>
-        <w:rPr>
-          <w:rStyle w:val="SourceText"/>
-        </w:rPr>
-        <w:t>config.json</w:t>
-      </w:r>
-      <w:r>
-        <w:rPr/>
-        <w:t>; a small overrides file adds Spanish labels, groups and decimals. Generate a starter file, edit it, then publish:</w:t>
+        <w:t xml:space="preserve">Each Pi gets its own certificate and a policy that only lets it connect as </w:t>
+      </w:r>
+      <w:r>
+        <w:rPr>
+          <w:rStyle w:val="SourceText"/>
+        </w:rPr>
+        <w:t>$CLIENT</w:t>
+      </w:r>
+      <w:r>
+        <w:rPr/>
+        <w:t xml:space="preserve"> and publish to </w:t>
+      </w:r>
+      <w:r>
+        <w:rPr>
+          <w:rStyle w:val="SourceText"/>
+        </w:rPr>
+        <w:t>VENKO/$KEY/*</w:t>
+      </w:r>
+      <w:r>
+        <w:rPr/>
+        <w:t xml:space="preserve">. The private key can only be downloaded now; it goes in </w:t>
+      </w:r>
+      <w:r>
+        <w:rPr>
+          <w:rStyle w:val="SourceText"/>
+        </w:rPr>
+        <w:t>sites/$KEY/certs/</w:t>
+      </w:r>
+      <w:r>
+        <w:rPr/>
+        <w:t xml:space="preserve"> (git-ignored) and on the Pi, nowhere else. Run from the Akvo_Green root:</w:t>
       </w:r>
     </w:p>
     <w:p>
@@ -7290,7 +6641,7 @@
         <w:rPr>
           <w:rStyle w:val="SourceText"/>
         </w:rPr>
-        <w:t>cd ~/git_reps/claude/projects/Venko/VenkoDemo</w:t>
+        <w:t>mkdir -p sites/$KEY/certs &amp;&amp; cd sites/$KEY/certs &amp;&amp; umask 077</w:t>
       </w:r>
     </w:p>
     <w:p>
@@ -7304,13 +6655,205 @@
         <w:rPr>
           <w:rStyle w:val="SourceText"/>
         </w:rPr>
-        <w:t>python3 tools/sync_config.py --init --source ../Akvo_Green/sites/$KEY/config_data/config.json \</w:t>
+        <w:t>aws iot create-keys-and-certificate --set-as-active \</w:t>
       </w:r>
     </w:p>
     <w:p>
       <w:pPr>
         <w:pStyle w:val="PreformattedText"/>
         <w:bidi w:val="0"/>
+        <w:jc w:val="left"/>
+        <w:rPr/>
+      </w:pPr>
+      <w:r>
+        <w:rPr>
+          <w:rStyle w:val="SourceText"/>
+        </w:rPr>
+        <w:t xml:space="preserve">  </w:t>
+      </w:r>
+      <w:r>
+        <w:rPr>
+          <w:rStyle w:val="SourceText"/>
+        </w:rPr>
+        <w:t>--certificate-pem-outfile certificate.pem.crt --private-key-outfile private.pem.key \</w:t>
+      </w:r>
+    </w:p>
+    <w:p>
+      <w:pPr>
+        <w:pStyle w:val="PreformattedText"/>
+        <w:bidi w:val="0"/>
+        <w:jc w:val="left"/>
+        <w:rPr/>
+      </w:pPr>
+      <w:r>
+        <w:rPr>
+          <w:rStyle w:val="SourceText"/>
+        </w:rPr>
+        <w:t xml:space="preserve">  </w:t>
+      </w:r>
+      <w:r>
+        <w:rPr>
+          <w:rStyle w:val="SourceText"/>
+        </w:rPr>
+        <w:t>--query certificateArn --output text &gt; cert.arn</w:t>
+      </w:r>
+    </w:p>
+    <w:p>
+      <w:pPr>
+        <w:pStyle w:val="PreformattedText"/>
+        <w:bidi w:val="0"/>
+        <w:jc w:val="left"/>
+        <w:rPr/>
+      </w:pPr>
+      <w:r>
+        <w:rPr>
+          <w:rStyle w:val="SourceText"/>
+        </w:rPr>
+        <w:t>cp ../../cmd4/certs/AmazonRootCA1.pem .</w:t>
+      </w:r>
+    </w:p>
+    <w:p>
+      <w:pPr>
+        <w:pStyle w:val="PreformattedText"/>
+        <w:bidi w:val="0"/>
+        <w:jc w:val="left"/>
+        <w:rPr/>
+      </w:pPr>
+      <w:r>
+        <w:rPr>
+          <w:rStyle w:val="SourceText"/>
+        </w:rPr>
+        <w:t>cat &gt; policy.json &lt;&lt;JSON</w:t>
+      </w:r>
+    </w:p>
+    <w:p>
+      <w:pPr>
+        <w:pStyle w:val="PreformattedText"/>
+        <w:bidi w:val="0"/>
+        <w:jc w:val="left"/>
+        <w:rPr/>
+      </w:pPr>
+      <w:r>
+        <w:rPr>
+          <w:rStyle w:val="SourceText"/>
+        </w:rPr>
+        <w:t>{ "Version": "2012-10-17", "tatement": [</w:t>
+      </w:r>
+    </w:p>
+    <w:p>
+      <w:pPr>
+        <w:pStyle w:val="PreformattedText"/>
+        <w:bidi w:val="0"/>
+        <w:jc w:val="left"/>
+        <w:rPr/>
+      </w:pPr>
+      <w:r>
+        <w:rPr>
+          <w:rStyle w:val="SourceText"/>
+        </w:rPr>
+        <w:t xml:space="preserve">  </w:t>
+      </w:r>
+      <w:r>
+        <w:rPr>
+          <w:rStyle w:val="SourceText"/>
+        </w:rPr>
+        <w:t>{ "Effect": "Allow", "Action": "iot:Connect", "Resource": "arn:aws:iot:us-east-1:$ACCT:client/$CLIENT" },</w:t>
+      </w:r>
+    </w:p>
+    <w:p>
+      <w:pPr>
+        <w:pStyle w:val="PreformattedText"/>
+        <w:bidi w:val="0"/>
+        <w:jc w:val="left"/>
+        <w:rPr/>
+      </w:pPr>
+      <w:r>
+        <w:rPr>
+          <w:rStyle w:val="SourceText"/>
+        </w:rPr>
+        <w:t xml:space="preserve">  </w:t>
+      </w:r>
+      <w:r>
+        <w:rPr>
+          <w:rStyle w:val="SourceText"/>
+        </w:rPr>
+        <w:t>{ "Effect": "Allow", "Action": "iot:Publish", "Resource": "arn:aws:iot:us-east-1:$ACCT:topic/VENKO/$KEY/*" } ] }</w:t>
+      </w:r>
+    </w:p>
+    <w:p>
+      <w:pPr>
+        <w:pStyle w:val="PreformattedText"/>
+        <w:bidi w:val="0"/>
+        <w:jc w:val="left"/>
+        <w:rPr/>
+      </w:pPr>
+      <w:r>
+        <w:rPr>
+          <w:rStyle w:val="SourceText"/>
+        </w:rPr>
+        <w:t>JSON</w:t>
+      </w:r>
+    </w:p>
+    <w:p>
+      <w:pPr>
+        <w:pStyle w:val="PreformattedText"/>
+        <w:bidi w:val="0"/>
+        <w:jc w:val="left"/>
+        <w:rPr/>
+      </w:pPr>
+      <w:r>
+        <w:rPr>
+          <w:rStyle w:val="SourceText"/>
+        </w:rPr>
+        <w:t>aws iot create-policy --policy-name venko-$KEY-gateway --policy-document file://policy.json</w:t>
+      </w:r>
+    </w:p>
+    <w:p>
+      <w:pPr>
+        <w:pStyle w:val="PreformattedText"/>
+        <w:bidi w:val="0"/>
+        <w:jc w:val="left"/>
+        <w:rPr/>
+      </w:pPr>
+      <w:r>
+        <w:rPr>
+          <w:rStyle w:val="SourceText"/>
+        </w:rPr>
+        <w:t>aws iot attach-policy --policy-name venko-$KEY-gateway --target "$(cat cert.arn)"</w:t>
+      </w:r>
+    </w:p>
+    <w:p>
+      <w:pPr>
+        <w:pStyle w:val="PreformattedText"/>
+        <w:bidi w:val="0"/>
+        <w:jc w:val="left"/>
+        <w:rPr/>
+      </w:pPr>
+      <w:r>
+        <w:rPr>
+          <w:rStyle w:val="SourceText"/>
+        </w:rPr>
+        <w:t>aws iot create-thing --thing-name $CLIENT</w:t>
+      </w:r>
+    </w:p>
+    <w:p>
+      <w:pPr>
+        <w:pStyle w:val="PreformattedText"/>
+        <w:bidi w:val="0"/>
+        <w:jc w:val="left"/>
+        <w:rPr/>
+      </w:pPr>
+      <w:r>
+        <w:rPr>
+          <w:rStyle w:val="SourceText"/>
+        </w:rPr>
+        <w:t>aws iot attach-thing-principal --thing-name $CLIENT --principal "$(cat cert.arn)"</w:t>
+      </w:r>
+    </w:p>
+    <w:p>
+      <w:pPr>
+        <w:pStyle w:val="PreformattedText"/>
+        <w:bidi w:val="0"/>
         <w:spacing w:before="0" w:after="283"/>
         <w:jc w:val="left"/>
         <w:rPr/>
@@ -7319,13 +6862,7 @@
         <w:rPr>
           <w:rStyle w:val="SourceText"/>
         </w:rPr>
-        <w:t xml:space="preserve">    </w:t>
-      </w:r>
-      <w:r>
-        <w:rPr>
-          <w:rStyle w:val="SourceText"/>
-        </w:rPr>
-        <w:t>--overrides config/sites/$KEY.json</w:t>
+        <w:t>cd ../../..</w:t>
       </w:r>
     </w:p>
     <w:p>
@@ -7336,14 +6873,202 @@
         <w:rPr/>
       </w:pPr>
       <w:r>
-        <w:rPr>
-          <w:rStyle w:val="SourceText"/>
-        </w:rPr>
-        <w:t>--init</w:t>
-      </w:r>
-      <w:r>
-        <w:rPr/>
-        <w:t xml:space="preserve"> reuses labels from other sites where the sensor key matches and never overwrites an existing file. Example of the result after editing:</w:t>
+        <w:rPr/>
+        <w:t xml:space="preserve">Result: five files in </w:t>
+      </w:r>
+      <w:r>
+        <w:rPr>
+          <w:rStyle w:val="SourceText"/>
+        </w:rPr>
+        <w:t>sites/plant5/certs/</w:t>
+      </w:r>
+      <w:r>
+        <w:rPr/>
+        <w:t xml:space="preserve">, all mode </w:t>
+      </w:r>
+      <w:r>
+        <w:rPr>
+          <w:rStyle w:val="SourceText"/>
+        </w:rPr>
+        <w:t>600</w:t>
+      </w:r>
+      <w:r>
+        <w:rPr/>
+        <w:t xml:space="preserve"> — </w:t>
+      </w:r>
+      <w:r>
+        <w:rPr>
+          <w:rStyle w:val="SourceText"/>
+        </w:rPr>
+        <w:t>certificate.pem.crt</w:t>
+      </w:r>
+      <w:r>
+        <w:rPr/>
+        <w:t xml:space="preserve">, </w:t>
+      </w:r>
+      <w:r>
+        <w:rPr>
+          <w:rStyle w:val="SourceText"/>
+        </w:rPr>
+        <w:t>private.pem.key</w:t>
+      </w:r>
+      <w:r>
+        <w:rPr/>
+        <w:t xml:space="preserve">, </w:t>
+      </w:r>
+      <w:r>
+        <w:rPr>
+          <w:rStyle w:val="SourceText"/>
+        </w:rPr>
+        <w:t>AmazonRootCA1.pem</w:t>
+      </w:r>
+      <w:r>
+        <w:rPr/>
+        <w:t xml:space="preserve">, </w:t>
+      </w:r>
+      <w:r>
+        <w:rPr>
+          <w:rStyle w:val="SourceText"/>
+        </w:rPr>
+        <w:t>cert.arn</w:t>
+      </w:r>
+      <w:r>
+        <w:rPr/>
+        <w:t xml:space="preserve">, </w:t>
+      </w:r>
+      <w:r>
+        <w:rPr>
+          <w:rStyle w:val="SourceText"/>
+        </w:rPr>
+        <w:t>policy.json</w:t>
+      </w:r>
+      <w:r>
+        <w:rPr/>
+        <w:t xml:space="preserve">. </w:t>
+      </w:r>
+      <w:r>
+        <w:rPr>
+          <w:rStyle w:val="SourceText"/>
+        </w:rPr>
+        <w:t>CLIENT</w:t>
+      </w:r>
+      <w:r>
+        <w:rPr/>
+        <w:t xml:space="preserve"> must equal </w:t>
+      </w:r>
+      <w:r>
+        <w:rPr>
+          <w:rStyle w:val="SourceText"/>
+        </w:rPr>
+        <w:t>client_id</w:t>
+      </w:r>
+      <w:r>
+        <w:rPr/>
+        <w:t xml:space="preserve"> in </w:t>
+      </w:r>
+      <w:r>
+        <w:rPr>
+          <w:rStyle w:val="SourceText"/>
+        </w:rPr>
+        <w:t>aws.csv</w:t>
+      </w:r>
+      <w:r>
+        <w:rPr/>
+        <w:t xml:space="preserve">, and </w:t>
+      </w:r>
+      <w:r>
+        <w:rPr>
+          <w:rStyle w:val="SourceText"/>
+        </w:rPr>
+        <w:t>KEY</w:t>
+      </w:r>
+      <w:r>
+        <w:rPr/>
+        <w:t xml:space="preserve"> the key in its topics.</w:t>
+      </w:r>
+    </w:p>
+    <w:p>
+      <w:pPr>
+        <w:pStyle w:val="Heading2"/>
+        <w:bidi w:val="0"/>
+        <w:jc w:val="left"/>
+        <w:rPr/>
+      </w:pPr>
+      <w:r>
+        <w:rPr/>
+        <w:t>Step 6 – AWS stack (VenkoDemo)</w:t>
+      </w:r>
+    </w:p>
+    <w:p>
+      <w:pPr>
+        <w:pStyle w:val="BodyText"/>
+        <w:bidi w:val="0"/>
+        <w:jc w:val="left"/>
+        <w:rPr/>
+      </w:pPr>
+      <w:r>
+        <w:rPr/>
+        <w:t xml:space="preserve">One CloudFormation stack per site holds the storage, API, reports and dashboard. Add the site's section to </w:t>
+      </w:r>
+      <w:r>
+        <w:rPr>
+          <w:rStyle w:val="SourceText"/>
+        </w:rPr>
+        <w:t>VenkoDemo/infra/samconfig.toml</w:t>
+      </w:r>
+      <w:r>
+        <w:rPr/>
+        <w:t xml:space="preserve"> (copy </w:t>
+      </w:r>
+      <w:r>
+        <w:rPr>
+          <w:rStyle w:val="SourceText"/>
+        </w:rPr>
+        <w:t>[cmd4.*]</w:t>
+      </w:r>
+      <w:r>
+        <w:rPr/>
+        <w:t xml:space="preserve">, replace every </w:t>
+      </w:r>
+      <w:r>
+        <w:rPr>
+          <w:rStyle w:val="SourceText"/>
+        </w:rPr>
+        <w:t>cmd4</w:t>
+      </w:r>
+      <w:r>
+        <w:rPr/>
+        <w:t xml:space="preserve">, set </w:t>
+      </w:r>
+      <w:r>
+        <w:rPr>
+          <w:rStyle w:val="SourceText"/>
+        </w:rPr>
+        <w:t>PartitionStartDate</w:t>
+      </w:r>
+      <w:r>
+        <w:rPr/>
+        <w:t xml:space="preserve"> to today, keep </w:t>
+      </w:r>
+      <w:r>
+        <w:rPr>
+          <w:rStyle w:val="SourceText"/>
+        </w:rPr>
+        <w:t>AllowedOrigin</w:t>
+      </w:r>
+      <w:r>
+        <w:rPr/>
+        <w:t xml:space="preserve"> at </w:t>
+      </w:r>
+      <w:r>
+        <w:rPr>
+          <w:rStyle w:val="SourceText"/>
+        </w:rPr>
+        <w:t>*</w:t>
+      </w:r>
+      <w:r>
+        <w:rPr/>
+        <w:t xml:space="preserve"> until step 7):</w:t>
       </w:r>
     </w:p>
     <w:p>
@@ -7357,7 +7082,7 @@
         <w:rPr>
           <w:rStyle w:val="SourceText"/>
         </w:rPr>
-        <w:t>{</w:t>
+        <w:t>[plant5.deploy.parameters]</w:t>
       </w:r>
     </w:p>
     <w:p>
@@ -7371,13 +7096,7 @@
         <w:rPr>
           <w:rStyle w:val="SourceText"/>
         </w:rPr>
-        <w:t xml:space="preserve">  </w:t>
-      </w:r>
-      <w:r>
-        <w:rPr>
-          <w:rStyle w:val="SourceText"/>
-        </w:rPr>
-        <w:t>"site": { "title": "Venko – Plant5", "brand": "Ghotrix - Semca" },</w:t>
+        <w:t>stack_name = "venko-plant5"</w:t>
       </w:r>
     </w:p>
     <w:p>
@@ -7391,13 +7110,7 @@
         <w:rPr>
           <w:rStyle w:val="SourceText"/>
         </w:rPr>
-        <w:t xml:space="preserve">  </w:t>
-      </w:r>
-      <w:r>
-        <w:rPr>
-          <w:rStyle w:val="SourceText"/>
-        </w:rPr>
-        <w:t>"units": { "unit": "pH", "uS/cm": "µS/cm" },</w:t>
+        <w:t>resolve_s3 = true</w:t>
       </w:r>
     </w:p>
     <w:p>
@@ -7411,13 +7124,7 @@
         <w:rPr>
           <w:rStyle w:val="SourceText"/>
         </w:rPr>
-        <w:t xml:space="preserve">  </w:t>
-      </w:r>
-      <w:r>
-        <w:rPr>
-          <w:rStyle w:val="SourceText"/>
-        </w:rPr>
-        <w:t>"defaults": { "warn_margin": 0.1, "decimals": 2 },</w:t>
+        <w:t>s3_prefix = "venko-plant5"</w:t>
       </w:r>
     </w:p>
     <w:p>
@@ -7431,13 +7138,7 @@
         <w:rPr>
           <w:rStyle w:val="SourceText"/>
         </w:rPr>
-        <w:t xml:space="preserve">  </w:t>
-      </w:r>
-      <w:r>
-        <w:rPr>
-          <w:rStyle w:val="SourceText"/>
-        </w:rPr>
-        <w:t>"groups": ["Temperatura", "Ambiente", "Química"],</w:t>
+        <w:t>region = "us-east-1"</w:t>
       </w:r>
     </w:p>
     <w:p>
@@ -7451,13 +7152,7 @@
         <w:rPr>
           <w:rStyle w:val="SourceText"/>
         </w:rPr>
-        <w:t xml:space="preserve">  </w:t>
-      </w:r>
-      <w:r>
-        <w:rPr>
-          <w:rStyle w:val="SourceText"/>
-        </w:rPr>
-        <w:t>"sensors": {</w:t>
+        <w:t>confirm_changeset = true</w:t>
       </w:r>
     </w:p>
     <w:p>
@@ -7471,13 +7166,7 @@
         <w:rPr>
           <w:rStyle w:val="SourceText"/>
         </w:rPr>
-        <w:t xml:space="preserve">    </w:t>
-      </w:r>
-      <w:r>
-        <w:rPr>
-          <w:rStyle w:val="SourceText"/>
-        </w:rPr>
-        <w:t>"DEV_1.Pt100Sensor": { "label": "Temperatura Pt100", "group": "Temperatura", "decimals": 1 },</w:t>
+        <w:t>capabilities = "CAPABILITY_IAM"</w:t>
       </w:r>
     </w:p>
     <w:p>
@@ -7491,13 +7180,7 @@
         <w:rPr>
           <w:rStyle w:val="SourceText"/>
         </w:rPr>
-        <w:t xml:space="preserve">    </w:t>
-      </w:r>
-      <w:r>
-        <w:rPr>
-          <w:rStyle w:val="SourceText"/>
-        </w:rPr>
-        <w:t>"DEV_3.Humedad":     { "label": "Humedad", "group": "Ambiente" },</w:t>
+        <w:t>parameter_overrides = "DataTopic=\"VENKO/plant5/data\" SystemTopic=\"VENKO/plant5/system\" PartitionStartDate=\"2026-10-13\" AllowedOrigin=\"*\" ReportTimezone=\"America/Mexico_City\" GlueDatabaseName=\"venko_plant5\" DataBucketName=\"venko-plant5-884520769610-us-east-1\" WebBucketName=\"venko-plant5-web-884520769610\""</w:t>
       </w:r>
     </w:p>
     <w:p>
@@ -7511,13 +7194,7 @@
         <w:rPr>
           <w:rStyle w:val="SourceText"/>
         </w:rPr>
-        <w:t xml:space="preserve">    </w:t>
-      </w:r>
-      <w:r>
-        <w:rPr>
-          <w:rStyle w:val="SourceText"/>
-        </w:rPr>
-        <w:t>"DEV_5.PhSensor":    { "label": "pH", "group": "Química" }</w:t>
+        <w:t>image_repositories = []</w:t>
       </w:r>
     </w:p>
     <w:p>
@@ -7528,22 +7205,27 @@
         <w:rPr/>
       </w:pPr>
       <w:r>
-        <w:rPr>
-          <w:rStyle w:val="SourceText"/>
-        </w:rPr>
-        <w:t xml:space="preserve">  </w:t>
-      </w:r>
-      <w:r>
-        <w:rPr>
-          <w:rStyle w:val="SourceText"/>
-        </w:rPr>
-        <w:t>}</w:t>
+        <w:rPr/>
       </w:r>
     </w:p>
     <w:p>
       <w:pPr>
         <w:pStyle w:val="PreformattedText"/>
         <w:bidi w:val="0"/>
+        <w:jc w:val="left"/>
+        <w:rPr/>
+      </w:pPr>
+      <w:r>
+        <w:rPr>
+          <w:rStyle w:val="SourceText"/>
+        </w:rPr>
+        <w:t>[plant5.global.parameters]</w:t>
+      </w:r>
+    </w:p>
+    <w:p>
+      <w:pPr>
+        <w:pStyle w:val="PreformattedText"/>
+        <w:bidi w:val="0"/>
         <w:spacing w:before="0" w:after="283"/>
         <w:jc w:val="left"/>
         <w:rPr/>
@@ -7552,45 +7234,41 @@
         <w:rPr>
           <w:rStyle w:val="SourceText"/>
         </w:rPr>
-        <w:t>}</w:t>
-      </w:r>
-    </w:p>
-    <w:p>
-      <w:pPr>
-        <w:pStyle w:val="BodyText"/>
-        <w:bidi w:val="0"/>
-        <w:jc w:val="left"/>
-        <w:rPr/>
-      </w:pPr>
-      <w:r>
-        <w:rPr/>
-        <w:t xml:space="preserve">Keys are </w:t>
-      </w:r>
-      <w:r>
-        <w:rPr>
-          <w:rStyle w:val="SourceText"/>
-        </w:rPr>
-        <w:t>DEVICE_ID.SensorName</w:t>
-      </w:r>
-      <w:r>
-        <w:rPr/>
-        <w:t xml:space="preserve">, exactly as in </w:t>
-      </w:r>
-      <w:r>
-        <w:rPr>
-          <w:rStyle w:val="SourceText"/>
-        </w:rPr>
-        <w:t>devices.csv</w:t>
-      </w:r>
-      <w:r>
-        <w:rPr/>
-        <w:t xml:space="preserve"> (case-sensitive). Publish config and web app to the site:</w:t>
+        <w:t>region = "us-east-1"</w:t>
       </w:r>
     </w:p>
     <w:p>
       <w:pPr>
         <w:pStyle w:val="PreformattedText"/>
         <w:bidi w:val="0"/>
+        <w:jc w:val="left"/>
+        <w:rPr/>
+      </w:pPr>
+      <w:r>
+        <w:rPr>
+          <w:rStyle w:val="SourceText"/>
+        </w:rPr>
+        <w:t>cd ~/git_reps/claude/projects/Venko/VenkoDemo/infra</w:t>
+      </w:r>
+    </w:p>
+    <w:p>
+      <w:pPr>
+        <w:pStyle w:val="PreformattedText"/>
+        <w:bidi w:val="0"/>
+        <w:jc w:val="left"/>
+        <w:rPr/>
+      </w:pPr>
+      <w:r>
+        <w:rPr>
+          <w:rStyle w:val="SourceText"/>
+        </w:rPr>
+        <w:t>sam build --template template.yaml</w:t>
+      </w:r>
+    </w:p>
+    <w:p>
+      <w:pPr>
+        <w:pStyle w:val="PreformattedText"/>
+        <w:bidi w:val="0"/>
         <w:spacing w:before="0" w:after="283"/>
         <w:jc w:val="left"/>
         <w:rPr/>
@@ -7599,211 +7277,7 @@
         <w:rPr>
           <w:rStyle w:val="SourceText"/>
         </w:rPr>
-        <w:t>bash tools/deploy_web.sh venko-$KEY ../Akvo_Green/sites/$KEY/config_data/config.json config/sites/$KEY.json</w:t>
-      </w:r>
-    </w:p>
-    <w:p>
-      <w:pPr>
-        <w:pStyle w:val="BodyText"/>
-        <w:bidi w:val="0"/>
-        <w:jc w:val="left"/>
-        <w:rPr/>
-      </w:pPr>
-      <w:r>
-        <w:rPr/>
-        <w:t xml:space="preserve">It refuses to upload if the config's topics don't match the stack's. Then </w:t>
-      </w:r>
-      <w:r>
-        <w:rPr>
-          <w:rStyle w:val="Strong"/>
-        </w:rPr>
-        <w:t>lock CORS</w:t>
-      </w:r>
-      <w:r>
-        <w:rPr/>
-        <w:t xml:space="preserve"> to the dashboard URL: set </w:t>
-      </w:r>
-      <w:r>
-        <w:rPr>
-          <w:rStyle w:val="SourceText"/>
-        </w:rPr>
-        <w:t>AllowedOrigin=\"https://&lt;DashboardUrl host&gt;\"</w:t>
-      </w:r>
-      <w:r>
-        <w:rPr/>
-        <w:t xml:space="preserve"> in </w:t>
-      </w:r>
-      <w:r>
-        <w:rPr>
-          <w:rStyle w:val="SourceText"/>
-        </w:rPr>
-        <w:t>[plant5.deploy.parameters]</w:t>
-      </w:r>
-      <w:r>
-        <w:rPr/>
-        <w:t xml:space="preserve"> and run:</w:t>
-      </w:r>
-    </w:p>
-    <w:p>
-      <w:pPr>
-        <w:pStyle w:val="PreformattedText"/>
-        <w:bidi w:val="0"/>
-        <w:jc w:val="left"/>
-        <w:rPr/>
-      </w:pPr>
-      <w:r>
-        <w:rPr>
-          <w:rStyle w:val="SourceText"/>
-        </w:rPr>
-        <w:t>cd infra &amp;&amp; sam deploy --config-env $KEY &amp;&amp; cd ..</w:t>
-      </w:r>
-    </w:p>
-    <w:p>
-      <w:pPr>
-        <w:pStyle w:val="PreformattedText"/>
-        <w:bidi w:val="0"/>
-        <w:jc w:val="left"/>
-        <w:rPr/>
-      </w:pPr>
-      <w:r>
-        <w:rPr>
-          <w:rStyle w:val="SourceText"/>
-        </w:rPr>
-        <w:t>API_ID=$(aws cloudformation describe-stack-resource --stack-name venko-$KEY \</w:t>
-      </w:r>
-    </w:p>
-    <w:p>
-      <w:pPr>
-        <w:pStyle w:val="PreformattedText"/>
-        <w:bidi w:val="0"/>
-        <w:jc w:val="left"/>
-        <w:rPr/>
-      </w:pPr>
-      <w:r>
-        <w:rPr>
-          <w:rStyle w:val="SourceText"/>
-        </w:rPr>
-        <w:t xml:space="preserve">  </w:t>
-      </w:r>
-      <w:r>
-        <w:rPr>
-          <w:rStyle w:val="SourceText"/>
-        </w:rPr>
-        <w:t>--logical-resource-id Api --query StackResourceDetail.PhysicalResourceId --output text)</w:t>
-      </w:r>
-    </w:p>
-    <w:p>
-      <w:pPr>
-        <w:pStyle w:val="PreformattedText"/>
-        <w:bidi w:val="0"/>
-        <w:spacing w:before="0" w:after="283"/>
-        <w:jc w:val="left"/>
-        <w:rPr/>
-      </w:pPr>
-      <w:r>
-        <w:rPr>
-          <w:rStyle w:val="SourceText"/>
-        </w:rPr>
-        <w:t>aws apigateway create-deployment --rest-api-id "$API_ID" --stage-name prod</w:t>
-      </w:r>
-    </w:p>
-    <w:p>
-      <w:pPr>
-        <w:pStyle w:val="BodyText"/>
-        <w:bidi w:val="0"/>
-        <w:jc w:val="left"/>
-        <w:rPr/>
-      </w:pPr>
-      <w:r>
-        <w:rPr/>
-        <w:t xml:space="preserve">SAM doesn't republish the API stage when only a parameter changes, hence the </w:t>
-      </w:r>
-      <w:r>
-        <w:rPr>
-          <w:rStyle w:val="SourceText"/>
-        </w:rPr>
-        <w:t>create-deployment</w:t>
-      </w:r>
-      <w:r>
-        <w:rPr/>
-        <w:t>.</w:t>
-      </w:r>
-    </w:p>
-    <w:p>
-      <w:pPr>
-        <w:pStyle w:val="Heading2"/>
-        <w:bidi w:val="0"/>
-        <w:jc w:val="left"/>
-        <w:rPr/>
-      </w:pPr>
-      <w:r>
-        <w:rPr/>
-        <w:t>Step 8 – Install on the Pi</w:t>
-      </w:r>
-    </w:p>
-    <w:p>
-      <w:pPr>
-        <w:pStyle w:val="BodyText"/>
-        <w:bidi w:val="0"/>
-        <w:jc w:val="left"/>
-        <w:rPr/>
-      </w:pPr>
-      <w:r>
-        <w:rPr/>
-        <w:t xml:space="preserve">From your computer, in Akvo_Green. The first push carries the certificates; </w:t>
-      </w:r>
-      <w:r>
-        <w:rPr>
-          <w:rStyle w:val="SourceText"/>
-        </w:rPr>
-        <w:t>install.sh</w:t>
-      </w:r>
-      <w:r>
-        <w:rPr/>
-        <w:t xml:space="preserve"> runs once per Pi:</w:t>
-      </w:r>
-    </w:p>
-    <w:p>
-      <w:pPr>
-        <w:pStyle w:val="PreformattedText"/>
-        <w:bidi w:val="0"/>
-        <w:jc w:val="left"/>
-        <w:rPr/>
-      </w:pPr>
-      <w:r>
-        <w:rPr>
-          <w:rStyle w:val="SourceText"/>
-        </w:rPr>
-        <w:t>cd ~/git_reps/claude/projects/Venko/Akvo_Green</w:t>
-      </w:r>
-    </w:p>
-    <w:p>
-      <w:pPr>
-        <w:pStyle w:val="PreformattedText"/>
-        <w:bidi w:val="0"/>
-        <w:jc w:val="left"/>
-        <w:rPr/>
-      </w:pPr>
-      <w:r>
-        <w:rPr>
-          <w:rStyle w:val="SourceText"/>
-        </w:rPr>
-        <w:t>tools/push_site.sh $KEY pi@192.168.68.140 --certs        # add --no-modbus-tool on Raspberry Pi OS Lite</w:t>
-      </w:r>
-    </w:p>
-    <w:p>
-      <w:pPr>
-        <w:pStyle w:val="PreformattedText"/>
-        <w:bidi w:val="0"/>
-        <w:spacing w:before="0" w:after="283"/>
-        <w:jc w:val="left"/>
-        <w:rPr/>
-      </w:pPr>
-      <w:r>
-        <w:rPr>
-          <w:rStyle w:val="SourceText"/>
-        </w:rPr>
-        <w:t>ssh -t pi@192.168.68.140 'cd Akvo_Green &amp;&amp; ./install.sh --skip-certs &amp;&amp; sudo systemctl start akvo-green'</w:t>
+        <w:t>sam deploy --config-env $KEY</w:t>
       </w:r>
     </w:p>
     <w:p>
@@ -7824,34 +7298,8 @@
         <w:rPr/>
       </w:pPr>
       <w:r>
-        <w:rPr>
-          <w:rStyle w:val="SourceText"/>
-        </w:rPr>
-        <w:t>push_site.sh</w:t>
-      </w:r>
-      <w:r>
-        <w:rPr/>
-        <w:t xml:space="preserve"> copies the code, the site's </w:t>
-      </w:r>
-      <w:r>
-        <w:rPr>
-          <w:rStyle w:val="SourceText"/>
-        </w:rPr>
-        <w:t>config.json</w:t>
-      </w:r>
-      <w:r>
-        <w:rPr/>
-        <w:t xml:space="preserve">, the certificates (with </w:t>
-      </w:r>
-      <w:r>
-        <w:rPr>
-          <w:rStyle w:val="SourceText"/>
-        </w:rPr>
-        <w:t>--certs</w:t>
-      </w:r>
-      <w:r>
-        <w:rPr/>
-        <w:t xml:space="preserve">), the WiFi profiles and the AKVO Modbus Tool. It asks for the Pi's sudo password for the WiFi step. </w:t>
+        <w:rPr/>
+        <w:t xml:space="preserve">Bucket names are lowercase only. </w:t>
       </w:r>
     </w:p>
     <w:p>
@@ -7872,44 +7320,58 @@
         <w:rPr/>
       </w:pPr>
       <w:r>
-        <w:rPr>
-          <w:rStyle w:val="SourceText"/>
-        </w:rPr>
-        <w:t>install.sh</w:t>
-      </w:r>
-      <w:r>
-        <w:rPr/>
-        <w:t xml:space="preserve"> sets up packages, the Python venv, serial-port access and the services </w:t>
-      </w:r>
-      <w:r>
-        <w:rPr>
-          <w:rStyle w:val="SourceText"/>
-        </w:rPr>
-        <w:t>akvo-green</w:t>
-      </w:r>
-      <w:r>
-        <w:rPr/>
-        <w:t xml:space="preserve"> and </w:t>
-      </w:r>
-      <w:r>
-        <w:rPr>
-          <w:rStyle w:val="SourceText"/>
-        </w:rPr>
-        <w:t>akvo-history-web</w:t>
-      </w:r>
-      <w:r>
-        <w:rPr/>
-        <w:t xml:space="preserve"> (and </w:t>
-      </w:r>
-      <w:r>
-        <w:rPr>
-          <w:rStyle w:val="SourceText"/>
-        </w:rPr>
-        <w:t>akvo-oled</w:t>
-      </w:r>
-      <w:r>
-        <w:rPr/>
-        <w:t xml:space="preserve">). </w:t>
+        <w:rPr/>
+        <w:t xml:space="preserve">When it ends with </w:t>
+      </w:r>
+      <w:r>
+        <w:rPr>
+          <w:rStyle w:val="SourceText"/>
+        </w:rPr>
+        <w:t>CREATE_COMPLETE</w:t>
+      </w:r>
+      <w:r>
+        <w:rPr/>
+        <w:t xml:space="preserve">, copy the </w:t>
+      </w:r>
+      <w:r>
+        <w:rPr>
+          <w:rStyle w:val="SourceText"/>
+        </w:rPr>
+        <w:t>DashboardUrl</w:t>
+      </w:r>
+      <w:r>
+        <w:rPr/>
+        <w:t xml:space="preserve"> output (e.g. </w:t>
+      </w:r>
+      <w:r>
+        <w:rPr>
+          <w:rStyle w:val="SourceText"/>
+        </w:rPr>
+        <w:t>https://d1f1ymj0tb4k52.cloudfront.net</w:t>
+      </w:r>
+      <w:r>
+        <w:rPr/>
+        <w:t xml:space="preserve">) into </w:t>
+      </w:r>
+      <w:r>
+        <w:rPr>
+          <w:rStyle w:val="SourceText"/>
+        </w:rPr>
+        <w:t>aws.csv</w:t>
+      </w:r>
+      <w:r>
+        <w:rPr/>
+        <w:t xml:space="preserve">'s </w:t>
+      </w:r>
+      <w:r>
+        <w:rPr>
+          <w:rStyle w:val="SourceText"/>
+        </w:rPr>
+        <w:t>dashboard_url</w:t>
+      </w:r>
+      <w:r>
+        <w:rPr/>
+        <w:t xml:space="preserve"> and rerun the build from step 3. </w:t>
       </w:r>
     </w:p>
     <w:p>
@@ -7924,50 +7386,584 @@
           <w:tab w:val="left" w:pos="709" w:leader="none"/>
         </w:tabs>
         <w:bidi w:val="0"/>
-        <w:spacing w:before="0" w:after="0"/>
         <w:ind w:hanging="283" w:left="709"/>
         <w:jc w:val="left"/>
         <w:rPr/>
       </w:pPr>
       <w:r>
+        <w:rPr/>
+        <w:t xml:space="preserve">Never change </w:t>
+      </w:r>
+      <w:r>
+        <w:rPr>
+          <w:rStyle w:val="SourceText"/>
+        </w:rPr>
+        <w:t>DataBucketName</w:t>
+      </w:r>
+      <w:r>
+        <w:rPr/>
+        <w:t xml:space="preserve"> on an existing stack: the old bucket is kept and a new empty one is created. </w:t>
+      </w:r>
+    </w:p>
+    <w:p>
+      <w:pPr>
+        <w:pStyle w:val="Heading2"/>
+        <w:bidi w:val="0"/>
+        <w:jc w:val="left"/>
+        <w:rPr/>
+      </w:pPr>
+      <w:r>
+        <w:rPr/>
+        <w:t>Step 7 – Dashboard labels, publish and CORS</w:t>
+      </w:r>
+    </w:p>
+    <w:p>
+      <w:pPr>
+        <w:pStyle w:val="BodyText"/>
+        <w:bidi w:val="0"/>
+        <w:jc w:val="left"/>
+        <w:rPr/>
+      </w:pPr>
+      <w:r>
+        <w:rPr/>
+        <w:t xml:space="preserve">The dashboard reads the sensor list from the gateway's </w:t>
+      </w:r>
+      <w:r>
+        <w:rPr>
+          <w:rStyle w:val="SourceText"/>
+        </w:rPr>
+        <w:t>config.json</w:t>
+      </w:r>
+      <w:r>
+        <w:rPr/>
+        <w:t>; a small overrides file adds Spanish labels, groups and decimals. Generate a starter file, edit it, then publish:</w:t>
+      </w:r>
+    </w:p>
+    <w:p>
+      <w:pPr>
+        <w:pStyle w:val="PreformattedText"/>
+        <w:bidi w:val="0"/>
+        <w:jc w:val="left"/>
+        <w:rPr/>
+      </w:pPr>
+      <w:r>
+        <w:rPr>
+          <w:rStyle w:val="SourceText"/>
+        </w:rPr>
+        <w:t>cd ~/git_reps/claude/projects/Venko/VenkoDemo</w:t>
+      </w:r>
+    </w:p>
+    <w:p>
+      <w:pPr>
+        <w:pStyle w:val="PreformattedText"/>
+        <w:bidi w:val="0"/>
+        <w:jc w:val="left"/>
+        <w:rPr/>
+      </w:pPr>
+      <w:r>
+        <w:rPr>
+          <w:rStyle w:val="SourceText"/>
+        </w:rPr>
+        <w:t>python3 tools/sync_config.py --init --source ../Akvo_Green/sites/$KEY/config_data/config.json \</w:t>
+      </w:r>
+    </w:p>
+    <w:p>
+      <w:pPr>
+        <w:pStyle w:val="PreformattedText"/>
+        <w:bidi w:val="0"/>
+        <w:spacing w:before="0" w:after="283"/>
+        <w:jc w:val="left"/>
+        <w:rPr/>
+      </w:pPr>
+      <w:r>
+        <w:rPr>
+          <w:rStyle w:val="SourceText"/>
+        </w:rPr>
+        <w:t xml:space="preserve">    </w:t>
+      </w:r>
+      <w:r>
+        <w:rPr>
+          <w:rStyle w:val="SourceText"/>
+        </w:rPr>
+        <w:t>--overrides config/sites/$KEY.json</w:t>
+      </w:r>
+    </w:p>
+    <w:p>
+      <w:pPr>
+        <w:pStyle w:val="BodyText"/>
+        <w:bidi w:val="0"/>
+        <w:jc w:val="left"/>
+        <w:rPr/>
+      </w:pPr>
+      <w:r>
+        <w:rPr>
+          <w:rStyle w:val="SourceText"/>
+        </w:rPr>
+        <w:t>--init</w:t>
+      </w:r>
+      <w:r>
+        <w:rPr/>
+        <w:t xml:space="preserve"> reuses labels from other sites where the sensor key matches and never overwrites an existing file. Example of the result after editing:</w:t>
+      </w:r>
+    </w:p>
+    <w:p>
+      <w:pPr>
+        <w:pStyle w:val="PreformattedText"/>
+        <w:bidi w:val="0"/>
+        <w:jc w:val="left"/>
+        <w:rPr/>
+      </w:pPr>
+      <w:r>
+        <w:rPr>
+          <w:rStyle w:val="SourceText"/>
+        </w:rPr>
+        <w:t>{</w:t>
+      </w:r>
+    </w:p>
+    <w:p>
+      <w:pPr>
+        <w:pStyle w:val="PreformattedText"/>
+        <w:bidi w:val="0"/>
+        <w:jc w:val="left"/>
+        <w:rPr/>
+      </w:pPr>
+      <w:r>
+        <w:rPr>
+          <w:rStyle w:val="SourceText"/>
+        </w:rPr>
+        <w:t xml:space="preserve">  </w:t>
+      </w:r>
+      <w:r>
+        <w:rPr>
+          <w:rStyle w:val="SourceText"/>
+        </w:rPr>
+        <w:t>"site": { "title": "Venko – Plant5", "brand": "Ghotrix - Semca" },</w:t>
+      </w:r>
+    </w:p>
+    <w:p>
+      <w:pPr>
+        <w:pStyle w:val="PreformattedText"/>
+        <w:bidi w:val="0"/>
+        <w:jc w:val="left"/>
+        <w:rPr/>
+      </w:pPr>
+      <w:r>
+        <w:rPr>
+          <w:rStyle w:val="SourceText"/>
+        </w:rPr>
+        <w:t xml:space="preserve">  </w:t>
+      </w:r>
+      <w:r>
+        <w:rPr>
+          <w:rStyle w:val="SourceText"/>
+        </w:rPr>
+        <w:t>"units": { "unit": "pH", "uS/cm": "µS/cm" },</w:t>
+      </w:r>
+    </w:p>
+    <w:p>
+      <w:pPr>
+        <w:pStyle w:val="PreformattedText"/>
+        <w:bidi w:val="0"/>
+        <w:jc w:val="left"/>
+        <w:rPr/>
+      </w:pPr>
+      <w:r>
+        <w:rPr>
+          <w:rStyle w:val="SourceText"/>
+        </w:rPr>
+        <w:t xml:space="preserve">  </w:t>
+      </w:r>
+      <w:r>
+        <w:rPr>
+          <w:rStyle w:val="SourceText"/>
+        </w:rPr>
+        <w:t>"defaults": { "warn_margin": 0.1, "decimals": 2 },</w:t>
+      </w:r>
+    </w:p>
+    <w:p>
+      <w:pPr>
+        <w:pStyle w:val="PreformattedText"/>
+        <w:bidi w:val="0"/>
+        <w:jc w:val="left"/>
+        <w:rPr/>
+      </w:pPr>
+      <w:r>
+        <w:rPr>
+          <w:rStyle w:val="SourceText"/>
+        </w:rPr>
+        <w:t xml:space="preserve">  </w:t>
+      </w:r>
+      <w:r>
+        <w:rPr>
+          <w:rStyle w:val="SourceText"/>
+        </w:rPr>
+        <w:t>"groups": ["Temperatura", "Ambiente", "Química"],</w:t>
+      </w:r>
+    </w:p>
+    <w:p>
+      <w:pPr>
+        <w:pStyle w:val="PreformattedText"/>
+        <w:bidi w:val="0"/>
+        <w:jc w:val="left"/>
+        <w:rPr/>
+      </w:pPr>
+      <w:r>
+        <w:rPr>
+          <w:rStyle w:val="SourceText"/>
+        </w:rPr>
+        <w:t xml:space="preserve">  </w:t>
+      </w:r>
+      <w:r>
+        <w:rPr>
+          <w:rStyle w:val="SourceText"/>
+        </w:rPr>
+        <w:t>"sensors": {</w:t>
+      </w:r>
+    </w:p>
+    <w:p>
+      <w:pPr>
+        <w:pStyle w:val="PreformattedText"/>
+        <w:bidi w:val="0"/>
+        <w:jc w:val="left"/>
+        <w:rPr/>
+      </w:pPr>
+      <w:r>
+        <w:rPr>
+          <w:rStyle w:val="SourceText"/>
+        </w:rPr>
+        <w:t xml:space="preserve">    </w:t>
+      </w:r>
+      <w:r>
+        <w:rPr>
+          <w:rStyle w:val="SourceText"/>
+        </w:rPr>
+        <w:t>"DEV_1.Pt100Sensor": { "label": "Temperatura Pt100", "group": "Temperatura", "decimals": 1 },</w:t>
+      </w:r>
+    </w:p>
+    <w:p>
+      <w:pPr>
+        <w:pStyle w:val="PreformattedText"/>
+        <w:bidi w:val="0"/>
+        <w:jc w:val="left"/>
+        <w:rPr/>
+      </w:pPr>
+      <w:r>
+        <w:rPr>
+          <w:rStyle w:val="SourceText"/>
+        </w:rPr>
+        <w:t xml:space="preserve">    </w:t>
+      </w:r>
+      <w:r>
+        <w:rPr>
+          <w:rStyle w:val="SourceText"/>
+        </w:rPr>
+        <w:t>"DEV_3.Humedad":     { "label": "Humedad", "group": "Ambiente" },</w:t>
+      </w:r>
+    </w:p>
+    <w:p>
+      <w:pPr>
+        <w:pStyle w:val="PreformattedText"/>
+        <w:bidi w:val="0"/>
+        <w:jc w:val="left"/>
+        <w:rPr/>
+      </w:pPr>
+      <w:r>
+        <w:rPr>
+          <w:rStyle w:val="SourceText"/>
+        </w:rPr>
+        <w:t xml:space="preserve">    </w:t>
+      </w:r>
+      <w:r>
+        <w:rPr>
+          <w:rStyle w:val="SourceText"/>
+        </w:rPr>
+        <w:t>"DEV_5.PhSensor":    { "label": "pH", "group": "Química" }</w:t>
+      </w:r>
+    </w:p>
+    <w:p>
+      <w:pPr>
+        <w:pStyle w:val="PreformattedText"/>
+        <w:bidi w:val="0"/>
+        <w:jc w:val="left"/>
+        <w:rPr/>
+      </w:pPr>
+      <w:r>
+        <w:rPr>
+          <w:rStyle w:val="SourceText"/>
+        </w:rPr>
+        <w:t xml:space="preserve">  </w:t>
+      </w:r>
+      <w:r>
+        <w:rPr>
+          <w:rStyle w:val="SourceText"/>
+        </w:rPr>
+        <w:t>}</w:t>
+      </w:r>
+    </w:p>
+    <w:p>
+      <w:pPr>
+        <w:pStyle w:val="PreformattedText"/>
+        <w:bidi w:val="0"/>
+        <w:spacing w:before="0" w:after="283"/>
+        <w:jc w:val="left"/>
+        <w:rPr/>
+      </w:pPr>
+      <w:r>
+        <w:rPr>
+          <w:rStyle w:val="SourceText"/>
+        </w:rPr>
+        <w:t>}</w:t>
+      </w:r>
+    </w:p>
+    <w:p>
+      <w:pPr>
+        <w:pStyle w:val="BodyText"/>
+        <w:bidi w:val="0"/>
+        <w:jc w:val="left"/>
+        <w:rPr/>
+      </w:pPr>
+      <w:r>
+        <w:rPr/>
+        <w:t xml:space="preserve">Keys are </w:t>
+      </w:r>
+      <w:r>
+        <w:rPr>
+          <w:rStyle w:val="SourceText"/>
+        </w:rPr>
+        <w:t>DEVICE_ID.SensorName</w:t>
+      </w:r>
+      <w:r>
+        <w:rPr/>
+        <w:t xml:space="preserve">, exactly as in </w:t>
+      </w:r>
+      <w:r>
+        <w:rPr>
+          <w:rStyle w:val="SourceText"/>
+        </w:rPr>
+        <w:t>devices.csv</w:t>
+      </w:r>
+      <w:r>
+        <w:rPr/>
+        <w:t xml:space="preserve"> (case-sensitive). Publish config and web app to the site:</w:t>
+      </w:r>
+    </w:p>
+    <w:p>
+      <w:pPr>
+        <w:pStyle w:val="PreformattedText"/>
+        <w:bidi w:val="0"/>
+        <w:spacing w:before="0" w:after="283"/>
+        <w:jc w:val="left"/>
+        <w:rPr/>
+      </w:pPr>
+      <w:r>
+        <w:rPr>
+          <w:rStyle w:val="SourceText"/>
+        </w:rPr>
+        <w:t>bash tools/deploy_web.sh venko-$KEY ../Akvo_Green/sites/$KEY/config_data/config.json config/sites/$KEY.json</w:t>
+      </w:r>
+    </w:p>
+    <w:p>
+      <w:pPr>
+        <w:pStyle w:val="BodyText"/>
+        <w:bidi w:val="0"/>
+        <w:jc w:val="left"/>
+        <w:rPr/>
+      </w:pPr>
+      <w:r>
+        <w:rPr/>
+        <w:t xml:space="preserve">It refuses to upload if the config's topics don't match the stack's. Then </w:t>
+      </w:r>
+      <w:r>
         <w:rPr>
           <w:rStyle w:val="Strong"/>
         </w:rPr>
-        <w:t>Every later change</w:t>
-      </w:r>
-      <w:r>
-        <w:rPr/>
-        <w:t xml:space="preserve"> is the same push without </w:t>
-      </w:r>
-      <w:r>
-        <w:rPr>
-          <w:rStyle w:val="SourceText"/>
-        </w:rPr>
-        <w:t>--certs</w:t>
-      </w:r>
-      <w:r>
-        <w:rPr/>
-        <w:t xml:space="preserve">: edit the CSVs, rebuild (step 3), </w:t>
-      </w:r>
-      <w:r>
-        <w:rPr>
-          <w:rStyle w:val="SourceText"/>
-        </w:rPr>
-        <w:t>tools/push_site.sh $KEY pi@&lt;pi&gt;</w:t>
-      </w:r>
-      <w:r>
-        <w:rPr/>
-        <w:t xml:space="preserve">. The gateway reloads </w:t>
-      </w:r>
-      <w:r>
-        <w:rPr>
-          <w:rStyle w:val="SourceText"/>
-        </w:rPr>
-        <w:t>config.json</w:t>
-      </w:r>
-      <w:r>
-        <w:rPr/>
-        <w:t xml:space="preserve"> within 5 s. </w:t>
+        <w:t>lock CORS</w:t>
+      </w:r>
+      <w:r>
+        <w:rPr/>
+        <w:t xml:space="preserve"> to the dashboard URL: set </w:t>
+      </w:r>
+      <w:r>
+        <w:rPr>
+          <w:rStyle w:val="SourceText"/>
+        </w:rPr>
+        <w:t>AllowedOrigin=\"https://&lt;DashboardUrl host&gt;\"</w:t>
+      </w:r>
+      <w:r>
+        <w:rPr/>
+        <w:t xml:space="preserve"> in </w:t>
+      </w:r>
+      <w:r>
+        <w:rPr>
+          <w:rStyle w:val="SourceText"/>
+        </w:rPr>
+        <w:t>[plant5.deploy.parameters]</w:t>
+      </w:r>
+      <w:r>
+        <w:rPr/>
+        <w:t xml:space="preserve"> and run:</w:t>
+      </w:r>
+    </w:p>
+    <w:p>
+      <w:pPr>
+        <w:pStyle w:val="PreformattedText"/>
+        <w:bidi w:val="0"/>
+        <w:jc w:val="left"/>
+        <w:rPr/>
+      </w:pPr>
+      <w:r>
+        <w:rPr>
+          <w:rStyle w:val="SourceText"/>
+        </w:rPr>
+        <w:t>cd infra &amp;&amp; sam deploy --config-env $KEY &amp;&amp; cd ..</w:t>
+      </w:r>
+    </w:p>
+    <w:p>
+      <w:pPr>
+        <w:pStyle w:val="PreformattedText"/>
+        <w:bidi w:val="0"/>
+        <w:jc w:val="left"/>
+        <w:rPr/>
+      </w:pPr>
+      <w:r>
+        <w:rPr>
+          <w:rStyle w:val="SourceText"/>
+        </w:rPr>
+        <w:t>API_ID=$(aws cloudformation describe-stack-resource --stack-name venko-$KEY \</w:t>
+      </w:r>
+    </w:p>
+    <w:p>
+      <w:pPr>
+        <w:pStyle w:val="PreformattedText"/>
+        <w:bidi w:val="0"/>
+        <w:jc w:val="left"/>
+        <w:rPr/>
+      </w:pPr>
+      <w:r>
+        <w:rPr>
+          <w:rStyle w:val="SourceText"/>
+        </w:rPr>
+        <w:t xml:space="preserve">  </w:t>
+      </w:r>
+      <w:r>
+        <w:rPr>
+          <w:rStyle w:val="SourceText"/>
+        </w:rPr>
+        <w:t>--logical-resource-id Api --query StackResourceDetail.PhysicalResourceId --output text)</w:t>
+      </w:r>
+    </w:p>
+    <w:p>
+      <w:pPr>
+        <w:pStyle w:val="PreformattedText"/>
+        <w:bidi w:val="0"/>
+        <w:spacing w:before="0" w:after="283"/>
+        <w:jc w:val="left"/>
+        <w:rPr/>
+      </w:pPr>
+      <w:r>
+        <w:rPr>
+          <w:rStyle w:val="SourceText"/>
+        </w:rPr>
+        <w:t>aws apigateway create-deployment --rest-api-id "$API_ID" --stage-name prod</w:t>
+      </w:r>
+    </w:p>
+    <w:p>
+      <w:pPr>
+        <w:pStyle w:val="BodyText"/>
+        <w:bidi w:val="0"/>
+        <w:jc w:val="left"/>
+        <w:rPr/>
+      </w:pPr>
+      <w:r>
+        <w:rPr/>
+        <w:t xml:space="preserve">SAM doesn't republish the API stage when only a parameter changes, hence the </w:t>
+      </w:r>
+      <w:r>
+        <w:rPr>
+          <w:rStyle w:val="SourceText"/>
+        </w:rPr>
+        <w:t>create-deployment</w:t>
+      </w:r>
+      <w:r>
+        <w:rPr/>
+        <w:t>.</w:t>
+      </w:r>
+    </w:p>
+    <w:p>
+      <w:pPr>
+        <w:pStyle w:val="Heading2"/>
+        <w:bidi w:val="0"/>
+        <w:jc w:val="left"/>
+        <w:rPr/>
+      </w:pPr>
+      <w:r>
+        <w:rPr/>
+        <w:t>Step 8 – Install on the Pi</w:t>
+      </w:r>
+    </w:p>
+    <w:p>
+      <w:pPr>
+        <w:pStyle w:val="BodyText"/>
+        <w:bidi w:val="0"/>
+        <w:jc w:val="left"/>
+        <w:rPr/>
+      </w:pPr>
+      <w:r>
+        <w:rPr/>
+        <w:t xml:space="preserve">From your computer, in Akvo_Green. The first push carries the certificates; </w:t>
+      </w:r>
+      <w:r>
+        <w:rPr>
+          <w:rStyle w:val="SourceText"/>
+        </w:rPr>
+        <w:t>install.sh</w:t>
+      </w:r>
+      <w:r>
+        <w:rPr/>
+        <w:t xml:space="preserve"> runs once per Pi:</w:t>
+      </w:r>
+    </w:p>
+    <w:p>
+      <w:pPr>
+        <w:pStyle w:val="PreformattedText"/>
+        <w:bidi w:val="0"/>
+        <w:jc w:val="left"/>
+        <w:rPr/>
+      </w:pPr>
+      <w:r>
+        <w:rPr>
+          <w:rStyle w:val="SourceText"/>
+        </w:rPr>
+        <w:t>cd ~/git_reps/claude/projects/Venko/Akvo_Green</w:t>
+      </w:r>
+    </w:p>
+    <w:p>
+      <w:pPr>
+        <w:pStyle w:val="PreformattedText"/>
+        <w:bidi w:val="0"/>
+        <w:jc w:val="left"/>
+        <w:rPr/>
+      </w:pPr>
+      <w:r>
+        <w:rPr>
+          <w:rStyle w:val="SourceText"/>
+        </w:rPr>
+        <w:t>tools/push_site.sh $KEY pi@192.168.68.140 --certs        # add --no-modbus-tool on Raspberry Pi OS Lite</w:t>
+      </w:r>
+    </w:p>
+    <w:p>
+      <w:pPr>
+        <w:pStyle w:val="PreformattedText"/>
+        <w:bidi w:val="0"/>
+        <w:spacing w:before="0" w:after="283"/>
+        <w:jc w:val="left"/>
+        <w:rPr/>
+      </w:pPr>
+      <w:r>
+        <w:rPr>
+          <w:rStyle w:val="SourceText"/>
+        </w:rPr>
+        <w:t>ssh -t pi@192.168.68.140 'cd Akvo_Green &amp;&amp; ./install.sh --skip-certs &amp;&amp; sudo systemctl start akvo-green'</w:t>
       </w:r>
     </w:p>
     <w:p>
@@ -7975,7 +7971,171 @@
         <w:pStyle w:val="BodyText"/>
         <w:numPr>
           <w:ilvl w:val="0"/>
-          <w:numId w:val="13"/>
+          <w:numId w:val="14"/>
+        </w:numPr>
+        <w:tabs>
+          <w:tab w:val="clear" w:pos="1134"/>
+          <w:tab w:val="left" w:pos="709" w:leader="none"/>
+        </w:tabs>
+        <w:bidi w:val="0"/>
+        <w:spacing w:before="0" w:after="0"/>
+        <w:ind w:hanging="283" w:left="709"/>
+        <w:jc w:val="left"/>
+        <w:rPr/>
+      </w:pPr>
+      <w:r>
+        <w:rPr>
+          <w:rStyle w:val="SourceText"/>
+        </w:rPr>
+        <w:t>push_site.sh</w:t>
+      </w:r>
+      <w:r>
+        <w:rPr/>
+        <w:t xml:space="preserve"> copies the code, the site's </w:t>
+      </w:r>
+      <w:r>
+        <w:rPr>
+          <w:rStyle w:val="SourceText"/>
+        </w:rPr>
+        <w:t>config.json</w:t>
+      </w:r>
+      <w:r>
+        <w:rPr/>
+        <w:t xml:space="preserve">, the certificates (with </w:t>
+      </w:r>
+      <w:r>
+        <w:rPr>
+          <w:rStyle w:val="SourceText"/>
+        </w:rPr>
+        <w:t>--certs</w:t>
+      </w:r>
+      <w:r>
+        <w:rPr/>
+        <w:t xml:space="preserve">), the WiFi profiles and the AKVO Modbus Tool. It asks for the Pi's sudo password for the WiFi step. </w:t>
+      </w:r>
+    </w:p>
+    <w:p>
+      <w:pPr>
+        <w:pStyle w:val="BodyText"/>
+        <w:numPr>
+          <w:ilvl w:val="0"/>
+          <w:numId w:val="14"/>
+        </w:numPr>
+        <w:tabs>
+          <w:tab w:val="clear" w:pos="1134"/>
+          <w:tab w:val="left" w:pos="709" w:leader="none"/>
+        </w:tabs>
+        <w:bidi w:val="0"/>
+        <w:spacing w:before="0" w:after="0"/>
+        <w:ind w:hanging="283" w:left="709"/>
+        <w:jc w:val="left"/>
+        <w:rPr/>
+      </w:pPr>
+      <w:r>
+        <w:rPr>
+          <w:rStyle w:val="SourceText"/>
+        </w:rPr>
+        <w:t>install.sh</w:t>
+      </w:r>
+      <w:r>
+        <w:rPr/>
+        <w:t xml:space="preserve"> sets up packages, the Python venv, serial-port access and the services </w:t>
+      </w:r>
+      <w:r>
+        <w:rPr>
+          <w:rStyle w:val="SourceText"/>
+        </w:rPr>
+        <w:t>akvo-green</w:t>
+      </w:r>
+      <w:r>
+        <w:rPr/>
+        <w:t xml:space="preserve"> and </w:t>
+      </w:r>
+      <w:r>
+        <w:rPr>
+          <w:rStyle w:val="SourceText"/>
+        </w:rPr>
+        <w:t>akvo-history-web</w:t>
+      </w:r>
+      <w:r>
+        <w:rPr/>
+        <w:t xml:space="preserve"> (and </w:t>
+      </w:r>
+      <w:r>
+        <w:rPr>
+          <w:rStyle w:val="SourceText"/>
+        </w:rPr>
+        <w:t>akvo-oled</w:t>
+      </w:r>
+      <w:r>
+        <w:rPr/>
+        <w:t xml:space="preserve">). </w:t>
+      </w:r>
+    </w:p>
+    <w:p>
+      <w:pPr>
+        <w:pStyle w:val="BodyText"/>
+        <w:numPr>
+          <w:ilvl w:val="0"/>
+          <w:numId w:val="14"/>
+        </w:numPr>
+        <w:tabs>
+          <w:tab w:val="clear" w:pos="1134"/>
+          <w:tab w:val="left" w:pos="709" w:leader="none"/>
+        </w:tabs>
+        <w:bidi w:val="0"/>
+        <w:spacing w:before="0" w:after="0"/>
+        <w:ind w:hanging="283" w:left="709"/>
+        <w:jc w:val="left"/>
+        <w:rPr/>
+      </w:pPr>
+      <w:r>
+        <w:rPr>
+          <w:rStyle w:val="Strong"/>
+        </w:rPr>
+        <w:t>Every later change</w:t>
+      </w:r>
+      <w:r>
+        <w:rPr/>
+        <w:t xml:space="preserve"> is the same push without </w:t>
+      </w:r>
+      <w:r>
+        <w:rPr>
+          <w:rStyle w:val="SourceText"/>
+        </w:rPr>
+        <w:t>--certs</w:t>
+      </w:r>
+      <w:r>
+        <w:rPr/>
+        <w:t xml:space="preserve">: edit the CSVs, rebuild (step 3), </w:t>
+      </w:r>
+      <w:r>
+        <w:rPr>
+          <w:rStyle w:val="SourceText"/>
+        </w:rPr>
+        <w:t>tools/push_site.sh $KEY pi@&lt;pi&gt;</w:t>
+      </w:r>
+      <w:r>
+        <w:rPr/>
+        <w:t xml:space="preserve">. The gateway reloads </w:t>
+      </w:r>
+      <w:r>
+        <w:rPr>
+          <w:rStyle w:val="SourceText"/>
+        </w:rPr>
+        <w:t>config.json</w:t>
+      </w:r>
+      <w:r>
+        <w:rPr/>
+        <w:t xml:space="preserve"> within 5 s. </w:t>
+      </w:r>
+    </w:p>
+    <w:p>
+      <w:pPr>
+        <w:pStyle w:val="BodyText"/>
+        <w:numPr>
+          <w:ilvl w:val="0"/>
+          <w:numId w:val="14"/>
         </w:numPr>
         <w:tabs>
           <w:tab w:val="clear" w:pos="1134"/>
@@ -8019,8 +8179,8 @@
         </w:tblCellMar>
       </w:tblPr>
       <w:tblGrid>
-        <w:gridCol w:w="2468"/>
-        <w:gridCol w:w="8871"/>
+        <w:gridCol w:w="2472"/>
+        <w:gridCol w:w="8867"/>
       </w:tblGrid>
       <w:tr>
         <w:trPr>
@@ -8028,7 +8188,7 @@
         </w:trPr>
         <w:tc>
           <w:tcPr>
-            <w:tcW w:w="2468" w:type="dxa"/>
+            <w:tcW w:w="2472" w:type="dxa"/>
             <w:tcBorders>
               <w:top w:val="single" w:sz="6" w:space="0" w:color="808080"/>
               <w:left w:val="single" w:sz="6" w:space="0" w:color="808080"/>
@@ -8055,7 +8215,7 @@
         </w:tc>
         <w:tc>
           <w:tcPr>
-            <w:tcW w:w="8871" w:type="dxa"/>
+            <w:tcW w:w="8867" w:type="dxa"/>
             <w:tcBorders>
               <w:top w:val="single" w:sz="6" w:space="0" w:color="808080"/>
               <w:left w:val="single" w:sz="2" w:space="0" w:color="808080"/>
@@ -8085,7 +8245,7 @@
         <w:trPr/>
         <w:tc>
           <w:tcPr>
-            <w:tcW w:w="2468" w:type="dxa"/>
+            <w:tcW w:w="2472" w:type="dxa"/>
             <w:tcBorders>
               <w:left w:val="single" w:sz="6" w:space="0" w:color="808080"/>
               <w:bottom w:val="single" w:sz="2" w:space="0" w:color="808080"/>
@@ -8109,7 +8269,7 @@
         </w:tc>
         <w:tc>
           <w:tcPr>
-            <w:tcW w:w="8871" w:type="dxa"/>
+            <w:tcW w:w="8867" w:type="dxa"/>
             <w:tcBorders>
               <w:left w:val="single" w:sz="2" w:space="0" w:color="808080"/>
               <w:bottom w:val="single" w:sz="2" w:space="0" w:color="808080"/>
@@ -8162,7 +8322,7 @@
         <w:trPr/>
         <w:tc>
           <w:tcPr>
-            <w:tcW w:w="2468" w:type="dxa"/>
+            <w:tcW w:w="2472" w:type="dxa"/>
             <w:tcBorders>
               <w:left w:val="single" w:sz="6" w:space="0" w:color="808080"/>
               <w:bottom w:val="single" w:sz="2" w:space="0" w:color="808080"/>
@@ -8186,7 +8346,7 @@
         </w:tc>
         <w:tc>
           <w:tcPr>
-            <w:tcW w:w="8871" w:type="dxa"/>
+            <w:tcW w:w="8867" w:type="dxa"/>
             <w:tcBorders>
               <w:left w:val="single" w:sz="2" w:space="0" w:color="808080"/>
               <w:bottom w:val="single" w:sz="2" w:space="0" w:color="808080"/>
@@ -8206,17 +8366,17 @@
               <w:rPr>
                 <w:rStyle w:val="SourceText"/>
               </w:rPr>
-              <w:t>display_enabled=1</w:t>
-            </w:r>
-            <w:r>
-              <w:rPr/>
-              <w:t xml:space="preserve"> in </w:t>
+              <w:t>display.csv</w:t>
+            </w:r>
+            <w:r>
+              <w:rPr/>
+              <w:t xml:space="preserve"> with </w:t>
             </w:r>
             <w:r>
               <w:rPr>
                 <w:rStyle w:val="SourceText"/>
               </w:rPr>
-              <w:t>system.csv</w:t>
+              <w:t>enabled=1</w:t>
             </w:r>
             <w:r>
               <w:rPr/>
@@ -8229,7 +8389,7 @@
         <w:trPr/>
         <w:tc>
           <w:tcPr>
-            <w:tcW w:w="2468" w:type="dxa"/>
+            <w:tcW w:w="2472" w:type="dxa"/>
             <w:tcBorders>
               <w:left w:val="single" w:sz="6" w:space="0" w:color="808080"/>
               <w:bottom w:val="single" w:sz="6" w:space="0" w:color="808080"/>
@@ -8253,7 +8413,7 @@
         </w:tc>
         <w:tc>
           <w:tcPr>
-            <w:tcW w:w="8871" w:type="dxa"/>
+            <w:tcW w:w="8867" w:type="dxa"/>
             <w:tcBorders>
               <w:left w:val="single" w:sz="2" w:space="0" w:color="808080"/>
               <w:bottom w:val="single" w:sz="6" w:space="0" w:color="808080"/>
@@ -8464,7 +8624,7 @@
         <w:pStyle w:val="BodyText"/>
         <w:numPr>
           <w:ilvl w:val="0"/>
-          <w:numId w:val="14"/>
+          <w:numId w:val="15"/>
         </w:numPr>
         <w:tabs>
           <w:tab w:val="clear" w:pos="1134"/>
@@ -8490,7 +8650,7 @@
         <w:pStyle w:val="BodyText"/>
         <w:numPr>
           <w:ilvl w:val="0"/>
-          <w:numId w:val="14"/>
+          <w:numId w:val="15"/>
         </w:numPr>
         <w:tabs>
           <w:tab w:val="clear" w:pos="1134"/>
@@ -8516,7 +8676,7 @@
         <w:pStyle w:val="BodyText"/>
         <w:numPr>
           <w:ilvl w:val="0"/>
-          <w:numId w:val="14"/>
+          <w:numId w:val="15"/>
         </w:numPr>
         <w:tabs>
           <w:tab w:val="clear" w:pos="1134"/>
@@ -8562,7 +8722,7 @@
         <w:pStyle w:val="BodyText"/>
         <w:numPr>
           <w:ilvl w:val="0"/>
-          <w:numId w:val="14"/>
+          <w:numId w:val="15"/>
         </w:numPr>
         <w:tabs>
           <w:tab w:val="clear" w:pos="1134"/>
@@ -8608,7 +8768,7 @@
         <w:pStyle w:val="BodyText"/>
         <w:numPr>
           <w:ilvl w:val="0"/>
-          <w:numId w:val="14"/>
+          <w:numId w:val="15"/>
         </w:numPr>
         <w:tabs>
           <w:tab w:val="clear" w:pos="1134"/>
@@ -8640,7 +8800,7 @@
         <w:pStyle w:val="BodyText"/>
         <w:numPr>
           <w:ilvl w:val="0"/>
-          <w:numId w:val="14"/>
+          <w:numId w:val="15"/>
         </w:numPr>
         <w:tabs>
           <w:tab w:val="clear" w:pos="1134"/>
@@ -8666,7 +8826,7 @@
         <w:pStyle w:val="BodyText"/>
         <w:numPr>
           <w:ilvl w:val="0"/>
-          <w:numId w:val="14"/>
+          <w:numId w:val="15"/>
         </w:numPr>
         <w:tabs>
           <w:tab w:val="clear" w:pos="1134"/>
@@ -8722,7 +8882,7 @@
         <w:pStyle w:val="BodyText"/>
         <w:numPr>
           <w:ilvl w:val="0"/>
-          <w:numId w:val="14"/>
+          <w:numId w:val="15"/>
         </w:numPr>
         <w:tabs>
           <w:tab w:val="clear" w:pos="1134"/>
@@ -8758,7 +8918,7 @@
         <w:pStyle w:val="BodyText"/>
         <w:numPr>
           <w:ilvl w:val="0"/>
-          <w:numId w:val="14"/>
+          <w:numId w:val="15"/>
         </w:numPr>
         <w:tabs>
           <w:tab w:val="clear" w:pos="1134"/>
@@ -8814,7 +8974,7 @@
         <w:pStyle w:val="BodyText"/>
         <w:numPr>
           <w:ilvl w:val="0"/>
-          <w:numId w:val="14"/>
+          <w:numId w:val="15"/>
         </w:numPr>
         <w:tabs>
           <w:tab w:val="clear" w:pos="1134"/>
@@ -8860,7 +9020,7 @@
         <w:pStyle w:val="BodyText"/>
         <w:numPr>
           <w:ilvl w:val="0"/>
-          <w:numId w:val="14"/>
+          <w:numId w:val="15"/>
         </w:numPr>
         <w:tabs>
           <w:tab w:val="clear" w:pos="1134"/>
@@ -9972,7 +10132,7 @@
         <w:pStyle w:val="BodyText"/>
         <w:numPr>
           <w:ilvl w:val="0"/>
-          <w:numId w:val="15"/>
+          <w:numId w:val="16"/>
         </w:numPr>
         <w:tabs>
           <w:tab w:val="clear" w:pos="1134"/>
@@ -9998,7 +10158,7 @@
         <w:pStyle w:val="BodyText"/>
         <w:numPr>
           <w:ilvl w:val="0"/>
-          <w:numId w:val="15"/>
+          <w:numId w:val="16"/>
         </w:numPr>
         <w:tabs>
           <w:tab w:val="clear" w:pos="1134"/>
@@ -10034,7 +10194,7 @@
         <w:pStyle w:val="BodyText"/>
         <w:numPr>
           <w:ilvl w:val="0"/>
-          <w:numId w:val="15"/>
+          <w:numId w:val="16"/>
         </w:numPr>
         <w:tabs>
           <w:tab w:val="clear" w:pos="1134"/>
@@ -10070,7 +10230,7 @@
         <w:pStyle w:val="BodyText"/>
         <w:numPr>
           <w:ilvl w:val="0"/>
-          <w:numId w:val="15"/>
+          <w:numId w:val="16"/>
         </w:numPr>
         <w:tabs>
           <w:tab w:val="clear" w:pos="1134"/>
@@ -10096,7 +10256,7 @@
         <w:pStyle w:val="BodyText"/>
         <w:numPr>
           <w:ilvl w:val="0"/>
-          <w:numId w:val="15"/>
+          <w:numId w:val="16"/>
         </w:numPr>
         <w:tabs>
           <w:tab w:val="clear" w:pos="1134"/>
@@ -10122,7 +10282,7 @@
         <w:pStyle w:val="BodyText"/>
         <w:numPr>
           <w:ilvl w:val="0"/>
-          <w:numId w:val="15"/>
+          <w:numId w:val="16"/>
         </w:numPr>
         <w:tabs>
           <w:tab w:val="clear" w:pos="1134"/>
@@ -13315,6 +13475,143 @@
     </w:lvl>
   </w:abstractNum>
   <w:abstractNum w:abstractNumId="16">
+    <w:lvl w:ilvl="0">
+      <w:start w:val="1"/>
+      <w:numFmt w:val="bullet"/>
+      <w:lvlText w:val=""/>
+      <w:lvlJc w:val="left"/>
+      <w:pPr>
+        <w:tabs>
+          <w:tab w:val="num" w:pos="709"/>
+        </w:tabs>
+        <w:ind w:left="709" w:hanging="283"/>
+      </w:pPr>
+      <w:rPr>
+        <w:rFonts w:ascii="Symbol" w:hAnsi="Symbol" w:cs="Symbol" w:hint="default"/>
+      </w:rPr>
+    </w:lvl>
+    <w:lvl w:ilvl="1">
+      <w:start w:val="1"/>
+      <w:numFmt w:val="bullet"/>
+      <w:lvlText w:val=""/>
+      <w:lvlJc w:val="left"/>
+      <w:pPr>
+        <w:tabs>
+          <w:tab w:val="num" w:pos="1418"/>
+        </w:tabs>
+        <w:ind w:left="1418" w:hanging="283"/>
+      </w:pPr>
+      <w:rPr>
+        <w:rFonts w:ascii="Symbol" w:hAnsi="Symbol" w:cs="Symbol" w:hint="default"/>
+      </w:rPr>
+    </w:lvl>
+    <w:lvl w:ilvl="2">
+      <w:start w:val="1"/>
+      <w:numFmt w:val="bullet"/>
+      <w:lvlText w:val=""/>
+      <w:lvlJc w:val="left"/>
+      <w:pPr>
+        <w:tabs>
+          <w:tab w:val="num" w:pos="2127"/>
+        </w:tabs>
+        <w:ind w:left="2127" w:hanging="283"/>
+      </w:pPr>
+      <w:rPr>
+        <w:rFonts w:ascii="Symbol" w:hAnsi="Symbol" w:cs="Symbol" w:hint="default"/>
+      </w:rPr>
+    </w:lvl>
+    <w:lvl w:ilvl="3">
+      <w:start w:val="1"/>
+      <w:numFmt w:val="bullet"/>
+      <w:lvlText w:val=""/>
+      <w:lvlJc w:val="left"/>
+      <w:pPr>
+        <w:tabs>
+          <w:tab w:val="num" w:pos="2836"/>
+        </w:tabs>
+        <w:ind w:left="2836" w:hanging="283"/>
+      </w:pPr>
+      <w:rPr>
+        <w:rFonts w:ascii="Symbol" w:hAnsi="Symbol" w:cs="Symbol" w:hint="default"/>
+      </w:rPr>
+    </w:lvl>
+    <w:lvl w:ilvl="4">
+      <w:start w:val="1"/>
+      <w:numFmt w:val="bullet"/>
+      <w:lvlText w:val=""/>
+      <w:lvlJc w:val="left"/>
+      <w:pPr>
+        <w:tabs>
+          <w:tab w:val="num" w:pos="3545"/>
+        </w:tabs>
+        <w:ind w:left="3545" w:hanging="283"/>
+      </w:pPr>
+      <w:rPr>
+        <w:rFonts w:ascii="Symbol" w:hAnsi="Symbol" w:cs="Symbol" w:hint="default"/>
+      </w:rPr>
+    </w:lvl>
+    <w:lvl w:ilvl="5">
+      <w:start w:val="1"/>
+      <w:numFmt w:val="bullet"/>
+      <w:lvlText w:val=""/>
+      <w:lvlJc w:val="left"/>
+      <w:pPr>
+        <w:tabs>
+          <w:tab w:val="num" w:pos="4254"/>
+        </w:tabs>
+        <w:ind w:left="4254" w:hanging="283"/>
+      </w:pPr>
+      <w:rPr>
+        <w:rFonts w:ascii="Symbol" w:hAnsi="Symbol" w:cs="Symbol" w:hint="default"/>
+      </w:rPr>
+    </w:lvl>
+    <w:lvl w:ilvl="6">
+      <w:start w:val="1"/>
+      <w:numFmt w:val="bullet"/>
+      <w:lvlText w:val=""/>
+      <w:lvlJc w:val="left"/>
+      <w:pPr>
+        <w:tabs>
+          <w:tab w:val="num" w:pos="4963"/>
+        </w:tabs>
+        <w:ind w:left="4963" w:hanging="283"/>
+      </w:pPr>
+      <w:rPr>
+        <w:rFonts w:ascii="Symbol" w:hAnsi="Symbol" w:cs="Symbol" w:hint="default"/>
+      </w:rPr>
+    </w:lvl>
+    <w:lvl w:ilvl="7">
+      <w:start w:val="1"/>
+      <w:numFmt w:val="bullet"/>
+      <w:lvlText w:val=""/>
+      <w:lvlJc w:val="left"/>
+      <w:pPr>
+        <w:tabs>
+          <w:tab w:val="num" w:pos="5672"/>
+        </w:tabs>
+        <w:ind w:left="5672" w:hanging="283"/>
+      </w:pPr>
+      <w:rPr>
+        <w:rFonts w:ascii="Symbol" w:hAnsi="Symbol" w:cs="Symbol" w:hint="default"/>
+      </w:rPr>
+    </w:lvl>
+    <w:lvl w:ilvl="8">
+      <w:start w:val="1"/>
+      <w:numFmt w:val="bullet"/>
+      <w:lvlText w:val=""/>
+      <w:lvlJc w:val="left"/>
+      <w:pPr>
+        <w:tabs>
+          <w:tab w:val="num" w:pos="6381"/>
+        </w:tabs>
+        <w:ind w:left="6381" w:hanging="283"/>
+      </w:pPr>
+      <w:rPr>
+        <w:rFonts w:ascii="Symbol" w:hAnsi="Symbol" w:cs="Symbol" w:hint="default"/>
+      </w:rPr>
+    </w:lvl>
+  </w:abstractNum>
+  <w:abstractNum w:abstractNumId="17">
     <w:lvl w:ilvl="0">
       <w:start w:val="1"/>
       <w:numFmt w:val="none"/>
@@ -13481,6 +13778,9 @@
   </w:num>
   <w:num w:numId="16">
     <w:abstractNumId w:val="16"/>
+  </w:num>
+  <w:num w:numId="17">
+    <w:abstractNumId w:val="17"/>
   </w:num>
 </w:numbering>
 </file>

</xml_diff>

<commit_message>
Dashboard: hardware rows (Equipo, N.º de serie, Hostname); manual: Pi registration
Overview system table shows the gateway's hw_model/hw_serial/hostname
(from Akvo_Green's system telemetry). New-site manual step 8: first push
registers the Pi (pi.csv, hostname <key>.local); later pushes need no IP.

Co-Authored-By: Claude Opus 5.5 <noreply@anthropic.com>
</commit_message>
<xml_diff>
--- a/docs/new-site-manual.docx
+++ b/docs/new-site-manual.docx
@@ -8090,9 +8090,91 @@
         <w:rPr/>
       </w:pPr>
       <w:r>
+        <w:rPr/>
+        <w:t xml:space="preserve">The first push also </w:t>
+      </w:r>
+      <w:r>
         <w:rPr>
           <w:rStyle w:val="Strong"/>
         </w:rPr>
+        <w:t>registers the Pi</w:t>
+      </w:r>
+      <w:r>
+        <w:rPr/>
+        <w:t xml:space="preserve">: it writes </w:t>
+      </w:r>
+      <w:r>
+        <w:rPr>
+          <w:rStyle w:val="SourceText"/>
+        </w:rPr>
+        <w:t>sites/$KEY/pi.csv</w:t>
+      </w:r>
+      <w:r>
+        <w:rPr/>
+        <w:t xml:space="preserve"> (hostname, user, serial number, MAC; commit it) and renames the Pi to </w:t>
+      </w:r>
+      <w:r>
+        <w:rPr>
+          <w:rStyle w:val="SourceText"/>
+        </w:rPr>
+        <w:t>$KEY</w:t>
+      </w:r>
+      <w:r>
+        <w:rPr/>
+        <w:t xml:space="preserve">, so it's reachable as </w:t>
+      </w:r>
+      <w:r>
+        <w:rPr>
+          <w:rStyle w:val="SourceText"/>
+        </w:rPr>
+        <w:t>$KEY.local</w:t>
+      </w:r>
+      <w:r>
+        <w:rPr/>
+        <w:t xml:space="preserve"> (e.g. </w:t>
+      </w:r>
+      <w:r>
+        <w:rPr>
+          <w:rStyle w:val="SourceText"/>
+        </w:rPr>
+        <w:t>http://$KEY.local:8080</w:t>
+      </w:r>
+      <w:r>
+        <w:rPr/>
+        <w:t xml:space="preserve">) whatever IP the router gives it. Every later push checks the serial and refuses to push this site to any other Pi; if the site really moves to new hardware, push once with </w:t>
+      </w:r>
+      <w:r>
+        <w:rPr>
+          <w:rStyle w:val="SourceText"/>
+        </w:rPr>
+        <w:t>--new-hw</w:t>
+      </w:r>
+      <w:r>
+        <w:rPr/>
+        <w:t xml:space="preserve">. </w:t>
+      </w:r>
+    </w:p>
+    <w:p>
+      <w:pPr>
+        <w:pStyle w:val="BodyText"/>
+        <w:numPr>
+          <w:ilvl w:val="0"/>
+          <w:numId w:val="14"/>
+        </w:numPr>
+        <w:tabs>
+          <w:tab w:val="clear" w:pos="1134"/>
+          <w:tab w:val="left" w:pos="709" w:leader="none"/>
+        </w:tabs>
+        <w:bidi w:val="0"/>
+        <w:spacing w:before="0" w:after="0"/>
+        <w:ind w:hanging="283" w:left="709"/>
+        <w:jc w:val="left"/>
+        <w:rPr/>
+      </w:pPr>
+      <w:r>
+        <w:rPr>
+          <w:rStyle w:val="Strong"/>
+        </w:rPr>
         <w:t>Every later change</w:t>
       </w:r>
       <w:r>
@@ -8107,17 +8189,27 @@
       </w:r>
       <w:r>
         <w:rPr/>
-        <w:t xml:space="preserve">: edit the CSVs, rebuild (step 3), </w:t>
-      </w:r>
-      <w:r>
-        <w:rPr>
-          <w:rStyle w:val="SourceText"/>
-        </w:rPr>
-        <w:t>tools/push_site.sh $KEY pi@&lt;pi&gt;</w:t>
-      </w:r>
-      <w:r>
-        <w:rPr/>
-        <w:t xml:space="preserve">. The gateway reloads </w:t>
+        <w:t xml:space="preserve"> and without an address: edit the CSVs, rebuild (step 3), </w:t>
+      </w:r>
+      <w:r>
+        <w:rPr>
+          <w:rStyle w:val="SourceText"/>
+        </w:rPr>
+        <w:t>tools/push_site.sh $KEY</w:t>
+      </w:r>
+      <w:r>
+        <w:rPr/>
+        <w:t xml:space="preserve">. It finds the Pi as </w:t>
+      </w:r>
+      <w:r>
+        <w:rPr>
+          <w:rStyle w:val="SourceText"/>
+        </w:rPr>
+        <w:t>$KEY.local</w:t>
+      </w:r>
+      <w:r>
+        <w:rPr/>
+        <w:t xml:space="preserve">, or else at the IP the gateway last reported to AWS. The gateway reloads </w:t>
       </w:r>
       <w:r>
         <w:rPr>

</xml_diff>

<commit_message>
Cost per site: stack/Component tags, 30-day Lambda log groups, site_costs.py, budgets
Stacks carry Project/Site/Client tags (samconfig) and every resource a
Component tag (ingest, storage, api, query, reports, web), so Cost Explorer
splits the bill per site and category. aws:cloudformation:stack-name is
active as a cost allocation tag (backfilled from 2026-09-01); budgets
venko-<key>-monthly filter on it. Lambdas log to /venko/<stack>/{api,report}
with 30-day retention instead of the unbounded /aws/lambda groups.

Co-Authored-By: Claude Opus 5.5 <noreply@anthropic.com>
</commit_message>
<xml_diff>
--- a/docs/new-site-manual.docx
+++ b/docs/new-site-manual.docx
@@ -127,21 +127,21 @@
     </w:p>
     <w:tbl>
       <w:tblPr>
-        <w:tblW w:w="5000" w:type="pct"/>
-        <w:jc w:val="left"/>
-        <w:tblInd w:w="60" w:type="dxa"/>
+        <w:tblW w:w="11339" w:type="dxa"/>
+        <w:jc w:val="left"/>
+        <w:tblInd w:w="28" w:type="dxa"/>
         <w:tblLayout w:type="fixed"/>
         <w:tblCellMar>
-          <w:top w:w="60" w:type="dxa"/>
-          <w:left w:w="60" w:type="dxa"/>
-          <w:bottom w:w="60" w:type="dxa"/>
-          <w:right w:w="60" w:type="dxa"/>
+          <w:top w:w="28" w:type="dxa"/>
+          <w:left w:w="28" w:type="dxa"/>
+          <w:bottom w:w="28" w:type="dxa"/>
+          <w:right w:w="28" w:type="dxa"/>
         </w:tblCellMar>
       </w:tblPr>
       <w:tblGrid>
-        <w:gridCol w:w="2887"/>
-        <w:gridCol w:w="4217"/>
-        <w:gridCol w:w="4234"/>
+        <w:gridCol w:w="2574"/>
+        <w:gridCol w:w="4342"/>
+        <w:gridCol w:w="4423"/>
       </w:tblGrid>
       <w:tr>
         <w:trPr>
@@ -149,20 +149,14 @@
         </w:trPr>
         <w:tc>
           <w:tcPr>
-            <w:tcW w:w="2887" w:type="dxa"/>
-            <w:tcBorders>
-              <w:top w:val="single" w:sz="6" w:space="0" w:color="808080"/>
-              <w:left w:val="single" w:sz="6" w:space="0" w:color="808080"/>
-              <w:bottom w:val="single" w:sz="2" w:space="0" w:color="808080"/>
-              <w:right w:val="single" w:sz="6" w:space="0" w:color="808080"/>
-            </w:tcBorders>
+            <w:tcW w:w="2574" w:type="dxa"/>
+            <w:tcBorders/>
             <w:vAlign w:val="center"/>
           </w:tcPr>
           <w:p>
             <w:pPr>
               <w:pStyle w:val="TableHeading"/>
               <w:suppressLineNumbers/>
-              <w:shd w:fill="DDEBF7" w:val="clear"/>
               <w:bidi w:val="0"/>
               <w:spacing w:before="0" w:after="283"/>
               <w:jc w:val="center"/>
@@ -176,20 +170,14 @@
         </w:tc>
         <w:tc>
           <w:tcPr>
-            <w:tcW w:w="4217" w:type="dxa"/>
-            <w:tcBorders>
-              <w:top w:val="single" w:sz="6" w:space="0" w:color="808080"/>
-              <w:left w:val="single" w:sz="2" w:space="0" w:color="808080"/>
-              <w:bottom w:val="single" w:sz="2" w:space="0" w:color="808080"/>
-              <w:right w:val="single" w:sz="6" w:space="0" w:color="808080"/>
-            </w:tcBorders>
+            <w:tcW w:w="4342" w:type="dxa"/>
+            <w:tcBorders/>
             <w:vAlign w:val="center"/>
           </w:tcPr>
           <w:p>
             <w:pPr>
               <w:pStyle w:val="TableHeading"/>
               <w:suppressLineNumbers/>
-              <w:shd w:fill="DDEBF7" w:val="clear"/>
               <w:bidi w:val="0"/>
               <w:spacing w:before="0" w:after="283"/>
               <w:jc w:val="center"/>
@@ -203,20 +191,14 @@
         </w:tc>
         <w:tc>
           <w:tcPr>
-            <w:tcW w:w="4234" w:type="dxa"/>
-            <w:tcBorders>
-              <w:top w:val="single" w:sz="6" w:space="0" w:color="808080"/>
-              <w:left w:val="single" w:sz="2" w:space="0" w:color="808080"/>
-              <w:bottom w:val="single" w:sz="2" w:space="0" w:color="808080"/>
-              <w:right w:val="single" w:sz="6" w:space="0" w:color="808080"/>
-            </w:tcBorders>
+            <w:tcW w:w="4423" w:type="dxa"/>
+            <w:tcBorders/>
             <w:vAlign w:val="center"/>
           </w:tcPr>
           <w:p>
             <w:pPr>
               <w:pStyle w:val="TableHeading"/>
               <w:suppressLineNumbers/>
-              <w:shd w:fill="DDEBF7" w:val="clear"/>
               <w:bidi w:val="0"/>
               <w:spacing w:before="0" w:after="283"/>
               <w:jc w:val="center"/>
@@ -243,12 +225,8 @@
         <w:trPr/>
         <w:tc>
           <w:tcPr>
-            <w:tcW w:w="2887" w:type="dxa"/>
-            <w:tcBorders>
-              <w:left w:val="single" w:sz="6" w:space="0" w:color="808080"/>
-              <w:bottom w:val="single" w:sz="2" w:space="0" w:color="808080"/>
-              <w:right w:val="single" w:sz="6" w:space="0" w:color="808080"/>
-            </w:tcBorders>
+            <w:tcW w:w="2574" w:type="dxa"/>
+            <w:tcBorders/>
             <w:vAlign w:val="center"/>
           </w:tcPr>
           <w:p>
@@ -267,12 +245,8 @@
         </w:tc>
         <w:tc>
           <w:tcPr>
-            <w:tcW w:w="4217" w:type="dxa"/>
-            <w:tcBorders>
-              <w:left w:val="single" w:sz="2" w:space="0" w:color="808080"/>
-              <w:bottom w:val="single" w:sz="2" w:space="0" w:color="808080"/>
-              <w:right w:val="single" w:sz="6" w:space="0" w:color="808080"/>
-            </w:tcBorders>
+            <w:tcW w:w="4342" w:type="dxa"/>
+            <w:tcBorders/>
             <w:vAlign w:val="center"/>
           </w:tcPr>
           <w:p>
@@ -291,12 +265,8 @@
         </w:tc>
         <w:tc>
           <w:tcPr>
-            <w:tcW w:w="4234" w:type="dxa"/>
-            <w:tcBorders>
-              <w:left w:val="single" w:sz="2" w:space="0" w:color="808080"/>
-              <w:bottom w:val="single" w:sz="2" w:space="0" w:color="808080"/>
-              <w:right w:val="single" w:sz="6" w:space="0" w:color="808080"/>
-            </w:tcBorders>
+            <w:tcW w:w="4423" w:type="dxa"/>
+            <w:tcBorders/>
             <w:vAlign w:val="center"/>
           </w:tcPr>
           <w:p>
@@ -320,12 +290,8 @@
         <w:trPr/>
         <w:tc>
           <w:tcPr>
-            <w:tcW w:w="2887" w:type="dxa"/>
-            <w:tcBorders>
-              <w:left w:val="single" w:sz="6" w:space="0" w:color="808080"/>
-              <w:bottom w:val="single" w:sz="2" w:space="0" w:color="808080"/>
-              <w:right w:val="single" w:sz="6" w:space="0" w:color="808080"/>
-            </w:tcBorders>
+            <w:tcW w:w="2574" w:type="dxa"/>
+            <w:tcBorders/>
             <w:vAlign w:val="center"/>
           </w:tcPr>
           <w:p>
@@ -344,12 +310,8 @@
         </w:tc>
         <w:tc>
           <w:tcPr>
-            <w:tcW w:w="4217" w:type="dxa"/>
-            <w:tcBorders>
-              <w:left w:val="single" w:sz="2" w:space="0" w:color="808080"/>
-              <w:bottom w:val="single" w:sz="2" w:space="0" w:color="808080"/>
-              <w:right w:val="single" w:sz="6" w:space="0" w:color="808080"/>
-            </w:tcBorders>
+            <w:tcW w:w="4342" w:type="dxa"/>
+            <w:tcBorders/>
             <w:vAlign w:val="center"/>
           </w:tcPr>
           <w:p>
@@ -374,12 +336,8 @@
         </w:tc>
         <w:tc>
           <w:tcPr>
-            <w:tcW w:w="4234" w:type="dxa"/>
-            <w:tcBorders>
-              <w:left w:val="single" w:sz="2" w:space="0" w:color="808080"/>
-              <w:bottom w:val="single" w:sz="2" w:space="0" w:color="808080"/>
-              <w:right w:val="single" w:sz="6" w:space="0" w:color="808080"/>
-            </w:tcBorders>
+            <w:tcW w:w="4423" w:type="dxa"/>
+            <w:tcBorders/>
             <w:vAlign w:val="center"/>
           </w:tcPr>
           <w:p>
@@ -403,12 +361,8 @@
         <w:trPr/>
         <w:tc>
           <w:tcPr>
-            <w:tcW w:w="2887" w:type="dxa"/>
-            <w:tcBorders>
-              <w:left w:val="single" w:sz="6" w:space="0" w:color="808080"/>
-              <w:bottom w:val="single" w:sz="2" w:space="0" w:color="808080"/>
-              <w:right w:val="single" w:sz="6" w:space="0" w:color="808080"/>
-            </w:tcBorders>
+            <w:tcW w:w="2574" w:type="dxa"/>
+            <w:tcBorders/>
             <w:vAlign w:val="center"/>
           </w:tcPr>
           <w:p>
@@ -427,12 +381,8 @@
         </w:tc>
         <w:tc>
           <w:tcPr>
-            <w:tcW w:w="4217" w:type="dxa"/>
-            <w:tcBorders>
-              <w:left w:val="single" w:sz="2" w:space="0" w:color="808080"/>
-              <w:bottom w:val="single" w:sz="2" w:space="0" w:color="808080"/>
-              <w:right w:val="single" w:sz="6" w:space="0" w:color="808080"/>
-            </w:tcBorders>
+            <w:tcW w:w="4342" w:type="dxa"/>
+            <w:tcBorders/>
             <w:vAlign w:val="center"/>
           </w:tcPr>
           <w:p>
@@ -463,12 +413,8 @@
         </w:tc>
         <w:tc>
           <w:tcPr>
-            <w:tcW w:w="4234" w:type="dxa"/>
-            <w:tcBorders>
-              <w:left w:val="single" w:sz="2" w:space="0" w:color="808080"/>
-              <w:bottom w:val="single" w:sz="2" w:space="0" w:color="808080"/>
-              <w:right w:val="single" w:sz="6" w:space="0" w:color="808080"/>
-            </w:tcBorders>
+            <w:tcW w:w="4423" w:type="dxa"/>
+            <w:tcBorders/>
             <w:vAlign w:val="center"/>
           </w:tcPr>
           <w:p>
@@ -492,12 +438,8 @@
         <w:trPr/>
         <w:tc>
           <w:tcPr>
-            <w:tcW w:w="2887" w:type="dxa"/>
-            <w:tcBorders>
-              <w:left w:val="single" w:sz="6" w:space="0" w:color="808080"/>
-              <w:bottom w:val="single" w:sz="2" w:space="0" w:color="808080"/>
-              <w:right w:val="single" w:sz="6" w:space="0" w:color="808080"/>
-            </w:tcBorders>
+            <w:tcW w:w="2574" w:type="dxa"/>
+            <w:tcBorders/>
             <w:vAlign w:val="center"/>
           </w:tcPr>
           <w:p>
@@ -516,12 +458,8 @@
         </w:tc>
         <w:tc>
           <w:tcPr>
-            <w:tcW w:w="4217" w:type="dxa"/>
-            <w:tcBorders>
-              <w:left w:val="single" w:sz="2" w:space="0" w:color="808080"/>
-              <w:bottom w:val="single" w:sz="2" w:space="0" w:color="808080"/>
-              <w:right w:val="single" w:sz="6" w:space="0" w:color="808080"/>
-            </w:tcBorders>
+            <w:tcW w:w="4342" w:type="dxa"/>
+            <w:tcBorders/>
             <w:vAlign w:val="center"/>
           </w:tcPr>
           <w:p>
@@ -542,12 +480,8 @@
         </w:tc>
         <w:tc>
           <w:tcPr>
-            <w:tcW w:w="4234" w:type="dxa"/>
-            <w:tcBorders>
-              <w:left w:val="single" w:sz="2" w:space="0" w:color="808080"/>
-              <w:bottom w:val="single" w:sz="2" w:space="0" w:color="808080"/>
-              <w:right w:val="single" w:sz="6" w:space="0" w:color="808080"/>
-            </w:tcBorders>
+            <w:tcW w:w="4423" w:type="dxa"/>
+            <w:tcBorders/>
             <w:vAlign w:val="center"/>
           </w:tcPr>
           <w:p>
@@ -571,12 +505,8 @@
         <w:trPr/>
         <w:tc>
           <w:tcPr>
-            <w:tcW w:w="2887" w:type="dxa"/>
-            <w:tcBorders>
-              <w:left w:val="single" w:sz="6" w:space="0" w:color="808080"/>
-              <w:bottom w:val="single" w:sz="2" w:space="0" w:color="808080"/>
-              <w:right w:val="single" w:sz="6" w:space="0" w:color="808080"/>
-            </w:tcBorders>
+            <w:tcW w:w="2574" w:type="dxa"/>
+            <w:tcBorders/>
             <w:vAlign w:val="center"/>
           </w:tcPr>
           <w:p>
@@ -595,12 +525,8 @@
         </w:tc>
         <w:tc>
           <w:tcPr>
-            <w:tcW w:w="4217" w:type="dxa"/>
-            <w:tcBorders>
-              <w:left w:val="single" w:sz="2" w:space="0" w:color="808080"/>
-              <w:bottom w:val="single" w:sz="2" w:space="0" w:color="808080"/>
-              <w:right w:val="single" w:sz="6" w:space="0" w:color="808080"/>
-            </w:tcBorders>
+            <w:tcW w:w="4342" w:type="dxa"/>
+            <w:tcBorders/>
             <w:vAlign w:val="center"/>
           </w:tcPr>
           <w:p>
@@ -621,12 +547,8 @@
         </w:tc>
         <w:tc>
           <w:tcPr>
-            <w:tcW w:w="4234" w:type="dxa"/>
-            <w:tcBorders>
-              <w:left w:val="single" w:sz="2" w:space="0" w:color="808080"/>
-              <w:bottom w:val="single" w:sz="2" w:space="0" w:color="808080"/>
-              <w:right w:val="single" w:sz="6" w:space="0" w:color="808080"/>
-            </w:tcBorders>
+            <w:tcW w:w="4423" w:type="dxa"/>
+            <w:tcBorders/>
             <w:vAlign w:val="center"/>
           </w:tcPr>
           <w:p>
@@ -650,12 +572,8 @@
         <w:trPr/>
         <w:tc>
           <w:tcPr>
-            <w:tcW w:w="2887" w:type="dxa"/>
-            <w:tcBorders>
-              <w:left w:val="single" w:sz="6" w:space="0" w:color="808080"/>
-              <w:bottom w:val="single" w:sz="2" w:space="0" w:color="808080"/>
-              <w:right w:val="single" w:sz="6" w:space="0" w:color="808080"/>
-            </w:tcBorders>
+            <w:tcW w:w="2574" w:type="dxa"/>
+            <w:tcBorders/>
             <w:vAlign w:val="center"/>
           </w:tcPr>
           <w:p>
@@ -674,12 +592,8 @@
         </w:tc>
         <w:tc>
           <w:tcPr>
-            <w:tcW w:w="4217" w:type="dxa"/>
-            <w:tcBorders>
-              <w:left w:val="single" w:sz="2" w:space="0" w:color="808080"/>
-              <w:bottom w:val="single" w:sz="2" w:space="0" w:color="808080"/>
-              <w:right w:val="single" w:sz="6" w:space="0" w:color="808080"/>
-            </w:tcBorders>
+            <w:tcW w:w="4342" w:type="dxa"/>
+            <w:tcBorders/>
             <w:vAlign w:val="center"/>
           </w:tcPr>
           <w:p>
@@ -710,12 +624,8 @@
         </w:tc>
         <w:tc>
           <w:tcPr>
-            <w:tcW w:w="4234" w:type="dxa"/>
-            <w:tcBorders>
-              <w:left w:val="single" w:sz="2" w:space="0" w:color="808080"/>
-              <w:bottom w:val="single" w:sz="2" w:space="0" w:color="808080"/>
-              <w:right w:val="single" w:sz="6" w:space="0" w:color="808080"/>
-            </w:tcBorders>
+            <w:tcW w:w="4423" w:type="dxa"/>
+            <w:tcBorders/>
             <w:vAlign w:val="center"/>
           </w:tcPr>
           <w:p>
@@ -739,12 +649,8 @@
         <w:trPr/>
         <w:tc>
           <w:tcPr>
-            <w:tcW w:w="2887" w:type="dxa"/>
-            <w:tcBorders>
-              <w:left w:val="single" w:sz="6" w:space="0" w:color="808080"/>
-              <w:bottom w:val="single" w:sz="2" w:space="0" w:color="808080"/>
-              <w:right w:val="single" w:sz="6" w:space="0" w:color="808080"/>
-            </w:tcBorders>
+            <w:tcW w:w="2574" w:type="dxa"/>
+            <w:tcBorders/>
             <w:vAlign w:val="center"/>
           </w:tcPr>
           <w:p>
@@ -763,12 +669,8 @@
         </w:tc>
         <w:tc>
           <w:tcPr>
-            <w:tcW w:w="4217" w:type="dxa"/>
-            <w:tcBorders>
-              <w:left w:val="single" w:sz="2" w:space="0" w:color="808080"/>
-              <w:bottom w:val="single" w:sz="2" w:space="0" w:color="808080"/>
-              <w:right w:val="single" w:sz="6" w:space="0" w:color="808080"/>
-            </w:tcBorders>
+            <w:tcW w:w="4342" w:type="dxa"/>
+            <w:tcBorders/>
             <w:vAlign w:val="center"/>
           </w:tcPr>
           <w:p>
@@ -799,12 +701,8 @@
         </w:tc>
         <w:tc>
           <w:tcPr>
-            <w:tcW w:w="4234" w:type="dxa"/>
-            <w:tcBorders>
-              <w:left w:val="single" w:sz="2" w:space="0" w:color="808080"/>
-              <w:bottom w:val="single" w:sz="2" w:space="0" w:color="808080"/>
-              <w:right w:val="single" w:sz="6" w:space="0" w:color="808080"/>
-            </w:tcBorders>
+            <w:tcW w:w="4423" w:type="dxa"/>
+            <w:tcBorders/>
             <w:vAlign w:val="center"/>
           </w:tcPr>
           <w:p>
@@ -838,12 +736,8 @@
         <w:trPr/>
         <w:tc>
           <w:tcPr>
-            <w:tcW w:w="2887" w:type="dxa"/>
-            <w:tcBorders>
-              <w:left w:val="single" w:sz="6" w:space="0" w:color="808080"/>
-              <w:bottom w:val="single" w:sz="2" w:space="0" w:color="808080"/>
-              <w:right w:val="single" w:sz="6" w:space="0" w:color="808080"/>
-            </w:tcBorders>
+            <w:tcW w:w="2574" w:type="dxa"/>
+            <w:tcBorders/>
             <w:vAlign w:val="center"/>
           </w:tcPr>
           <w:p>
@@ -862,12 +756,8 @@
         </w:tc>
         <w:tc>
           <w:tcPr>
-            <w:tcW w:w="4217" w:type="dxa"/>
-            <w:tcBorders>
-              <w:left w:val="single" w:sz="2" w:space="0" w:color="808080"/>
-              <w:bottom w:val="single" w:sz="2" w:space="0" w:color="808080"/>
-              <w:right w:val="single" w:sz="6" w:space="0" w:color="808080"/>
-            </w:tcBorders>
+            <w:tcW w:w="4342" w:type="dxa"/>
+            <w:tcBorders/>
             <w:vAlign w:val="center"/>
           </w:tcPr>
           <w:p>
@@ -888,12 +778,8 @@
         </w:tc>
         <w:tc>
           <w:tcPr>
-            <w:tcW w:w="4234" w:type="dxa"/>
-            <w:tcBorders>
-              <w:left w:val="single" w:sz="2" w:space="0" w:color="808080"/>
-              <w:bottom w:val="single" w:sz="2" w:space="0" w:color="808080"/>
-              <w:right w:val="single" w:sz="6" w:space="0" w:color="808080"/>
-            </w:tcBorders>
+            <w:tcW w:w="4423" w:type="dxa"/>
+            <w:tcBorders/>
             <w:vAlign w:val="center"/>
           </w:tcPr>
           <w:p>
@@ -917,12 +803,8 @@
         <w:trPr/>
         <w:tc>
           <w:tcPr>
-            <w:tcW w:w="2887" w:type="dxa"/>
-            <w:tcBorders>
-              <w:left w:val="single" w:sz="6" w:space="0" w:color="808080"/>
-              <w:bottom w:val="single" w:sz="2" w:space="0" w:color="808080"/>
-              <w:right w:val="single" w:sz="6" w:space="0" w:color="808080"/>
-            </w:tcBorders>
+            <w:tcW w:w="2574" w:type="dxa"/>
+            <w:tcBorders/>
             <w:vAlign w:val="center"/>
           </w:tcPr>
           <w:p>
@@ -941,12 +823,8 @@
         </w:tc>
         <w:tc>
           <w:tcPr>
-            <w:tcW w:w="4217" w:type="dxa"/>
-            <w:tcBorders>
-              <w:left w:val="single" w:sz="2" w:space="0" w:color="808080"/>
-              <w:bottom w:val="single" w:sz="2" w:space="0" w:color="808080"/>
-              <w:right w:val="single" w:sz="6" w:space="0" w:color="808080"/>
-            </w:tcBorders>
+            <w:tcW w:w="4342" w:type="dxa"/>
+            <w:tcBorders/>
             <w:vAlign w:val="center"/>
           </w:tcPr>
           <w:p>
@@ -967,12 +845,8 @@
         </w:tc>
         <w:tc>
           <w:tcPr>
-            <w:tcW w:w="4234" w:type="dxa"/>
-            <w:tcBorders>
-              <w:left w:val="single" w:sz="2" w:space="0" w:color="808080"/>
-              <w:bottom w:val="single" w:sz="2" w:space="0" w:color="808080"/>
-              <w:right w:val="single" w:sz="6" w:space="0" w:color="808080"/>
-            </w:tcBorders>
+            <w:tcW w:w="4423" w:type="dxa"/>
+            <w:tcBorders/>
             <w:vAlign w:val="center"/>
           </w:tcPr>
           <w:p>
@@ -996,12 +870,8 @@
         <w:trPr/>
         <w:tc>
           <w:tcPr>
-            <w:tcW w:w="2887" w:type="dxa"/>
-            <w:tcBorders>
-              <w:left w:val="single" w:sz="6" w:space="0" w:color="808080"/>
-              <w:bottom w:val="single" w:sz="2" w:space="0" w:color="808080"/>
-              <w:right w:val="single" w:sz="6" w:space="0" w:color="808080"/>
-            </w:tcBorders>
+            <w:tcW w:w="2574" w:type="dxa"/>
+            <w:tcBorders/>
             <w:vAlign w:val="center"/>
           </w:tcPr>
           <w:p>
@@ -1020,12 +890,8 @@
         </w:tc>
         <w:tc>
           <w:tcPr>
-            <w:tcW w:w="4217" w:type="dxa"/>
-            <w:tcBorders>
-              <w:left w:val="single" w:sz="2" w:space="0" w:color="808080"/>
-              <w:bottom w:val="single" w:sz="2" w:space="0" w:color="808080"/>
-              <w:right w:val="single" w:sz="6" w:space="0" w:color="808080"/>
-            </w:tcBorders>
+            <w:tcW w:w="4342" w:type="dxa"/>
+            <w:tcBorders/>
             <w:vAlign w:val="center"/>
           </w:tcPr>
           <w:p>
@@ -1046,12 +912,8 @@
         </w:tc>
         <w:tc>
           <w:tcPr>
-            <w:tcW w:w="4234" w:type="dxa"/>
-            <w:tcBorders>
-              <w:left w:val="single" w:sz="2" w:space="0" w:color="808080"/>
-              <w:bottom w:val="single" w:sz="2" w:space="0" w:color="808080"/>
-              <w:right w:val="single" w:sz="6" w:space="0" w:color="808080"/>
-            </w:tcBorders>
+            <w:tcW w:w="4423" w:type="dxa"/>
+            <w:tcBorders/>
             <w:vAlign w:val="center"/>
           </w:tcPr>
           <w:p>
@@ -1075,12 +937,8 @@
         <w:trPr/>
         <w:tc>
           <w:tcPr>
-            <w:tcW w:w="2887" w:type="dxa"/>
-            <w:tcBorders>
-              <w:left w:val="single" w:sz="6" w:space="0" w:color="808080"/>
-              <w:bottom w:val="single" w:sz="6" w:space="0" w:color="808080"/>
-              <w:right w:val="single" w:sz="6" w:space="0" w:color="808080"/>
-            </w:tcBorders>
+            <w:tcW w:w="2574" w:type="dxa"/>
+            <w:tcBorders/>
             <w:vAlign w:val="center"/>
           </w:tcPr>
           <w:p>
@@ -1099,12 +957,8 @@
         </w:tc>
         <w:tc>
           <w:tcPr>
-            <w:tcW w:w="4217" w:type="dxa"/>
-            <w:tcBorders>
-              <w:left w:val="single" w:sz="2" w:space="0" w:color="808080"/>
-              <w:bottom w:val="single" w:sz="6" w:space="0" w:color="808080"/>
-              <w:right w:val="single" w:sz="6" w:space="0" w:color="808080"/>
-            </w:tcBorders>
+            <w:tcW w:w="4342" w:type="dxa"/>
+            <w:tcBorders/>
             <w:vAlign w:val="center"/>
           </w:tcPr>
           <w:p>
@@ -1125,12 +979,8 @@
         </w:tc>
         <w:tc>
           <w:tcPr>
-            <w:tcW w:w="4234" w:type="dxa"/>
-            <w:tcBorders>
-              <w:left w:val="single" w:sz="2" w:space="0" w:color="808080"/>
-              <w:bottom w:val="single" w:sz="6" w:space="0" w:color="808080"/>
-              <w:right w:val="single" w:sz="6" w:space="0" w:color="808080"/>
-            </w:tcBorders>
+            <w:tcW w:w="4423" w:type="dxa"/>
+            <w:tcBorders/>
             <w:vAlign w:val="center"/>
           </w:tcPr>
           <w:p>
@@ -1489,21 +1339,21 @@
     </w:p>
     <w:tbl>
       <w:tblPr>
-        <w:tblW w:w="5000" w:type="pct"/>
-        <w:jc w:val="left"/>
-        <w:tblInd w:w="60" w:type="dxa"/>
+        <w:tblW w:w="11339" w:type="dxa"/>
+        <w:jc w:val="left"/>
+        <w:tblInd w:w="28" w:type="dxa"/>
         <w:tblLayout w:type="fixed"/>
         <w:tblCellMar>
-          <w:top w:w="60" w:type="dxa"/>
-          <w:left w:w="60" w:type="dxa"/>
-          <w:bottom w:w="60" w:type="dxa"/>
-          <w:right w:w="60" w:type="dxa"/>
+          <w:top w:w="28" w:type="dxa"/>
+          <w:left w:w="28" w:type="dxa"/>
+          <w:bottom w:w="28" w:type="dxa"/>
+          <w:right w:w="28" w:type="dxa"/>
         </w:tblCellMar>
       </w:tblPr>
       <w:tblGrid>
-        <w:gridCol w:w="6648"/>
-        <w:gridCol w:w="2996"/>
-        <w:gridCol w:w="1695"/>
+        <w:gridCol w:w="6004"/>
+        <w:gridCol w:w="3282"/>
+        <w:gridCol w:w="2053"/>
       </w:tblGrid>
       <w:tr>
         <w:trPr>
@@ -1511,20 +1361,14 @@
         </w:trPr>
         <w:tc>
           <w:tcPr>
-            <w:tcW w:w="6648" w:type="dxa"/>
-            <w:tcBorders>
-              <w:top w:val="single" w:sz="6" w:space="0" w:color="808080"/>
-              <w:left w:val="single" w:sz="6" w:space="0" w:color="808080"/>
-              <w:bottom w:val="single" w:sz="2" w:space="0" w:color="808080"/>
-              <w:right w:val="single" w:sz="6" w:space="0" w:color="808080"/>
-            </w:tcBorders>
+            <w:tcW w:w="6004" w:type="dxa"/>
+            <w:tcBorders/>
             <w:vAlign w:val="center"/>
           </w:tcPr>
           <w:p>
             <w:pPr>
               <w:pStyle w:val="TableHeading"/>
               <w:suppressLineNumbers/>
-              <w:shd w:fill="DDEBF7" w:val="clear"/>
               <w:bidi w:val="0"/>
               <w:spacing w:before="0" w:after="283"/>
               <w:jc w:val="center"/>
@@ -1538,20 +1382,14 @@
         </w:tc>
         <w:tc>
           <w:tcPr>
-            <w:tcW w:w="2996" w:type="dxa"/>
-            <w:tcBorders>
-              <w:top w:val="single" w:sz="6" w:space="0" w:color="808080"/>
-              <w:left w:val="single" w:sz="2" w:space="0" w:color="808080"/>
-              <w:bottom w:val="single" w:sz="2" w:space="0" w:color="808080"/>
-              <w:right w:val="single" w:sz="6" w:space="0" w:color="808080"/>
-            </w:tcBorders>
+            <w:tcW w:w="3282" w:type="dxa"/>
+            <w:tcBorders/>
             <w:vAlign w:val="center"/>
           </w:tcPr>
           <w:p>
             <w:pPr>
               <w:pStyle w:val="TableHeading"/>
               <w:suppressLineNumbers/>
-              <w:shd w:fill="DDEBF7" w:val="clear"/>
               <w:bidi w:val="0"/>
               <w:spacing w:before="0" w:after="283"/>
               <w:jc w:val="center"/>
@@ -1565,20 +1403,14 @@
         </w:tc>
         <w:tc>
           <w:tcPr>
-            <w:tcW w:w="1695" w:type="dxa"/>
-            <w:tcBorders>
-              <w:top w:val="single" w:sz="6" w:space="0" w:color="808080"/>
-              <w:left w:val="single" w:sz="2" w:space="0" w:color="808080"/>
-              <w:bottom w:val="single" w:sz="2" w:space="0" w:color="808080"/>
-              <w:right w:val="single" w:sz="6" w:space="0" w:color="808080"/>
-            </w:tcBorders>
+            <w:tcW w:w="2053" w:type="dxa"/>
+            <w:tcBorders/>
             <w:vAlign w:val="center"/>
           </w:tcPr>
           <w:p>
             <w:pPr>
               <w:pStyle w:val="TableHeading"/>
               <w:suppressLineNumbers/>
-              <w:shd w:fill="DDEBF7" w:val="clear"/>
               <w:bidi w:val="0"/>
               <w:spacing w:before="0" w:after="283"/>
               <w:jc w:val="center"/>
@@ -1595,12 +1427,8 @@
         <w:trPr/>
         <w:tc>
           <w:tcPr>
-            <w:tcW w:w="6648" w:type="dxa"/>
-            <w:tcBorders>
-              <w:left w:val="single" w:sz="6" w:space="0" w:color="808080"/>
-              <w:bottom w:val="single" w:sz="2" w:space="0" w:color="808080"/>
-              <w:right w:val="single" w:sz="6" w:space="0" w:color="808080"/>
-            </w:tcBorders>
+            <w:tcW w:w="6004" w:type="dxa"/>
+            <w:tcBorders/>
             <w:vAlign w:val="center"/>
           </w:tcPr>
           <w:p>
@@ -1619,12 +1447,8 @@
         </w:tc>
         <w:tc>
           <w:tcPr>
-            <w:tcW w:w="2996" w:type="dxa"/>
-            <w:tcBorders>
-              <w:left w:val="single" w:sz="2" w:space="0" w:color="808080"/>
-              <w:bottom w:val="single" w:sz="2" w:space="0" w:color="808080"/>
-              <w:right w:val="single" w:sz="6" w:space="0" w:color="808080"/>
-            </w:tcBorders>
+            <w:tcW w:w="3282" w:type="dxa"/>
+            <w:tcBorders/>
             <w:vAlign w:val="center"/>
           </w:tcPr>
           <w:p>
@@ -1645,12 +1469,8 @@
         </w:tc>
         <w:tc>
           <w:tcPr>
-            <w:tcW w:w="1695" w:type="dxa"/>
-            <w:tcBorders>
-              <w:left w:val="single" w:sz="2" w:space="0" w:color="808080"/>
-              <w:bottom w:val="single" w:sz="2" w:space="0" w:color="808080"/>
-              <w:right w:val="single" w:sz="6" w:space="0" w:color="808080"/>
-            </w:tcBorders>
+            <w:tcW w:w="2053" w:type="dxa"/>
+            <w:tcBorders/>
             <w:vAlign w:val="center"/>
           </w:tcPr>
           <w:p>
@@ -1672,12 +1492,8 @@
         <w:trPr/>
         <w:tc>
           <w:tcPr>
-            <w:tcW w:w="6648" w:type="dxa"/>
-            <w:tcBorders>
-              <w:left w:val="single" w:sz="6" w:space="0" w:color="808080"/>
-              <w:bottom w:val="single" w:sz="2" w:space="0" w:color="808080"/>
-              <w:right w:val="single" w:sz="6" w:space="0" w:color="808080"/>
-            </w:tcBorders>
+            <w:tcW w:w="6004" w:type="dxa"/>
+            <w:tcBorders/>
             <w:vAlign w:val="center"/>
           </w:tcPr>
           <w:p>
@@ -1696,12 +1512,8 @@
         </w:tc>
         <w:tc>
           <w:tcPr>
-            <w:tcW w:w="2996" w:type="dxa"/>
-            <w:tcBorders>
-              <w:left w:val="single" w:sz="2" w:space="0" w:color="808080"/>
-              <w:bottom w:val="single" w:sz="2" w:space="0" w:color="808080"/>
-              <w:right w:val="single" w:sz="6" w:space="0" w:color="808080"/>
-            </w:tcBorders>
+            <w:tcW w:w="3282" w:type="dxa"/>
+            <w:tcBorders/>
             <w:vAlign w:val="center"/>
           </w:tcPr>
           <w:p>
@@ -1722,12 +1534,8 @@
         </w:tc>
         <w:tc>
           <w:tcPr>
-            <w:tcW w:w="1695" w:type="dxa"/>
-            <w:tcBorders>
-              <w:left w:val="single" w:sz="2" w:space="0" w:color="808080"/>
-              <w:bottom w:val="single" w:sz="2" w:space="0" w:color="808080"/>
-              <w:right w:val="single" w:sz="6" w:space="0" w:color="808080"/>
-            </w:tcBorders>
+            <w:tcW w:w="2053" w:type="dxa"/>
+            <w:tcBorders/>
             <w:vAlign w:val="center"/>
           </w:tcPr>
           <w:p>
@@ -1749,12 +1557,8 @@
         <w:trPr/>
         <w:tc>
           <w:tcPr>
-            <w:tcW w:w="6648" w:type="dxa"/>
-            <w:tcBorders>
-              <w:left w:val="single" w:sz="6" w:space="0" w:color="808080"/>
-              <w:bottom w:val="single" w:sz="2" w:space="0" w:color="808080"/>
-              <w:right w:val="single" w:sz="6" w:space="0" w:color="808080"/>
-            </w:tcBorders>
+            <w:tcW w:w="6004" w:type="dxa"/>
+            <w:tcBorders/>
             <w:vAlign w:val="center"/>
           </w:tcPr>
           <w:p>
@@ -1773,12 +1577,8 @@
         </w:tc>
         <w:tc>
           <w:tcPr>
-            <w:tcW w:w="2996" w:type="dxa"/>
-            <w:tcBorders>
-              <w:left w:val="single" w:sz="2" w:space="0" w:color="808080"/>
-              <w:bottom w:val="single" w:sz="2" w:space="0" w:color="808080"/>
-              <w:right w:val="single" w:sz="6" w:space="0" w:color="808080"/>
-            </w:tcBorders>
+            <w:tcW w:w="3282" w:type="dxa"/>
+            <w:tcBorders/>
             <w:vAlign w:val="center"/>
           </w:tcPr>
           <w:p>
@@ -1809,12 +1609,8 @@
         </w:tc>
         <w:tc>
           <w:tcPr>
-            <w:tcW w:w="1695" w:type="dxa"/>
-            <w:tcBorders>
-              <w:left w:val="single" w:sz="2" w:space="0" w:color="808080"/>
-              <w:bottom w:val="single" w:sz="2" w:space="0" w:color="808080"/>
-              <w:right w:val="single" w:sz="6" w:space="0" w:color="808080"/>
-            </w:tcBorders>
+            <w:tcW w:w="2053" w:type="dxa"/>
+            <w:tcBorders/>
             <w:vAlign w:val="center"/>
           </w:tcPr>
           <w:p>
@@ -1836,12 +1632,8 @@
         <w:trPr/>
         <w:tc>
           <w:tcPr>
-            <w:tcW w:w="6648" w:type="dxa"/>
-            <w:tcBorders>
-              <w:left w:val="single" w:sz="6" w:space="0" w:color="808080"/>
-              <w:bottom w:val="single" w:sz="2" w:space="0" w:color="808080"/>
-              <w:right w:val="single" w:sz="6" w:space="0" w:color="808080"/>
-            </w:tcBorders>
+            <w:tcW w:w="6004" w:type="dxa"/>
+            <w:tcBorders/>
             <w:vAlign w:val="center"/>
           </w:tcPr>
           <w:p>
@@ -1860,12 +1652,8 @@
         </w:tc>
         <w:tc>
           <w:tcPr>
-            <w:tcW w:w="2996" w:type="dxa"/>
-            <w:tcBorders>
-              <w:left w:val="single" w:sz="2" w:space="0" w:color="808080"/>
-              <w:bottom w:val="single" w:sz="2" w:space="0" w:color="808080"/>
-              <w:right w:val="single" w:sz="6" w:space="0" w:color="808080"/>
-            </w:tcBorders>
+            <w:tcW w:w="3282" w:type="dxa"/>
+            <w:tcBorders/>
             <w:vAlign w:val="center"/>
           </w:tcPr>
           <w:p>
@@ -1890,12 +1678,8 @@
         </w:tc>
         <w:tc>
           <w:tcPr>
-            <w:tcW w:w="1695" w:type="dxa"/>
-            <w:tcBorders>
-              <w:left w:val="single" w:sz="2" w:space="0" w:color="808080"/>
-              <w:bottom w:val="single" w:sz="2" w:space="0" w:color="808080"/>
-              <w:right w:val="single" w:sz="6" w:space="0" w:color="808080"/>
-            </w:tcBorders>
+            <w:tcW w:w="2053" w:type="dxa"/>
+            <w:tcBorders/>
             <w:vAlign w:val="center"/>
           </w:tcPr>
           <w:p>
@@ -1927,12 +1711,8 @@
         <w:trPr/>
         <w:tc>
           <w:tcPr>
-            <w:tcW w:w="6648" w:type="dxa"/>
-            <w:tcBorders>
-              <w:left w:val="single" w:sz="6" w:space="0" w:color="808080"/>
-              <w:bottom w:val="single" w:sz="2" w:space="0" w:color="808080"/>
-              <w:right w:val="single" w:sz="6" w:space="0" w:color="808080"/>
-            </w:tcBorders>
+            <w:tcW w:w="6004" w:type="dxa"/>
+            <w:tcBorders/>
             <w:vAlign w:val="center"/>
           </w:tcPr>
           <w:p>
@@ -1951,12 +1731,8 @@
         </w:tc>
         <w:tc>
           <w:tcPr>
-            <w:tcW w:w="2996" w:type="dxa"/>
-            <w:tcBorders>
-              <w:left w:val="single" w:sz="2" w:space="0" w:color="808080"/>
-              <w:bottom w:val="single" w:sz="2" w:space="0" w:color="808080"/>
-              <w:right w:val="single" w:sz="6" w:space="0" w:color="808080"/>
-            </w:tcBorders>
+            <w:tcW w:w="3282" w:type="dxa"/>
+            <w:tcBorders/>
             <w:vAlign w:val="center"/>
           </w:tcPr>
           <w:p>
@@ -1975,12 +1751,8 @@
         </w:tc>
         <w:tc>
           <w:tcPr>
-            <w:tcW w:w="1695" w:type="dxa"/>
-            <w:tcBorders>
-              <w:left w:val="single" w:sz="2" w:space="0" w:color="808080"/>
-              <w:bottom w:val="single" w:sz="2" w:space="0" w:color="808080"/>
-              <w:right w:val="single" w:sz="6" w:space="0" w:color="808080"/>
-            </w:tcBorders>
+            <w:tcW w:w="2053" w:type="dxa"/>
+            <w:tcBorders/>
             <w:vAlign w:val="center"/>
           </w:tcPr>
           <w:p>
@@ -2012,12 +1784,8 @@
         <w:trPr/>
         <w:tc>
           <w:tcPr>
-            <w:tcW w:w="6648" w:type="dxa"/>
-            <w:tcBorders>
-              <w:left w:val="single" w:sz="6" w:space="0" w:color="808080"/>
-              <w:bottom w:val="single" w:sz="2" w:space="0" w:color="808080"/>
-              <w:right w:val="single" w:sz="6" w:space="0" w:color="808080"/>
-            </w:tcBorders>
+            <w:tcW w:w="6004" w:type="dxa"/>
+            <w:tcBorders/>
             <w:vAlign w:val="center"/>
           </w:tcPr>
           <w:p>
@@ -2036,12 +1804,8 @@
         </w:tc>
         <w:tc>
           <w:tcPr>
-            <w:tcW w:w="2996" w:type="dxa"/>
-            <w:tcBorders>
-              <w:left w:val="single" w:sz="2" w:space="0" w:color="808080"/>
-              <w:bottom w:val="single" w:sz="2" w:space="0" w:color="808080"/>
-              <w:right w:val="single" w:sz="6" w:space="0" w:color="808080"/>
-            </w:tcBorders>
+            <w:tcW w:w="3282" w:type="dxa"/>
+            <w:tcBorders/>
             <w:vAlign w:val="center"/>
           </w:tcPr>
           <w:p>
@@ -2062,12 +1826,8 @@
         </w:tc>
         <w:tc>
           <w:tcPr>
-            <w:tcW w:w="1695" w:type="dxa"/>
-            <w:tcBorders>
-              <w:left w:val="single" w:sz="2" w:space="0" w:color="808080"/>
-              <w:bottom w:val="single" w:sz="2" w:space="0" w:color="808080"/>
-              <w:right w:val="single" w:sz="6" w:space="0" w:color="808080"/>
-            </w:tcBorders>
+            <w:tcW w:w="2053" w:type="dxa"/>
+            <w:tcBorders/>
             <w:vAlign w:val="center"/>
           </w:tcPr>
           <w:p>
@@ -2089,12 +1849,8 @@
         <w:trPr/>
         <w:tc>
           <w:tcPr>
-            <w:tcW w:w="6648" w:type="dxa"/>
-            <w:tcBorders>
-              <w:left w:val="single" w:sz="6" w:space="0" w:color="808080"/>
-              <w:bottom w:val="single" w:sz="6" w:space="0" w:color="808080"/>
-              <w:right w:val="single" w:sz="6" w:space="0" w:color="808080"/>
-            </w:tcBorders>
+            <w:tcW w:w="6004" w:type="dxa"/>
+            <w:tcBorders/>
             <w:vAlign w:val="center"/>
           </w:tcPr>
           <w:p>
@@ -2113,12 +1869,8 @@
         </w:tc>
         <w:tc>
           <w:tcPr>
-            <w:tcW w:w="2996" w:type="dxa"/>
-            <w:tcBorders>
-              <w:left w:val="single" w:sz="2" w:space="0" w:color="808080"/>
-              <w:bottom w:val="single" w:sz="6" w:space="0" w:color="808080"/>
-              <w:right w:val="single" w:sz="6" w:space="0" w:color="808080"/>
-            </w:tcBorders>
+            <w:tcW w:w="3282" w:type="dxa"/>
+            <w:tcBorders/>
             <w:vAlign w:val="center"/>
           </w:tcPr>
           <w:p>
@@ -2149,12 +1901,8 @@
         </w:tc>
         <w:tc>
           <w:tcPr>
-            <w:tcW w:w="1695" w:type="dxa"/>
-            <w:tcBorders>
-              <w:left w:val="single" w:sz="2" w:space="0" w:color="808080"/>
-              <w:bottom w:val="single" w:sz="6" w:space="0" w:color="808080"/>
-              <w:right w:val="single" w:sz="6" w:space="0" w:color="808080"/>
-            </w:tcBorders>
+            <w:tcW w:w="2053" w:type="dxa"/>
+            <w:tcBorders/>
             <w:vAlign w:val="center"/>
           </w:tcPr>
           <w:p>
@@ -2189,20 +1937,20 @@
     </w:p>
     <w:tbl>
       <w:tblPr>
-        <w:tblW w:w="5000" w:type="pct"/>
-        <w:jc w:val="left"/>
-        <w:tblInd w:w="60" w:type="dxa"/>
+        <w:tblW w:w="11339" w:type="dxa"/>
+        <w:jc w:val="left"/>
+        <w:tblInd w:w="28" w:type="dxa"/>
         <w:tblLayout w:type="fixed"/>
         <w:tblCellMar>
-          <w:top w:w="60" w:type="dxa"/>
-          <w:left w:w="60" w:type="dxa"/>
-          <w:bottom w:w="60" w:type="dxa"/>
-          <w:right w:w="60" w:type="dxa"/>
+          <w:top w:w="28" w:type="dxa"/>
+          <w:left w:w="28" w:type="dxa"/>
+          <w:bottom w:w="28" w:type="dxa"/>
+          <w:right w:w="28" w:type="dxa"/>
         </w:tblCellMar>
       </w:tblPr>
       <w:tblGrid>
-        <w:gridCol w:w="6147"/>
-        <w:gridCol w:w="5192"/>
+        <w:gridCol w:w="5974"/>
+        <w:gridCol w:w="5365"/>
       </w:tblGrid>
       <w:tr>
         <w:trPr>
@@ -2210,20 +1958,14 @@
         </w:trPr>
         <w:tc>
           <w:tcPr>
-            <w:tcW w:w="6147" w:type="dxa"/>
-            <w:tcBorders>
-              <w:top w:val="single" w:sz="6" w:space="0" w:color="808080"/>
-              <w:left w:val="single" w:sz="6" w:space="0" w:color="808080"/>
-              <w:bottom w:val="single" w:sz="2" w:space="0" w:color="808080"/>
-              <w:right w:val="single" w:sz="6" w:space="0" w:color="808080"/>
-            </w:tcBorders>
+            <w:tcW w:w="5974" w:type="dxa"/>
+            <w:tcBorders/>
             <w:vAlign w:val="center"/>
           </w:tcPr>
           <w:p>
             <w:pPr>
               <w:pStyle w:val="TableHeading"/>
               <w:suppressLineNumbers/>
-              <w:shd w:fill="DDEBF7" w:val="clear"/>
               <w:bidi w:val="0"/>
               <w:spacing w:before="0" w:after="283"/>
               <w:jc w:val="center"/>
@@ -2237,20 +1979,14 @@
         </w:tc>
         <w:tc>
           <w:tcPr>
-            <w:tcW w:w="5192" w:type="dxa"/>
-            <w:tcBorders>
-              <w:top w:val="single" w:sz="6" w:space="0" w:color="808080"/>
-              <w:left w:val="single" w:sz="2" w:space="0" w:color="808080"/>
-              <w:bottom w:val="single" w:sz="2" w:space="0" w:color="808080"/>
-              <w:right w:val="single" w:sz="6" w:space="0" w:color="808080"/>
-            </w:tcBorders>
+            <w:tcW w:w="5365" w:type="dxa"/>
+            <w:tcBorders/>
             <w:vAlign w:val="center"/>
           </w:tcPr>
           <w:p>
             <w:pPr>
               <w:pStyle w:val="TableHeading"/>
               <w:suppressLineNumbers/>
-              <w:shd w:fill="DDEBF7" w:val="clear"/>
               <w:bidi w:val="0"/>
               <w:spacing w:before="0" w:after="283"/>
               <w:jc w:val="center"/>
@@ -2267,12 +2003,8 @@
         <w:trPr/>
         <w:tc>
           <w:tcPr>
-            <w:tcW w:w="6147" w:type="dxa"/>
-            <w:tcBorders>
-              <w:left w:val="single" w:sz="6" w:space="0" w:color="808080"/>
-              <w:bottom w:val="single" w:sz="2" w:space="0" w:color="808080"/>
-              <w:right w:val="single" w:sz="6" w:space="0" w:color="808080"/>
-            </w:tcBorders>
+            <w:tcW w:w="5974" w:type="dxa"/>
+            <w:tcBorders/>
             <w:vAlign w:val="center"/>
           </w:tcPr>
           <w:p>
@@ -2291,12 +2023,8 @@
         </w:tc>
         <w:tc>
           <w:tcPr>
-            <w:tcW w:w="5192" w:type="dxa"/>
-            <w:tcBorders>
-              <w:left w:val="single" w:sz="2" w:space="0" w:color="808080"/>
-              <w:bottom w:val="single" w:sz="2" w:space="0" w:color="808080"/>
-              <w:right w:val="single" w:sz="6" w:space="0" w:color="808080"/>
-            </w:tcBorders>
+            <w:tcW w:w="5365" w:type="dxa"/>
+            <w:tcBorders/>
             <w:vAlign w:val="center"/>
           </w:tcPr>
           <w:p>
@@ -2318,12 +2046,8 @@
         <w:trPr/>
         <w:tc>
           <w:tcPr>
-            <w:tcW w:w="6147" w:type="dxa"/>
-            <w:tcBorders>
-              <w:left w:val="single" w:sz="6" w:space="0" w:color="808080"/>
-              <w:bottom w:val="single" w:sz="2" w:space="0" w:color="808080"/>
-              <w:right w:val="single" w:sz="6" w:space="0" w:color="808080"/>
-            </w:tcBorders>
+            <w:tcW w:w="5974" w:type="dxa"/>
+            <w:tcBorders/>
             <w:vAlign w:val="center"/>
           </w:tcPr>
           <w:p>
@@ -2342,12 +2066,8 @@
         </w:tc>
         <w:tc>
           <w:tcPr>
-            <w:tcW w:w="5192" w:type="dxa"/>
-            <w:tcBorders>
-              <w:left w:val="single" w:sz="2" w:space="0" w:color="808080"/>
-              <w:bottom w:val="single" w:sz="2" w:space="0" w:color="808080"/>
-              <w:right w:val="single" w:sz="6" w:space="0" w:color="808080"/>
-            </w:tcBorders>
+            <w:tcW w:w="5365" w:type="dxa"/>
+            <w:tcBorders/>
             <w:vAlign w:val="center"/>
           </w:tcPr>
           <w:p>
@@ -2369,12 +2089,8 @@
         <w:trPr/>
         <w:tc>
           <w:tcPr>
-            <w:tcW w:w="6147" w:type="dxa"/>
-            <w:tcBorders>
-              <w:left w:val="single" w:sz="6" w:space="0" w:color="808080"/>
-              <w:bottom w:val="single" w:sz="2" w:space="0" w:color="808080"/>
-              <w:right w:val="single" w:sz="6" w:space="0" w:color="808080"/>
-            </w:tcBorders>
+            <w:tcW w:w="5974" w:type="dxa"/>
+            <w:tcBorders/>
             <w:vAlign w:val="center"/>
           </w:tcPr>
           <w:p>
@@ -2393,12 +2109,8 @@
         </w:tc>
         <w:tc>
           <w:tcPr>
-            <w:tcW w:w="5192" w:type="dxa"/>
-            <w:tcBorders>
-              <w:left w:val="single" w:sz="2" w:space="0" w:color="808080"/>
-              <w:bottom w:val="single" w:sz="2" w:space="0" w:color="808080"/>
-              <w:right w:val="single" w:sz="6" w:space="0" w:color="808080"/>
-            </w:tcBorders>
+            <w:tcW w:w="5365" w:type="dxa"/>
+            <w:tcBorders/>
             <w:vAlign w:val="center"/>
           </w:tcPr>
           <w:p>
@@ -2440,12 +2152,8 @@
         <w:trPr/>
         <w:tc>
           <w:tcPr>
-            <w:tcW w:w="6147" w:type="dxa"/>
-            <w:tcBorders>
-              <w:left w:val="single" w:sz="6" w:space="0" w:color="808080"/>
-              <w:bottom w:val="single" w:sz="2" w:space="0" w:color="808080"/>
-              <w:right w:val="single" w:sz="6" w:space="0" w:color="808080"/>
-            </w:tcBorders>
+            <w:tcW w:w="5974" w:type="dxa"/>
+            <w:tcBorders/>
             <w:vAlign w:val="center"/>
           </w:tcPr>
           <w:p>
@@ -2464,12 +2172,8 @@
         </w:tc>
         <w:tc>
           <w:tcPr>
-            <w:tcW w:w="5192" w:type="dxa"/>
-            <w:tcBorders>
-              <w:left w:val="single" w:sz="2" w:space="0" w:color="808080"/>
-              <w:bottom w:val="single" w:sz="2" w:space="0" w:color="808080"/>
-              <w:right w:val="single" w:sz="6" w:space="0" w:color="808080"/>
-            </w:tcBorders>
+            <w:tcW w:w="5365" w:type="dxa"/>
+            <w:tcBorders/>
             <w:vAlign w:val="center"/>
           </w:tcPr>
           <w:p>
@@ -2491,12 +2195,8 @@
         <w:trPr/>
         <w:tc>
           <w:tcPr>
-            <w:tcW w:w="6147" w:type="dxa"/>
-            <w:tcBorders>
-              <w:left w:val="single" w:sz="6" w:space="0" w:color="808080"/>
-              <w:bottom w:val="single" w:sz="2" w:space="0" w:color="808080"/>
-              <w:right w:val="single" w:sz="6" w:space="0" w:color="808080"/>
-            </w:tcBorders>
+            <w:tcW w:w="5974" w:type="dxa"/>
+            <w:tcBorders/>
             <w:vAlign w:val="center"/>
           </w:tcPr>
           <w:p>
@@ -2515,12 +2215,8 @@
         </w:tc>
         <w:tc>
           <w:tcPr>
-            <w:tcW w:w="5192" w:type="dxa"/>
-            <w:tcBorders>
-              <w:left w:val="single" w:sz="2" w:space="0" w:color="808080"/>
-              <w:bottom w:val="single" w:sz="2" w:space="0" w:color="808080"/>
-              <w:right w:val="single" w:sz="6" w:space="0" w:color="808080"/>
-            </w:tcBorders>
+            <w:tcW w:w="5365" w:type="dxa"/>
+            <w:tcBorders/>
             <w:vAlign w:val="center"/>
           </w:tcPr>
           <w:p>
@@ -2542,12 +2238,8 @@
         <w:trPr/>
         <w:tc>
           <w:tcPr>
-            <w:tcW w:w="6147" w:type="dxa"/>
-            <w:tcBorders>
-              <w:left w:val="single" w:sz="6" w:space="0" w:color="808080"/>
-              <w:bottom w:val="single" w:sz="2" w:space="0" w:color="808080"/>
-              <w:right w:val="single" w:sz="6" w:space="0" w:color="808080"/>
-            </w:tcBorders>
+            <w:tcW w:w="5974" w:type="dxa"/>
+            <w:tcBorders/>
             <w:vAlign w:val="center"/>
           </w:tcPr>
           <w:p>
@@ -2566,12 +2258,8 @@
         </w:tc>
         <w:tc>
           <w:tcPr>
-            <w:tcW w:w="5192" w:type="dxa"/>
-            <w:tcBorders>
-              <w:left w:val="single" w:sz="2" w:space="0" w:color="808080"/>
-              <w:bottom w:val="single" w:sz="2" w:space="0" w:color="808080"/>
-              <w:right w:val="single" w:sz="6" w:space="0" w:color="808080"/>
-            </w:tcBorders>
+            <w:tcW w:w="5365" w:type="dxa"/>
+            <w:tcBorders/>
             <w:vAlign w:val="center"/>
           </w:tcPr>
           <w:p>
@@ -2593,12 +2281,8 @@
         <w:trPr/>
         <w:tc>
           <w:tcPr>
-            <w:tcW w:w="6147" w:type="dxa"/>
-            <w:tcBorders>
-              <w:left w:val="single" w:sz="6" w:space="0" w:color="808080"/>
-              <w:bottom w:val="single" w:sz="6" w:space="0" w:color="808080"/>
-              <w:right w:val="single" w:sz="6" w:space="0" w:color="808080"/>
-            </w:tcBorders>
+            <w:tcW w:w="5974" w:type="dxa"/>
+            <w:tcBorders/>
             <w:vAlign w:val="center"/>
           </w:tcPr>
           <w:p>
@@ -2617,12 +2301,8 @@
         </w:tc>
         <w:tc>
           <w:tcPr>
-            <w:tcW w:w="5192" w:type="dxa"/>
-            <w:tcBorders>
-              <w:left w:val="single" w:sz="2" w:space="0" w:color="808080"/>
-              <w:bottom w:val="single" w:sz="6" w:space="0" w:color="808080"/>
-              <w:right w:val="single" w:sz="6" w:space="0" w:color="808080"/>
-            </w:tcBorders>
+            <w:tcW w:w="5365" w:type="dxa"/>
+            <w:tcBorders/>
             <w:vAlign w:val="center"/>
           </w:tcPr>
           <w:p>
@@ -2766,21 +2446,21 @@
     </w:p>
     <w:tbl>
       <w:tblPr>
-        <w:tblW w:w="5000" w:type="pct"/>
-        <w:jc w:val="left"/>
-        <w:tblInd w:w="60" w:type="dxa"/>
+        <w:tblW w:w="11339" w:type="dxa"/>
+        <w:jc w:val="left"/>
+        <w:tblInd w:w="28" w:type="dxa"/>
         <w:tblLayout w:type="fixed"/>
         <w:tblCellMar>
-          <w:top w:w="60" w:type="dxa"/>
-          <w:left w:w="60" w:type="dxa"/>
-          <w:bottom w:w="60" w:type="dxa"/>
-          <w:right w:w="60" w:type="dxa"/>
+          <w:top w:w="28" w:type="dxa"/>
+          <w:left w:w="28" w:type="dxa"/>
+          <w:bottom w:w="28" w:type="dxa"/>
+          <w:right w:w="28" w:type="dxa"/>
         </w:tblCellMar>
       </w:tblPr>
       <w:tblGrid>
-        <w:gridCol w:w="6833"/>
-        <w:gridCol w:w="1311"/>
-        <w:gridCol w:w="3195"/>
+        <w:gridCol w:w="7143"/>
+        <w:gridCol w:w="1216"/>
+        <w:gridCol w:w="2980"/>
       </w:tblGrid>
       <w:tr>
         <w:trPr>
@@ -2788,20 +2468,14 @@
         </w:trPr>
         <w:tc>
           <w:tcPr>
-            <w:tcW w:w="6833" w:type="dxa"/>
-            <w:tcBorders>
-              <w:top w:val="single" w:sz="6" w:space="0" w:color="808080"/>
-              <w:left w:val="single" w:sz="6" w:space="0" w:color="808080"/>
-              <w:bottom w:val="single" w:sz="2" w:space="0" w:color="808080"/>
-              <w:right w:val="single" w:sz="6" w:space="0" w:color="808080"/>
-            </w:tcBorders>
+            <w:tcW w:w="7143" w:type="dxa"/>
+            <w:tcBorders/>
             <w:vAlign w:val="center"/>
           </w:tcPr>
           <w:p>
             <w:pPr>
               <w:pStyle w:val="TableHeading"/>
               <w:suppressLineNumbers/>
-              <w:shd w:fill="DDEBF7" w:val="clear"/>
               <w:bidi w:val="0"/>
               <w:spacing w:before="0" w:after="283"/>
               <w:jc w:val="center"/>
@@ -2815,20 +2489,14 @@
         </w:tc>
         <w:tc>
           <w:tcPr>
-            <w:tcW w:w="1311" w:type="dxa"/>
-            <w:tcBorders>
-              <w:top w:val="single" w:sz="6" w:space="0" w:color="808080"/>
-              <w:left w:val="single" w:sz="2" w:space="0" w:color="808080"/>
-              <w:bottom w:val="single" w:sz="2" w:space="0" w:color="808080"/>
-              <w:right w:val="single" w:sz="6" w:space="0" w:color="808080"/>
-            </w:tcBorders>
+            <w:tcW w:w="1216" w:type="dxa"/>
+            <w:tcBorders/>
             <w:vAlign w:val="center"/>
           </w:tcPr>
           <w:p>
             <w:pPr>
               <w:pStyle w:val="TableHeading"/>
               <w:suppressLineNumbers/>
-              <w:shd w:fill="DDEBF7" w:val="clear"/>
               <w:bidi w:val="0"/>
               <w:spacing w:before="0" w:after="283"/>
               <w:jc w:val="center"/>
@@ -2842,20 +2510,14 @@
         </w:tc>
         <w:tc>
           <w:tcPr>
-            <w:tcW w:w="3195" w:type="dxa"/>
-            <w:tcBorders>
-              <w:top w:val="single" w:sz="6" w:space="0" w:color="808080"/>
-              <w:left w:val="single" w:sz="2" w:space="0" w:color="808080"/>
-              <w:bottom w:val="single" w:sz="2" w:space="0" w:color="808080"/>
-              <w:right w:val="single" w:sz="6" w:space="0" w:color="808080"/>
-            </w:tcBorders>
+            <w:tcW w:w="2980" w:type="dxa"/>
+            <w:tcBorders/>
             <w:vAlign w:val="center"/>
           </w:tcPr>
           <w:p>
             <w:pPr>
               <w:pStyle w:val="TableHeading"/>
               <w:suppressLineNumbers/>
-              <w:shd w:fill="DDEBF7" w:val="clear"/>
               <w:bidi w:val="0"/>
               <w:spacing w:before="0" w:after="283"/>
               <w:jc w:val="center"/>
@@ -2872,12 +2534,8 @@
         <w:trPr/>
         <w:tc>
           <w:tcPr>
-            <w:tcW w:w="6833" w:type="dxa"/>
-            <w:tcBorders>
-              <w:left w:val="single" w:sz="6" w:space="0" w:color="808080"/>
-              <w:bottom w:val="single" w:sz="2" w:space="0" w:color="808080"/>
-              <w:right w:val="single" w:sz="6" w:space="0" w:color="808080"/>
-            </w:tcBorders>
+            <w:tcW w:w="7143" w:type="dxa"/>
+            <w:tcBorders/>
             <w:vAlign w:val="center"/>
           </w:tcPr>
           <w:p>
@@ -2912,12 +2570,8 @@
         </w:tc>
         <w:tc>
           <w:tcPr>
-            <w:tcW w:w="1311" w:type="dxa"/>
-            <w:tcBorders>
-              <w:left w:val="single" w:sz="2" w:space="0" w:color="808080"/>
-              <w:bottom w:val="single" w:sz="2" w:space="0" w:color="808080"/>
-              <w:right w:val="single" w:sz="6" w:space="0" w:color="808080"/>
-            </w:tcBorders>
+            <w:tcW w:w="1216" w:type="dxa"/>
+            <w:tcBorders/>
             <w:vAlign w:val="center"/>
           </w:tcPr>
           <w:p>
@@ -2936,12 +2590,8 @@
         </w:tc>
         <w:tc>
           <w:tcPr>
-            <w:tcW w:w="3195" w:type="dxa"/>
-            <w:tcBorders>
-              <w:left w:val="single" w:sz="2" w:space="0" w:color="808080"/>
-              <w:bottom w:val="single" w:sz="2" w:space="0" w:color="808080"/>
-              <w:right w:val="single" w:sz="6" w:space="0" w:color="808080"/>
-            </w:tcBorders>
+            <w:tcW w:w="2980" w:type="dxa"/>
+            <w:tcBorders/>
             <w:vAlign w:val="center"/>
           </w:tcPr>
           <w:p>
@@ -2963,12 +2613,8 @@
         <w:trPr/>
         <w:tc>
           <w:tcPr>
-            <w:tcW w:w="6833" w:type="dxa"/>
-            <w:tcBorders>
-              <w:left w:val="single" w:sz="6" w:space="0" w:color="808080"/>
-              <w:bottom w:val="single" w:sz="2" w:space="0" w:color="808080"/>
-              <w:right w:val="single" w:sz="6" w:space="0" w:color="808080"/>
-            </w:tcBorders>
+            <w:tcW w:w="7143" w:type="dxa"/>
+            <w:tcBorders/>
             <w:vAlign w:val="center"/>
           </w:tcPr>
           <w:p>
@@ -2987,12 +2633,8 @@
         </w:tc>
         <w:tc>
           <w:tcPr>
-            <w:tcW w:w="1311" w:type="dxa"/>
-            <w:tcBorders>
-              <w:left w:val="single" w:sz="2" w:space="0" w:color="808080"/>
-              <w:bottom w:val="single" w:sz="2" w:space="0" w:color="808080"/>
-              <w:right w:val="single" w:sz="6" w:space="0" w:color="808080"/>
-            </w:tcBorders>
+            <w:tcW w:w="1216" w:type="dxa"/>
+            <w:tcBorders/>
             <w:vAlign w:val="center"/>
           </w:tcPr>
           <w:p>
@@ -3011,12 +2653,8 @@
         </w:tc>
         <w:tc>
           <w:tcPr>
-            <w:tcW w:w="3195" w:type="dxa"/>
-            <w:tcBorders>
-              <w:left w:val="single" w:sz="2" w:space="0" w:color="808080"/>
-              <w:bottom w:val="single" w:sz="2" w:space="0" w:color="808080"/>
-              <w:right w:val="single" w:sz="6" w:space="0" w:color="808080"/>
-            </w:tcBorders>
+            <w:tcW w:w="2980" w:type="dxa"/>
+            <w:tcBorders/>
             <w:vAlign w:val="center"/>
           </w:tcPr>
           <w:p>
@@ -3038,12 +2676,8 @@
         <w:trPr/>
         <w:tc>
           <w:tcPr>
-            <w:tcW w:w="6833" w:type="dxa"/>
-            <w:tcBorders>
-              <w:left w:val="single" w:sz="6" w:space="0" w:color="808080"/>
-              <w:bottom w:val="single" w:sz="2" w:space="0" w:color="808080"/>
-              <w:right w:val="single" w:sz="6" w:space="0" w:color="808080"/>
-            </w:tcBorders>
+            <w:tcW w:w="7143" w:type="dxa"/>
+            <w:tcBorders/>
             <w:vAlign w:val="center"/>
           </w:tcPr>
           <w:p>
@@ -3072,12 +2706,8 @@
         </w:tc>
         <w:tc>
           <w:tcPr>
-            <w:tcW w:w="1311" w:type="dxa"/>
-            <w:tcBorders>
-              <w:left w:val="single" w:sz="2" w:space="0" w:color="808080"/>
-              <w:bottom w:val="single" w:sz="2" w:space="0" w:color="808080"/>
-              <w:right w:val="single" w:sz="6" w:space="0" w:color="808080"/>
-            </w:tcBorders>
+            <w:tcW w:w="1216" w:type="dxa"/>
+            <w:tcBorders/>
             <w:vAlign w:val="center"/>
           </w:tcPr>
           <w:p>
@@ -3096,12 +2726,8 @@
         </w:tc>
         <w:tc>
           <w:tcPr>
-            <w:tcW w:w="3195" w:type="dxa"/>
-            <w:tcBorders>
-              <w:left w:val="single" w:sz="2" w:space="0" w:color="808080"/>
-              <w:bottom w:val="single" w:sz="2" w:space="0" w:color="808080"/>
-              <w:right w:val="single" w:sz="6" w:space="0" w:color="808080"/>
-            </w:tcBorders>
+            <w:tcW w:w="2980" w:type="dxa"/>
+            <w:tcBorders/>
             <w:vAlign w:val="center"/>
           </w:tcPr>
           <w:p>
@@ -3123,12 +2749,8 @@
         <w:trPr/>
         <w:tc>
           <w:tcPr>
-            <w:tcW w:w="6833" w:type="dxa"/>
-            <w:tcBorders>
-              <w:left w:val="single" w:sz="6" w:space="0" w:color="808080"/>
-              <w:bottom w:val="single" w:sz="2" w:space="0" w:color="808080"/>
-              <w:right w:val="single" w:sz="6" w:space="0" w:color="808080"/>
-            </w:tcBorders>
+            <w:tcW w:w="7143" w:type="dxa"/>
+            <w:tcBorders/>
             <w:vAlign w:val="center"/>
           </w:tcPr>
           <w:p>
@@ -3147,12 +2769,8 @@
         </w:tc>
         <w:tc>
           <w:tcPr>
-            <w:tcW w:w="1311" w:type="dxa"/>
-            <w:tcBorders>
-              <w:left w:val="single" w:sz="2" w:space="0" w:color="808080"/>
-              <w:bottom w:val="single" w:sz="2" w:space="0" w:color="808080"/>
-              <w:right w:val="single" w:sz="6" w:space="0" w:color="808080"/>
-            </w:tcBorders>
+            <w:tcW w:w="1216" w:type="dxa"/>
+            <w:tcBorders/>
             <w:vAlign w:val="center"/>
           </w:tcPr>
           <w:p>
@@ -3171,12 +2789,8 @@
         </w:tc>
         <w:tc>
           <w:tcPr>
-            <w:tcW w:w="3195" w:type="dxa"/>
-            <w:tcBorders>
-              <w:left w:val="single" w:sz="2" w:space="0" w:color="808080"/>
-              <w:bottom w:val="single" w:sz="2" w:space="0" w:color="808080"/>
-              <w:right w:val="single" w:sz="6" w:space="0" w:color="808080"/>
-            </w:tcBorders>
+            <w:tcW w:w="2980" w:type="dxa"/>
+            <w:tcBorders/>
             <w:vAlign w:val="center"/>
           </w:tcPr>
           <w:p>
@@ -3198,12 +2812,8 @@
         <w:trPr/>
         <w:tc>
           <w:tcPr>
-            <w:tcW w:w="6833" w:type="dxa"/>
-            <w:tcBorders>
-              <w:left w:val="single" w:sz="6" w:space="0" w:color="808080"/>
-              <w:bottom w:val="single" w:sz="2" w:space="0" w:color="808080"/>
-              <w:right w:val="single" w:sz="6" w:space="0" w:color="808080"/>
-            </w:tcBorders>
+            <w:tcW w:w="7143" w:type="dxa"/>
+            <w:tcBorders/>
             <w:vAlign w:val="center"/>
           </w:tcPr>
           <w:p>
@@ -3238,12 +2848,8 @@
         </w:tc>
         <w:tc>
           <w:tcPr>
-            <w:tcW w:w="1311" w:type="dxa"/>
-            <w:tcBorders>
-              <w:left w:val="single" w:sz="2" w:space="0" w:color="808080"/>
-              <w:bottom w:val="single" w:sz="2" w:space="0" w:color="808080"/>
-              <w:right w:val="single" w:sz="6" w:space="0" w:color="808080"/>
-            </w:tcBorders>
+            <w:tcW w:w="1216" w:type="dxa"/>
+            <w:tcBorders/>
             <w:vAlign w:val="center"/>
           </w:tcPr>
           <w:p>
@@ -3262,12 +2868,8 @@
         </w:tc>
         <w:tc>
           <w:tcPr>
-            <w:tcW w:w="3195" w:type="dxa"/>
-            <w:tcBorders>
-              <w:left w:val="single" w:sz="2" w:space="0" w:color="808080"/>
-              <w:bottom w:val="single" w:sz="2" w:space="0" w:color="808080"/>
-              <w:right w:val="single" w:sz="6" w:space="0" w:color="808080"/>
-            </w:tcBorders>
+            <w:tcW w:w="2980" w:type="dxa"/>
+            <w:tcBorders/>
             <w:vAlign w:val="center"/>
           </w:tcPr>
           <w:p>
@@ -3289,12 +2891,8 @@
         <w:trPr/>
         <w:tc>
           <w:tcPr>
-            <w:tcW w:w="6833" w:type="dxa"/>
-            <w:tcBorders>
-              <w:left w:val="single" w:sz="6" w:space="0" w:color="808080"/>
-              <w:bottom w:val="single" w:sz="2" w:space="0" w:color="808080"/>
-              <w:right w:val="single" w:sz="6" w:space="0" w:color="808080"/>
-            </w:tcBorders>
+            <w:tcW w:w="7143" w:type="dxa"/>
+            <w:tcBorders/>
             <w:vAlign w:val="center"/>
           </w:tcPr>
           <w:p>
@@ -3313,12 +2911,8 @@
         </w:tc>
         <w:tc>
           <w:tcPr>
-            <w:tcW w:w="1311" w:type="dxa"/>
-            <w:tcBorders>
-              <w:left w:val="single" w:sz="2" w:space="0" w:color="808080"/>
-              <w:bottom w:val="single" w:sz="2" w:space="0" w:color="808080"/>
-              <w:right w:val="single" w:sz="6" w:space="0" w:color="808080"/>
-            </w:tcBorders>
+            <w:tcW w:w="1216" w:type="dxa"/>
+            <w:tcBorders/>
             <w:vAlign w:val="center"/>
           </w:tcPr>
           <w:p>
@@ -3337,12 +2931,8 @@
         </w:tc>
         <w:tc>
           <w:tcPr>
-            <w:tcW w:w="3195" w:type="dxa"/>
-            <w:tcBorders>
-              <w:left w:val="single" w:sz="2" w:space="0" w:color="808080"/>
-              <w:bottom w:val="single" w:sz="2" w:space="0" w:color="808080"/>
-              <w:right w:val="single" w:sz="6" w:space="0" w:color="808080"/>
-            </w:tcBorders>
+            <w:tcW w:w="2980" w:type="dxa"/>
+            <w:tcBorders/>
             <w:vAlign w:val="center"/>
           </w:tcPr>
           <w:p>
@@ -3364,12 +2954,8 @@
         <w:trPr/>
         <w:tc>
           <w:tcPr>
-            <w:tcW w:w="6833" w:type="dxa"/>
-            <w:tcBorders>
-              <w:left w:val="single" w:sz="6" w:space="0" w:color="808080"/>
-              <w:bottom w:val="single" w:sz="6" w:space="0" w:color="808080"/>
-              <w:right w:val="single" w:sz="6" w:space="0" w:color="808080"/>
-            </w:tcBorders>
+            <w:tcW w:w="7143" w:type="dxa"/>
+            <w:tcBorders/>
             <w:vAlign w:val="center"/>
           </w:tcPr>
           <w:p>
@@ -3408,12 +2994,8 @@
         </w:tc>
         <w:tc>
           <w:tcPr>
-            <w:tcW w:w="1311" w:type="dxa"/>
-            <w:tcBorders>
-              <w:left w:val="single" w:sz="2" w:space="0" w:color="808080"/>
-              <w:bottom w:val="single" w:sz="6" w:space="0" w:color="808080"/>
-              <w:right w:val="single" w:sz="6" w:space="0" w:color="808080"/>
-            </w:tcBorders>
+            <w:tcW w:w="1216" w:type="dxa"/>
+            <w:tcBorders/>
             <w:vAlign w:val="center"/>
           </w:tcPr>
           <w:p>
@@ -3432,12 +3014,8 @@
         </w:tc>
         <w:tc>
           <w:tcPr>
-            <w:tcW w:w="3195" w:type="dxa"/>
-            <w:tcBorders>
-              <w:left w:val="single" w:sz="2" w:space="0" w:color="808080"/>
-              <w:bottom w:val="single" w:sz="6" w:space="0" w:color="808080"/>
-              <w:right w:val="single" w:sz="6" w:space="0" w:color="808080"/>
-            </w:tcBorders>
+            <w:tcW w:w="2980" w:type="dxa"/>
+            <w:tcBorders/>
             <w:vAlign w:val="center"/>
           </w:tcPr>
           <w:p>
@@ -3472,21 +3050,21 @@
     </w:p>
     <w:tbl>
       <w:tblPr>
-        <w:tblW w:w="5000" w:type="pct"/>
-        <w:jc w:val="left"/>
-        <w:tblInd w:w="60" w:type="dxa"/>
+        <w:tblW w:w="11339" w:type="dxa"/>
+        <w:jc w:val="left"/>
+        <w:tblInd w:w="28" w:type="dxa"/>
         <w:tblLayout w:type="fixed"/>
         <w:tblCellMar>
-          <w:top w:w="60" w:type="dxa"/>
-          <w:left w:w="60" w:type="dxa"/>
-          <w:bottom w:w="60" w:type="dxa"/>
-          <w:right w:w="60" w:type="dxa"/>
+          <w:top w:w="28" w:type="dxa"/>
+          <w:left w:w="28" w:type="dxa"/>
+          <w:bottom w:w="28" w:type="dxa"/>
+          <w:right w:w="28" w:type="dxa"/>
         </w:tblCellMar>
       </w:tblPr>
       <w:tblGrid>
-        <w:gridCol w:w="3407"/>
-        <w:gridCol w:w="4132"/>
-        <w:gridCol w:w="3800"/>
+        <w:gridCol w:w="3744"/>
+        <w:gridCol w:w="3841"/>
+        <w:gridCol w:w="3754"/>
       </w:tblGrid>
       <w:tr>
         <w:trPr>
@@ -3494,20 +3072,14 @@
         </w:trPr>
         <w:tc>
           <w:tcPr>
-            <w:tcW w:w="3407" w:type="dxa"/>
-            <w:tcBorders>
-              <w:top w:val="single" w:sz="6" w:space="0" w:color="808080"/>
-              <w:left w:val="single" w:sz="6" w:space="0" w:color="808080"/>
-              <w:bottom w:val="single" w:sz="2" w:space="0" w:color="808080"/>
-              <w:right w:val="single" w:sz="6" w:space="0" w:color="808080"/>
-            </w:tcBorders>
+            <w:tcW w:w="3744" w:type="dxa"/>
+            <w:tcBorders/>
             <w:vAlign w:val="center"/>
           </w:tcPr>
           <w:p>
             <w:pPr>
               <w:pStyle w:val="TableHeading"/>
               <w:suppressLineNumbers/>
-              <w:shd w:fill="DDEBF7" w:val="clear"/>
               <w:bidi w:val="0"/>
               <w:spacing w:before="0" w:after="283"/>
               <w:jc w:val="center"/>
@@ -3521,20 +3093,14 @@
         </w:tc>
         <w:tc>
           <w:tcPr>
-            <w:tcW w:w="4132" w:type="dxa"/>
-            <w:tcBorders>
-              <w:top w:val="single" w:sz="6" w:space="0" w:color="808080"/>
-              <w:left w:val="single" w:sz="2" w:space="0" w:color="808080"/>
-              <w:bottom w:val="single" w:sz="2" w:space="0" w:color="808080"/>
-              <w:right w:val="single" w:sz="6" w:space="0" w:color="808080"/>
-            </w:tcBorders>
+            <w:tcW w:w="3841" w:type="dxa"/>
+            <w:tcBorders/>
             <w:vAlign w:val="center"/>
           </w:tcPr>
           <w:p>
             <w:pPr>
               <w:pStyle w:val="TableHeading"/>
               <w:suppressLineNumbers/>
-              <w:shd w:fill="DDEBF7" w:val="clear"/>
               <w:bidi w:val="0"/>
               <w:spacing w:before="0" w:after="283"/>
               <w:jc w:val="center"/>
@@ -3548,20 +3114,14 @@
         </w:tc>
         <w:tc>
           <w:tcPr>
-            <w:tcW w:w="3800" w:type="dxa"/>
-            <w:tcBorders>
-              <w:top w:val="single" w:sz="6" w:space="0" w:color="808080"/>
-              <w:left w:val="single" w:sz="2" w:space="0" w:color="808080"/>
-              <w:bottom w:val="single" w:sz="2" w:space="0" w:color="808080"/>
-              <w:right w:val="single" w:sz="6" w:space="0" w:color="808080"/>
-            </w:tcBorders>
+            <w:tcW w:w="3754" w:type="dxa"/>
+            <w:tcBorders/>
             <w:vAlign w:val="center"/>
           </w:tcPr>
           <w:p>
             <w:pPr>
               <w:pStyle w:val="TableHeading"/>
               <w:suppressLineNumbers/>
-              <w:shd w:fill="DDEBF7" w:val="clear"/>
               <w:bidi w:val="0"/>
               <w:spacing w:before="0" w:after="283"/>
               <w:jc w:val="center"/>
@@ -3578,12 +3138,8 @@
         <w:trPr/>
         <w:tc>
           <w:tcPr>
-            <w:tcW w:w="3407" w:type="dxa"/>
-            <w:tcBorders>
-              <w:left w:val="single" w:sz="6" w:space="0" w:color="808080"/>
-              <w:bottom w:val="single" w:sz="2" w:space="0" w:color="808080"/>
-              <w:right w:val="single" w:sz="6" w:space="0" w:color="808080"/>
-            </w:tcBorders>
+            <w:tcW w:w="3744" w:type="dxa"/>
+            <w:tcBorders/>
             <w:vAlign w:val="center"/>
           </w:tcPr>
           <w:p>
@@ -3612,12 +3168,8 @@
         </w:tc>
         <w:tc>
           <w:tcPr>
-            <w:tcW w:w="4132" w:type="dxa"/>
-            <w:tcBorders>
-              <w:left w:val="single" w:sz="2" w:space="0" w:color="808080"/>
-              <w:bottom w:val="single" w:sz="2" w:space="0" w:color="808080"/>
-              <w:right w:val="single" w:sz="6" w:space="0" w:color="808080"/>
-            </w:tcBorders>
+            <w:tcW w:w="3841" w:type="dxa"/>
+            <w:tcBorders/>
             <w:vAlign w:val="center"/>
           </w:tcPr>
           <w:p>
@@ -3682,12 +3234,8 @@
         </w:tc>
         <w:tc>
           <w:tcPr>
-            <w:tcW w:w="3800" w:type="dxa"/>
-            <w:tcBorders>
-              <w:left w:val="single" w:sz="2" w:space="0" w:color="808080"/>
-              <w:bottom w:val="single" w:sz="2" w:space="0" w:color="808080"/>
-              <w:right w:val="single" w:sz="6" w:space="0" w:color="808080"/>
-            </w:tcBorders>
+            <w:tcW w:w="3754" w:type="dxa"/>
+            <w:tcBorders/>
             <w:vAlign w:val="center"/>
           </w:tcPr>
           <w:p>
@@ -3725,12 +3273,8 @@
         <w:trPr/>
         <w:tc>
           <w:tcPr>
-            <w:tcW w:w="3407" w:type="dxa"/>
-            <w:tcBorders>
-              <w:left w:val="single" w:sz="6" w:space="0" w:color="808080"/>
-              <w:bottom w:val="single" w:sz="2" w:space="0" w:color="808080"/>
-              <w:right w:val="single" w:sz="6" w:space="0" w:color="808080"/>
-            </w:tcBorders>
+            <w:tcW w:w="3744" w:type="dxa"/>
+            <w:tcBorders/>
             <w:vAlign w:val="center"/>
           </w:tcPr>
           <w:p>
@@ -3759,12 +3303,8 @@
         </w:tc>
         <w:tc>
           <w:tcPr>
-            <w:tcW w:w="4132" w:type="dxa"/>
-            <w:tcBorders>
-              <w:left w:val="single" w:sz="2" w:space="0" w:color="808080"/>
-              <w:bottom w:val="single" w:sz="2" w:space="0" w:color="808080"/>
-              <w:right w:val="single" w:sz="6" w:space="0" w:color="808080"/>
-            </w:tcBorders>
+            <w:tcW w:w="3841" w:type="dxa"/>
+            <w:tcBorders/>
             <w:vAlign w:val="center"/>
           </w:tcPr>
           <w:p>
@@ -3809,12 +3349,8 @@
         </w:tc>
         <w:tc>
           <w:tcPr>
-            <w:tcW w:w="3800" w:type="dxa"/>
-            <w:tcBorders>
-              <w:left w:val="single" w:sz="2" w:space="0" w:color="808080"/>
-              <w:bottom w:val="single" w:sz="2" w:space="0" w:color="808080"/>
-              <w:right w:val="single" w:sz="6" w:space="0" w:color="808080"/>
-            </w:tcBorders>
+            <w:tcW w:w="3754" w:type="dxa"/>
+            <w:tcBorders/>
             <w:vAlign w:val="center"/>
           </w:tcPr>
           <w:p>
@@ -3836,12 +3372,8 @@
         <w:trPr/>
         <w:tc>
           <w:tcPr>
-            <w:tcW w:w="3407" w:type="dxa"/>
-            <w:tcBorders>
-              <w:left w:val="single" w:sz="6" w:space="0" w:color="808080"/>
-              <w:bottom w:val="single" w:sz="2" w:space="0" w:color="808080"/>
-              <w:right w:val="single" w:sz="6" w:space="0" w:color="808080"/>
-            </w:tcBorders>
+            <w:tcW w:w="3744" w:type="dxa"/>
+            <w:tcBorders/>
             <w:vAlign w:val="center"/>
           </w:tcPr>
           <w:p>
@@ -3860,12 +3392,8 @@
         </w:tc>
         <w:tc>
           <w:tcPr>
-            <w:tcW w:w="4132" w:type="dxa"/>
-            <w:tcBorders>
-              <w:left w:val="single" w:sz="2" w:space="0" w:color="808080"/>
-              <w:bottom w:val="single" w:sz="2" w:space="0" w:color="808080"/>
-              <w:right w:val="single" w:sz="6" w:space="0" w:color="808080"/>
-            </w:tcBorders>
+            <w:tcW w:w="3841" w:type="dxa"/>
+            <w:tcBorders/>
             <w:vAlign w:val="center"/>
           </w:tcPr>
           <w:p>
@@ -3946,12 +3474,8 @@
         </w:tc>
         <w:tc>
           <w:tcPr>
-            <w:tcW w:w="3800" w:type="dxa"/>
-            <w:tcBorders>
-              <w:left w:val="single" w:sz="2" w:space="0" w:color="808080"/>
-              <w:bottom w:val="single" w:sz="2" w:space="0" w:color="808080"/>
-              <w:right w:val="single" w:sz="6" w:space="0" w:color="808080"/>
-            </w:tcBorders>
+            <w:tcW w:w="3754" w:type="dxa"/>
+            <w:tcBorders/>
             <w:vAlign w:val="center"/>
           </w:tcPr>
           <w:p>
@@ -3989,12 +3513,8 @@
         <w:trPr/>
         <w:tc>
           <w:tcPr>
-            <w:tcW w:w="3407" w:type="dxa"/>
-            <w:tcBorders>
-              <w:left w:val="single" w:sz="6" w:space="0" w:color="808080"/>
-              <w:bottom w:val="single" w:sz="2" w:space="0" w:color="808080"/>
-              <w:right w:val="single" w:sz="6" w:space="0" w:color="808080"/>
-            </w:tcBorders>
+            <w:tcW w:w="3744" w:type="dxa"/>
+            <w:tcBorders/>
             <w:vAlign w:val="center"/>
           </w:tcPr>
           <w:p>
@@ -4013,12 +3533,8 @@
         </w:tc>
         <w:tc>
           <w:tcPr>
-            <w:tcW w:w="4132" w:type="dxa"/>
-            <w:tcBorders>
-              <w:left w:val="single" w:sz="2" w:space="0" w:color="808080"/>
-              <w:bottom w:val="single" w:sz="2" w:space="0" w:color="808080"/>
-              <w:right w:val="single" w:sz="6" w:space="0" w:color="808080"/>
-            </w:tcBorders>
+            <w:tcW w:w="3841" w:type="dxa"/>
+            <w:tcBorders/>
             <w:vAlign w:val="center"/>
           </w:tcPr>
           <w:p>
@@ -4079,12 +3595,8 @@
         </w:tc>
         <w:tc>
           <w:tcPr>
-            <w:tcW w:w="3800" w:type="dxa"/>
-            <w:tcBorders>
-              <w:left w:val="single" w:sz="2" w:space="0" w:color="808080"/>
-              <w:bottom w:val="single" w:sz="2" w:space="0" w:color="808080"/>
-              <w:right w:val="single" w:sz="6" w:space="0" w:color="808080"/>
-            </w:tcBorders>
+            <w:tcW w:w="3754" w:type="dxa"/>
+            <w:tcBorders/>
             <w:vAlign w:val="center"/>
           </w:tcPr>
           <w:p>
@@ -4116,12 +3628,8 @@
         <w:trPr/>
         <w:tc>
           <w:tcPr>
-            <w:tcW w:w="3407" w:type="dxa"/>
-            <w:tcBorders>
-              <w:left w:val="single" w:sz="6" w:space="0" w:color="808080"/>
-              <w:bottom w:val="single" w:sz="6" w:space="0" w:color="808080"/>
-              <w:right w:val="single" w:sz="6" w:space="0" w:color="808080"/>
-            </w:tcBorders>
+            <w:tcW w:w="3744" w:type="dxa"/>
+            <w:tcBorders/>
             <w:vAlign w:val="center"/>
           </w:tcPr>
           <w:p>
@@ -4140,12 +3648,8 @@
         </w:tc>
         <w:tc>
           <w:tcPr>
-            <w:tcW w:w="4132" w:type="dxa"/>
-            <w:tcBorders>
-              <w:left w:val="single" w:sz="2" w:space="0" w:color="808080"/>
-              <w:bottom w:val="single" w:sz="6" w:space="0" w:color="808080"/>
-              <w:right w:val="single" w:sz="6" w:space="0" w:color="808080"/>
-            </w:tcBorders>
+            <w:tcW w:w="3841" w:type="dxa"/>
+            <w:tcBorders/>
             <w:vAlign w:val="center"/>
           </w:tcPr>
           <w:p>
@@ -4210,12 +3714,8 @@
         </w:tc>
         <w:tc>
           <w:tcPr>
-            <w:tcW w:w="3800" w:type="dxa"/>
-            <w:tcBorders>
-              <w:left w:val="single" w:sz="2" w:space="0" w:color="808080"/>
-              <w:bottom w:val="single" w:sz="6" w:space="0" w:color="808080"/>
-              <w:right w:val="single" w:sz="6" w:space="0" w:color="808080"/>
-            </w:tcBorders>
+            <w:tcW w:w="3754" w:type="dxa"/>
+            <w:tcBorders/>
             <w:vAlign w:val="center"/>
           </w:tcPr>
           <w:p>
@@ -7110,6 +6610,20 @@
         <w:rPr>
           <w:rStyle w:val="SourceText"/>
         </w:rPr>
+        <w:t>tags = "Project=\"Venko\" Site=\"plant5\" Client=\"&lt;client&gt;\""</w:t>
+      </w:r>
+    </w:p>
+    <w:p>
+      <w:pPr>
+        <w:pStyle w:val="PreformattedText"/>
+        <w:bidi w:val="0"/>
+        <w:jc w:val="left"/>
+        <w:rPr/>
+      </w:pPr>
+      <w:r>
+        <w:rPr>
+          <w:rStyle w:val="SourceText"/>
+        </w:rPr>
         <w:t>resolve_s3 = true</w:t>
       </w:r>
     </w:p>
@@ -8259,20 +7773,20 @@
     </w:p>
     <w:tbl>
       <w:tblPr>
-        <w:tblW w:w="5000" w:type="pct"/>
-        <w:jc w:val="left"/>
-        <w:tblInd w:w="60" w:type="dxa"/>
+        <w:tblW w:w="11339" w:type="dxa"/>
+        <w:jc w:val="left"/>
+        <w:tblInd w:w="28" w:type="dxa"/>
         <w:tblLayout w:type="fixed"/>
         <w:tblCellMar>
-          <w:top w:w="60" w:type="dxa"/>
-          <w:left w:w="60" w:type="dxa"/>
-          <w:bottom w:w="60" w:type="dxa"/>
-          <w:right w:w="60" w:type="dxa"/>
+          <w:top w:w="28" w:type="dxa"/>
+          <w:left w:w="28" w:type="dxa"/>
+          <w:bottom w:w="28" w:type="dxa"/>
+          <w:right w:w="28" w:type="dxa"/>
         </w:tblCellMar>
       </w:tblPr>
       <w:tblGrid>
-        <w:gridCol w:w="2472"/>
-        <w:gridCol w:w="8867"/>
+        <w:gridCol w:w="2270"/>
+        <w:gridCol w:w="9069"/>
       </w:tblGrid>
       <w:tr>
         <w:trPr>
@@ -8280,20 +7794,14 @@
         </w:trPr>
         <w:tc>
           <w:tcPr>
-            <w:tcW w:w="2472" w:type="dxa"/>
-            <w:tcBorders>
-              <w:top w:val="single" w:sz="6" w:space="0" w:color="808080"/>
-              <w:left w:val="single" w:sz="6" w:space="0" w:color="808080"/>
-              <w:bottom w:val="single" w:sz="2" w:space="0" w:color="808080"/>
-              <w:right w:val="single" w:sz="6" w:space="0" w:color="808080"/>
-            </w:tcBorders>
+            <w:tcW w:w="2270" w:type="dxa"/>
+            <w:tcBorders/>
             <w:vAlign w:val="center"/>
           </w:tcPr>
           <w:p>
             <w:pPr>
               <w:pStyle w:val="TableHeading"/>
               <w:suppressLineNumbers/>
-              <w:shd w:fill="DDEBF7" w:val="clear"/>
               <w:bidi w:val="0"/>
               <w:spacing w:before="0" w:after="283"/>
               <w:jc w:val="center"/>
@@ -8307,20 +7815,14 @@
         </w:tc>
         <w:tc>
           <w:tcPr>
-            <w:tcW w:w="8867" w:type="dxa"/>
-            <w:tcBorders>
-              <w:top w:val="single" w:sz="6" w:space="0" w:color="808080"/>
-              <w:left w:val="single" w:sz="2" w:space="0" w:color="808080"/>
-              <w:bottom w:val="single" w:sz="2" w:space="0" w:color="808080"/>
-              <w:right w:val="single" w:sz="6" w:space="0" w:color="808080"/>
-            </w:tcBorders>
+            <w:tcW w:w="9069" w:type="dxa"/>
+            <w:tcBorders/>
             <w:vAlign w:val="center"/>
           </w:tcPr>
           <w:p>
             <w:pPr>
               <w:pStyle w:val="TableHeading"/>
               <w:suppressLineNumbers/>
-              <w:shd w:fill="DDEBF7" w:val="clear"/>
               <w:bidi w:val="0"/>
               <w:spacing w:before="0" w:after="283"/>
               <w:jc w:val="center"/>
@@ -8337,12 +7839,8 @@
         <w:trPr/>
         <w:tc>
           <w:tcPr>
-            <w:tcW w:w="2472" w:type="dxa"/>
-            <w:tcBorders>
-              <w:left w:val="single" w:sz="6" w:space="0" w:color="808080"/>
-              <w:bottom w:val="single" w:sz="2" w:space="0" w:color="808080"/>
-              <w:right w:val="single" w:sz="6" w:space="0" w:color="808080"/>
-            </w:tcBorders>
+            <w:tcW w:w="2270" w:type="dxa"/>
+            <w:tcBorders/>
             <w:vAlign w:val="center"/>
           </w:tcPr>
           <w:p>
@@ -8361,12 +7859,8 @@
         </w:tc>
         <w:tc>
           <w:tcPr>
-            <w:tcW w:w="8867" w:type="dxa"/>
-            <w:tcBorders>
-              <w:left w:val="single" w:sz="2" w:space="0" w:color="808080"/>
-              <w:bottom w:val="single" w:sz="2" w:space="0" w:color="808080"/>
-              <w:right w:val="single" w:sz="6" w:space="0" w:color="808080"/>
-            </w:tcBorders>
+            <w:tcW w:w="9069" w:type="dxa"/>
+            <w:tcBorders/>
             <w:vAlign w:val="center"/>
           </w:tcPr>
           <w:p>
@@ -8414,12 +7908,8 @@
         <w:trPr/>
         <w:tc>
           <w:tcPr>
-            <w:tcW w:w="2472" w:type="dxa"/>
-            <w:tcBorders>
-              <w:left w:val="single" w:sz="6" w:space="0" w:color="808080"/>
-              <w:bottom w:val="single" w:sz="2" w:space="0" w:color="808080"/>
-              <w:right w:val="single" w:sz="6" w:space="0" w:color="808080"/>
-            </w:tcBorders>
+            <w:tcW w:w="2270" w:type="dxa"/>
+            <w:tcBorders/>
             <w:vAlign w:val="center"/>
           </w:tcPr>
           <w:p>
@@ -8438,12 +7928,8 @@
         </w:tc>
         <w:tc>
           <w:tcPr>
-            <w:tcW w:w="8867" w:type="dxa"/>
-            <w:tcBorders>
-              <w:left w:val="single" w:sz="2" w:space="0" w:color="808080"/>
-              <w:bottom w:val="single" w:sz="2" w:space="0" w:color="808080"/>
-              <w:right w:val="single" w:sz="6" w:space="0" w:color="808080"/>
-            </w:tcBorders>
+            <w:tcW w:w="9069" w:type="dxa"/>
+            <w:tcBorders/>
             <w:vAlign w:val="center"/>
           </w:tcPr>
           <w:p>
@@ -8481,12 +7967,8 @@
         <w:trPr/>
         <w:tc>
           <w:tcPr>
-            <w:tcW w:w="2472" w:type="dxa"/>
-            <w:tcBorders>
-              <w:left w:val="single" w:sz="6" w:space="0" w:color="808080"/>
-              <w:bottom w:val="single" w:sz="6" w:space="0" w:color="808080"/>
-              <w:right w:val="single" w:sz="6" w:space="0" w:color="808080"/>
-            </w:tcBorders>
+            <w:tcW w:w="2270" w:type="dxa"/>
+            <w:tcBorders/>
             <w:vAlign w:val="center"/>
           </w:tcPr>
           <w:p>
@@ -8505,12 +7987,8 @@
         </w:tc>
         <w:tc>
           <w:tcPr>
-            <w:tcW w:w="8867" w:type="dxa"/>
-            <w:tcBorders>
-              <w:left w:val="single" w:sz="2" w:space="0" w:color="808080"/>
-              <w:bottom w:val="single" w:sz="6" w:space="0" w:color="808080"/>
-              <w:right w:val="single" w:sz="6" w:space="0" w:color="808080"/>
-            </w:tcBorders>
+            <w:tcW w:w="9069" w:type="dxa"/>
+            <w:tcBorders/>
             <w:vAlign w:val="center"/>
           </w:tcPr>
           <w:p>
@@ -8730,11 +8208,7 @@
       </w:pPr>
       <w:r>
         <w:rPr/>
-        <w:t xml:space="preserve">☐ </w:t>
-      </w:r>
-      <w:r>
-        <w:rPr/>
-        <w:t xml:space="preserve">Site key chosen, lowercase, used identically everywhere </w:t>
+        <w:t xml:space="preserve">[ ] Site key chosen, lowercase, used identically everywhere </w:t>
       </w:r>
     </w:p>
     <w:p>
@@ -8756,11 +8230,7 @@
       </w:pPr>
       <w:r>
         <w:rPr/>
-        <w:t xml:space="preserve">☐ </w:t>
-      </w:r>
-      <w:r>
-        <w:rPr/>
-        <w:t xml:space="preserve">SD card written, SSH by key, IP reserved on the router </w:t>
+        <w:t xml:space="preserve">[ ] SD card written, SSH by key, IP reserved on the router </w:t>
       </w:r>
     </w:p>
     <w:p>
@@ -8782,11 +8252,7 @@
       </w:pPr>
       <w:r>
         <w:rPr/>
-        <w:t xml:space="preserve">☐ </w:t>
-      </w:r>
-      <w:r>
-        <w:rPr/>
-        <w:t>RS-485 port visible (</w:t>
+        <w:t>[ ] RS-485 port visible (</w:t>
       </w:r>
       <w:r>
         <w:rPr>
@@ -8828,11 +8294,7 @@
       </w:pPr>
       <w:r>
         <w:rPr/>
-        <w:t xml:space="preserve">☐ </w:t>
-      </w:r>
-      <w:r>
-        <w:rPr/>
-        <w:t xml:space="preserve">Four CSVs edited, </w:t>
+        <w:t xml:space="preserve">[ ] Four CSVs edited, </w:t>
       </w:r>
       <w:r>
         <w:rPr>
@@ -8874,7 +8336,7 @@
       </w:pPr>
       <w:r>
         <w:rPr/>
-        <w:t xml:space="preserve">☐ </w:t>
+        <w:t xml:space="preserve">[ ] </w:t>
       </w:r>
       <w:r>
         <w:rPr>
@@ -8906,11 +8368,7 @@
       </w:pPr>
       <w:r>
         <w:rPr/>
-        <w:t xml:space="preserve">☐ </w:t>
-      </w:r>
-      <w:r>
-        <w:rPr/>
-        <w:t xml:space="preserve">Certificate ACTIVE, policy and thing attached </w:t>
+        <w:t xml:space="preserve">[ ] Certificate ACTIVE, policy and thing attached </w:t>
       </w:r>
     </w:p>
     <w:p>
@@ -8932,11 +8390,7 @@
       </w:pPr>
       <w:r>
         <w:rPr/>
-        <w:t xml:space="preserve">☐ </w:t>
-      </w:r>
-      <w:r>
-        <w:rPr/>
-        <w:t xml:space="preserve">Stack </w:t>
+        <w:t xml:space="preserve">[ ] Stack </w:t>
       </w:r>
       <w:r>
         <w:rPr>
@@ -8988,11 +8442,7 @@
       </w:pPr>
       <w:r>
         <w:rPr/>
-        <w:t xml:space="preserve">☐ </w:t>
-      </w:r>
-      <w:r>
-        <w:rPr/>
-        <w:t xml:space="preserve">Overrides labelled, </w:t>
+        <w:t xml:space="preserve">[ ] Overrides labelled, </w:t>
       </w:r>
       <w:r>
         <w:rPr>
@@ -9024,11 +8474,7 @@
       </w:pPr>
       <w:r>
         <w:rPr/>
-        <w:t xml:space="preserve">☐ </w:t>
-      </w:r>
-      <w:r>
-        <w:rPr/>
-        <w:t xml:space="preserve">Pushed with </w:t>
+        <w:t xml:space="preserve">[ ] Pushed with </w:t>
       </w:r>
       <w:r>
         <w:rPr>
@@ -9080,11 +8526,7 @@
       </w:pPr>
       <w:r>
         <w:rPr/>
-        <w:t xml:space="preserve">☐ </w:t>
-      </w:r>
-      <w:r>
-        <w:rPr/>
-        <w:t xml:space="preserve">Data in </w:t>
+        <w:t xml:space="preserve">[ ] Data in </w:t>
       </w:r>
       <w:r>
         <w:rPr>
@@ -9125,7 +8567,7 @@
       </w:pPr>
       <w:r>
         <w:rPr/>
-        <w:t xml:space="preserve">☐ </w:t>
+        <w:t xml:space="preserve">[ ] </w:t>
       </w:r>
       <w:r>
         <w:rPr>
@@ -9924,20 +9366,20 @@
     </w:p>
     <w:tbl>
       <w:tblPr>
-        <w:tblW w:w="5000" w:type="pct"/>
-        <w:jc w:val="left"/>
-        <w:tblInd w:w="60" w:type="dxa"/>
+        <w:tblW w:w="11339" w:type="dxa"/>
+        <w:jc w:val="left"/>
+        <w:tblInd w:w="28" w:type="dxa"/>
         <w:tblLayout w:type="fixed"/>
         <w:tblCellMar>
-          <w:top w:w="60" w:type="dxa"/>
-          <w:left w:w="60" w:type="dxa"/>
-          <w:bottom w:w="60" w:type="dxa"/>
-          <w:right w:w="60" w:type="dxa"/>
+          <w:top w:w="28" w:type="dxa"/>
+          <w:left w:w="28" w:type="dxa"/>
+          <w:bottom w:w="28" w:type="dxa"/>
+          <w:right w:w="28" w:type="dxa"/>
         </w:tblCellMar>
       </w:tblPr>
       <w:tblGrid>
-        <w:gridCol w:w="1276"/>
-        <w:gridCol w:w="10063"/>
+        <w:gridCol w:w="1360"/>
+        <w:gridCol w:w="9979"/>
       </w:tblGrid>
       <w:tr>
         <w:trPr>
@@ -9945,20 +9387,14 @@
         </w:trPr>
         <w:tc>
           <w:tcPr>
-            <w:tcW w:w="1276" w:type="dxa"/>
-            <w:tcBorders>
-              <w:top w:val="single" w:sz="6" w:space="0" w:color="808080"/>
-              <w:left w:val="single" w:sz="6" w:space="0" w:color="808080"/>
-              <w:bottom w:val="single" w:sz="2" w:space="0" w:color="808080"/>
-              <w:right w:val="single" w:sz="6" w:space="0" w:color="808080"/>
-            </w:tcBorders>
+            <w:tcW w:w="1360" w:type="dxa"/>
+            <w:tcBorders/>
             <w:vAlign w:val="center"/>
           </w:tcPr>
           <w:p>
             <w:pPr>
               <w:pStyle w:val="TableHeading"/>
               <w:suppressLineNumbers/>
-              <w:shd w:fill="DDEBF7" w:val="clear"/>
               <w:bidi w:val="0"/>
               <w:spacing w:before="0" w:after="283"/>
               <w:jc w:val="center"/>
@@ -9972,20 +9408,14 @@
         </w:tc>
         <w:tc>
           <w:tcPr>
-            <w:tcW w:w="10063" w:type="dxa"/>
-            <w:tcBorders>
-              <w:top w:val="single" w:sz="6" w:space="0" w:color="808080"/>
-              <w:left w:val="single" w:sz="2" w:space="0" w:color="808080"/>
-              <w:bottom w:val="single" w:sz="2" w:space="0" w:color="808080"/>
-              <w:right w:val="single" w:sz="6" w:space="0" w:color="808080"/>
-            </w:tcBorders>
+            <w:tcW w:w="9979" w:type="dxa"/>
+            <w:tcBorders/>
             <w:vAlign w:val="center"/>
           </w:tcPr>
           <w:p>
             <w:pPr>
               <w:pStyle w:val="TableHeading"/>
               <w:suppressLineNumbers/>
-              <w:shd w:fill="DDEBF7" w:val="clear"/>
               <w:bidi w:val="0"/>
               <w:spacing w:before="0" w:after="283"/>
               <w:jc w:val="center"/>
@@ -10002,12 +9432,8 @@
         <w:trPr/>
         <w:tc>
           <w:tcPr>
-            <w:tcW w:w="1276" w:type="dxa"/>
-            <w:tcBorders>
-              <w:left w:val="single" w:sz="6" w:space="0" w:color="808080"/>
-              <w:bottom w:val="single" w:sz="2" w:space="0" w:color="808080"/>
-              <w:right w:val="single" w:sz="6" w:space="0" w:color="808080"/>
-            </w:tcBorders>
+            <w:tcW w:w="1360" w:type="dxa"/>
+            <w:tcBorders/>
             <w:vAlign w:val="center"/>
           </w:tcPr>
           <w:p>
@@ -10026,12 +9452,8 @@
         </w:tc>
         <w:tc>
           <w:tcPr>
-            <w:tcW w:w="10063" w:type="dxa"/>
-            <w:tcBorders>
-              <w:left w:val="single" w:sz="2" w:space="0" w:color="808080"/>
-              <w:bottom w:val="single" w:sz="2" w:space="0" w:color="808080"/>
-              <w:right w:val="single" w:sz="6" w:space="0" w:color="808080"/>
-            </w:tcBorders>
+            <w:tcW w:w="9979" w:type="dxa"/>
+            <w:tcBorders/>
             <w:vAlign w:val="center"/>
           </w:tcPr>
           <w:p>
@@ -10109,12 +9531,8 @@
         <w:trPr/>
         <w:tc>
           <w:tcPr>
-            <w:tcW w:w="1276" w:type="dxa"/>
-            <w:tcBorders>
-              <w:left w:val="single" w:sz="6" w:space="0" w:color="808080"/>
-              <w:bottom w:val="single" w:sz="6" w:space="0" w:color="808080"/>
-              <w:right w:val="single" w:sz="6" w:space="0" w:color="808080"/>
-            </w:tcBorders>
+            <w:tcW w:w="1360" w:type="dxa"/>
+            <w:tcBorders/>
             <w:vAlign w:val="center"/>
           </w:tcPr>
           <w:p>
@@ -10133,12 +9551,8 @@
         </w:tc>
         <w:tc>
           <w:tcPr>
-            <w:tcW w:w="10063" w:type="dxa"/>
-            <w:tcBorders>
-              <w:left w:val="single" w:sz="2" w:space="0" w:color="808080"/>
-              <w:bottom w:val="single" w:sz="6" w:space="0" w:color="808080"/>
-              <w:right w:val="single" w:sz="6" w:space="0" w:color="808080"/>
-            </w:tcBorders>
+            <w:tcW w:w="9979" w:type="dxa"/>
+            <w:tcBorders/>
             <w:vAlign w:val="center"/>
           </w:tcPr>
           <w:p>
@@ -10238,11 +9652,7 @@
       </w:pPr>
       <w:r>
         <w:rPr/>
-        <w:t xml:space="preserve">☐ </w:t>
-      </w:r>
-      <w:r>
-        <w:rPr/>
-        <w:t xml:space="preserve">History backed up (if wanted) </w:t>
+        <w:t xml:space="preserve">[ ] History backed up (if wanted) </w:t>
       </w:r>
     </w:p>
     <w:p>
@@ -10264,11 +9674,7 @@
       </w:pPr>
       <w:r>
         <w:rPr/>
-        <w:t xml:space="preserve">☐ </w:t>
-      </w:r>
-      <w:r>
-        <w:rPr/>
-        <w:t xml:space="preserve">Pi services, kiosk, sudoers rule, Modbus Tool and </w:t>
+        <w:t xml:space="preserve">[ ] Pi services, kiosk, sudoers rule, Modbus Tool and </w:t>
       </w:r>
       <w:r>
         <w:rPr>
@@ -10300,11 +9706,7 @@
       </w:pPr>
       <w:r>
         <w:rPr/>
-        <w:t xml:space="preserve">☐ </w:t>
-      </w:r>
-      <w:r>
-        <w:rPr/>
-        <w:t xml:space="preserve">Web bucket emptied, stack </w:t>
+        <w:t xml:space="preserve">[ ] Web bucket emptied, stack </w:t>
       </w:r>
       <w:r>
         <w:rPr>
@@ -10336,11 +9738,7 @@
       </w:pPr>
       <w:r>
         <w:rPr/>
-        <w:t xml:space="preserve">☐ </w:t>
-      </w:r>
-      <w:r>
-        <w:rPr/>
-        <w:t xml:space="preserve">Certificate, thing and policy deleted </w:t>
+        <w:t xml:space="preserve">[ ] Certificate, thing and policy deleted </w:t>
       </w:r>
     </w:p>
     <w:p>
@@ -10362,11 +9760,7 @@
       </w:pPr>
       <w:r>
         <w:rPr/>
-        <w:t xml:space="preserve">☐ </w:t>
-      </w:r>
-      <w:r>
-        <w:rPr/>
-        <w:t xml:space="preserve">Data bucket deleted, or kept on purpose </w:t>
+        <w:t xml:space="preserve">[ ] Data bucket deleted, or kept on purpose </w:t>
       </w:r>
     </w:p>
     <w:p>
@@ -10387,11 +9781,7 @@
       </w:pPr>
       <w:r>
         <w:rPr/>
-        <w:t xml:space="preserve">☐ </w:t>
-      </w:r>
-      <w:r>
-        <w:rPr/>
-        <w:t xml:space="preserve">samconfig, overrides, docs and </w:t>
+        <w:t xml:space="preserve">[ ] samconfig, overrides, docs and </w:t>
       </w:r>
       <w:r>
         <w:rPr>
@@ -10418,21 +9808,21 @@
     </w:p>
     <w:tbl>
       <w:tblPr>
-        <w:tblW w:w="5000" w:type="pct"/>
-        <w:jc w:val="left"/>
-        <w:tblInd w:w="60" w:type="dxa"/>
+        <w:tblW w:w="11339" w:type="dxa"/>
+        <w:jc w:val="left"/>
+        <w:tblInd w:w="28" w:type="dxa"/>
         <w:tblLayout w:type="fixed"/>
         <w:tblCellMar>
-          <w:top w:w="60" w:type="dxa"/>
-          <w:left w:w="60" w:type="dxa"/>
-          <w:bottom w:w="60" w:type="dxa"/>
-          <w:right w:w="60" w:type="dxa"/>
+          <w:top w:w="28" w:type="dxa"/>
+          <w:left w:w="28" w:type="dxa"/>
+          <w:bottom w:w="28" w:type="dxa"/>
+          <w:right w:w="28" w:type="dxa"/>
         </w:tblCellMar>
       </w:tblPr>
       <w:tblGrid>
-        <w:gridCol w:w="3240"/>
-        <w:gridCol w:w="3175"/>
-        <w:gridCol w:w="4924"/>
+        <w:gridCol w:w="3531"/>
+        <w:gridCol w:w="2959"/>
+        <w:gridCol w:w="4849"/>
       </w:tblGrid>
       <w:tr>
         <w:trPr>
@@ -10440,20 +9830,14 @@
         </w:trPr>
         <w:tc>
           <w:tcPr>
-            <w:tcW w:w="3240" w:type="dxa"/>
-            <w:tcBorders>
-              <w:top w:val="single" w:sz="6" w:space="0" w:color="808080"/>
-              <w:left w:val="single" w:sz="6" w:space="0" w:color="808080"/>
-              <w:bottom w:val="single" w:sz="2" w:space="0" w:color="808080"/>
-              <w:right w:val="single" w:sz="6" w:space="0" w:color="808080"/>
-            </w:tcBorders>
+            <w:tcW w:w="3531" w:type="dxa"/>
+            <w:tcBorders/>
             <w:vAlign w:val="center"/>
           </w:tcPr>
           <w:p>
             <w:pPr>
               <w:pStyle w:val="TableHeading"/>
               <w:suppressLineNumbers/>
-              <w:shd w:fill="DDEBF7" w:val="clear"/>
               <w:bidi w:val="0"/>
               <w:spacing w:before="0" w:after="283"/>
               <w:jc w:val="center"/>
@@ -10467,20 +9851,14 @@
         </w:tc>
         <w:tc>
           <w:tcPr>
-            <w:tcW w:w="3175" w:type="dxa"/>
-            <w:tcBorders>
-              <w:top w:val="single" w:sz="6" w:space="0" w:color="808080"/>
-              <w:left w:val="single" w:sz="2" w:space="0" w:color="808080"/>
-              <w:bottom w:val="single" w:sz="2" w:space="0" w:color="808080"/>
-              <w:right w:val="single" w:sz="6" w:space="0" w:color="808080"/>
-            </w:tcBorders>
+            <w:tcW w:w="2959" w:type="dxa"/>
+            <w:tcBorders/>
             <w:vAlign w:val="center"/>
           </w:tcPr>
           <w:p>
             <w:pPr>
               <w:pStyle w:val="TableHeading"/>
               <w:suppressLineNumbers/>
-              <w:shd w:fill="DDEBF7" w:val="clear"/>
               <w:bidi w:val="0"/>
               <w:spacing w:before="0" w:after="283"/>
               <w:jc w:val="center"/>
@@ -10494,20 +9872,14 @@
         </w:tc>
         <w:tc>
           <w:tcPr>
-            <w:tcW w:w="4924" w:type="dxa"/>
-            <w:tcBorders>
-              <w:top w:val="single" w:sz="6" w:space="0" w:color="808080"/>
-              <w:left w:val="single" w:sz="2" w:space="0" w:color="808080"/>
-              <w:bottom w:val="single" w:sz="2" w:space="0" w:color="808080"/>
-              <w:right w:val="single" w:sz="6" w:space="0" w:color="808080"/>
-            </w:tcBorders>
+            <w:tcW w:w="4849" w:type="dxa"/>
+            <w:tcBorders/>
             <w:vAlign w:val="center"/>
           </w:tcPr>
           <w:p>
             <w:pPr>
               <w:pStyle w:val="TableHeading"/>
               <w:suppressLineNumbers/>
-              <w:shd w:fill="DDEBF7" w:val="clear"/>
               <w:bidi w:val="0"/>
               <w:spacing w:before="0" w:after="283"/>
               <w:jc w:val="center"/>
@@ -10524,12 +9896,8 @@
         <w:trPr/>
         <w:tc>
           <w:tcPr>
-            <w:tcW w:w="3240" w:type="dxa"/>
-            <w:tcBorders>
-              <w:left w:val="single" w:sz="6" w:space="0" w:color="808080"/>
-              <w:bottom w:val="single" w:sz="2" w:space="0" w:color="808080"/>
-              <w:right w:val="single" w:sz="6" w:space="0" w:color="808080"/>
-            </w:tcBorders>
+            <w:tcW w:w="3531" w:type="dxa"/>
+            <w:tcBorders/>
             <w:vAlign w:val="center"/>
           </w:tcPr>
           <w:p>
@@ -10560,12 +9928,8 @@
         </w:tc>
         <w:tc>
           <w:tcPr>
-            <w:tcW w:w="3175" w:type="dxa"/>
-            <w:tcBorders>
-              <w:left w:val="single" w:sz="2" w:space="0" w:color="808080"/>
-              <w:bottom w:val="single" w:sz="2" w:space="0" w:color="808080"/>
-              <w:right w:val="single" w:sz="6" w:space="0" w:color="808080"/>
-            </w:tcBorders>
+            <w:tcW w:w="2959" w:type="dxa"/>
+            <w:tcBorders/>
             <w:vAlign w:val="center"/>
           </w:tcPr>
           <w:p>
@@ -10590,12 +9954,8 @@
         </w:tc>
         <w:tc>
           <w:tcPr>
-            <w:tcW w:w="4924" w:type="dxa"/>
-            <w:tcBorders>
-              <w:left w:val="single" w:sz="2" w:space="0" w:color="808080"/>
-              <w:bottom w:val="single" w:sz="2" w:space="0" w:color="808080"/>
-              <w:right w:val="single" w:sz="6" w:space="0" w:color="808080"/>
-            </w:tcBorders>
+            <w:tcW w:w="4849" w:type="dxa"/>
+            <w:tcBorders/>
             <w:vAlign w:val="center"/>
           </w:tcPr>
           <w:p>
@@ -10623,12 +9983,8 @@
         <w:trPr/>
         <w:tc>
           <w:tcPr>
-            <w:tcW w:w="3240" w:type="dxa"/>
-            <w:tcBorders>
-              <w:left w:val="single" w:sz="6" w:space="0" w:color="808080"/>
-              <w:bottom w:val="single" w:sz="2" w:space="0" w:color="808080"/>
-              <w:right w:val="single" w:sz="6" w:space="0" w:color="808080"/>
-            </w:tcBorders>
+            <w:tcW w:w="3531" w:type="dxa"/>
+            <w:tcBorders/>
             <w:vAlign w:val="center"/>
           </w:tcPr>
           <w:p>
@@ -10659,12 +10015,8 @@
         </w:tc>
         <w:tc>
           <w:tcPr>
-            <w:tcW w:w="3175" w:type="dxa"/>
-            <w:tcBorders>
-              <w:left w:val="single" w:sz="2" w:space="0" w:color="808080"/>
-              <w:bottom w:val="single" w:sz="2" w:space="0" w:color="808080"/>
-              <w:right w:val="single" w:sz="6" w:space="0" w:color="808080"/>
-            </w:tcBorders>
+            <w:tcW w:w="2959" w:type="dxa"/>
+            <w:tcBorders/>
             <w:vAlign w:val="center"/>
           </w:tcPr>
           <w:p>
@@ -10699,12 +10051,8 @@
         </w:tc>
         <w:tc>
           <w:tcPr>
-            <w:tcW w:w="4924" w:type="dxa"/>
-            <w:tcBorders>
-              <w:left w:val="single" w:sz="2" w:space="0" w:color="808080"/>
-              <w:bottom w:val="single" w:sz="2" w:space="0" w:color="808080"/>
-              <w:right w:val="single" w:sz="6" w:space="0" w:color="808080"/>
-            </w:tcBorders>
+            <w:tcW w:w="4849" w:type="dxa"/>
+            <w:tcBorders/>
             <w:vAlign w:val="center"/>
           </w:tcPr>
           <w:p>
@@ -10736,12 +10084,8 @@
         <w:trPr/>
         <w:tc>
           <w:tcPr>
-            <w:tcW w:w="3240" w:type="dxa"/>
-            <w:tcBorders>
-              <w:left w:val="single" w:sz="6" w:space="0" w:color="808080"/>
-              <w:bottom w:val="single" w:sz="2" w:space="0" w:color="808080"/>
-              <w:right w:val="single" w:sz="6" w:space="0" w:color="808080"/>
-            </w:tcBorders>
+            <w:tcW w:w="3531" w:type="dxa"/>
+            <w:tcBorders/>
             <w:vAlign w:val="center"/>
           </w:tcPr>
           <w:p>
@@ -10766,12 +10110,8 @@
         </w:tc>
         <w:tc>
           <w:tcPr>
-            <w:tcW w:w="3175" w:type="dxa"/>
-            <w:tcBorders>
-              <w:left w:val="single" w:sz="2" w:space="0" w:color="808080"/>
-              <w:bottom w:val="single" w:sz="2" w:space="0" w:color="808080"/>
-              <w:right w:val="single" w:sz="6" w:space="0" w:color="808080"/>
-            </w:tcBorders>
+            <w:tcW w:w="2959" w:type="dxa"/>
+            <w:tcBorders/>
             <w:vAlign w:val="center"/>
           </w:tcPr>
           <w:p>
@@ -10790,12 +10130,8 @@
         </w:tc>
         <w:tc>
           <w:tcPr>
-            <w:tcW w:w="4924" w:type="dxa"/>
-            <w:tcBorders>
-              <w:left w:val="single" w:sz="2" w:space="0" w:color="808080"/>
-              <w:bottom w:val="single" w:sz="2" w:space="0" w:color="808080"/>
-              <w:right w:val="single" w:sz="6" w:space="0" w:color="808080"/>
-            </w:tcBorders>
+            <w:tcW w:w="4849" w:type="dxa"/>
+            <w:tcBorders/>
             <w:vAlign w:val="center"/>
           </w:tcPr>
           <w:p>
@@ -10827,12 +10163,8 @@
         <w:trPr/>
         <w:tc>
           <w:tcPr>
-            <w:tcW w:w="3240" w:type="dxa"/>
-            <w:tcBorders>
-              <w:left w:val="single" w:sz="6" w:space="0" w:color="808080"/>
-              <w:bottom w:val="single" w:sz="2" w:space="0" w:color="808080"/>
-              <w:right w:val="single" w:sz="6" w:space="0" w:color="808080"/>
-            </w:tcBorders>
+            <w:tcW w:w="3531" w:type="dxa"/>
+            <w:tcBorders/>
             <w:vAlign w:val="center"/>
           </w:tcPr>
           <w:p>
@@ -10863,12 +10195,8 @@
         </w:tc>
         <w:tc>
           <w:tcPr>
-            <w:tcW w:w="3175" w:type="dxa"/>
-            <w:tcBorders>
-              <w:left w:val="single" w:sz="2" w:space="0" w:color="808080"/>
-              <w:bottom w:val="single" w:sz="2" w:space="0" w:color="808080"/>
-              <w:right w:val="single" w:sz="6" w:space="0" w:color="808080"/>
-            </w:tcBorders>
+            <w:tcW w:w="2959" w:type="dxa"/>
+            <w:tcBorders/>
             <w:vAlign w:val="center"/>
           </w:tcPr>
           <w:p>
@@ -10887,12 +10215,8 @@
         </w:tc>
         <w:tc>
           <w:tcPr>
-            <w:tcW w:w="4924" w:type="dxa"/>
-            <w:tcBorders>
-              <w:left w:val="single" w:sz="2" w:space="0" w:color="808080"/>
-              <w:bottom w:val="single" w:sz="2" w:space="0" w:color="808080"/>
-              <w:right w:val="single" w:sz="6" w:space="0" w:color="808080"/>
-            </w:tcBorders>
+            <w:tcW w:w="4849" w:type="dxa"/>
+            <w:tcBorders/>
             <w:vAlign w:val="center"/>
           </w:tcPr>
           <w:p>
@@ -10924,12 +10248,8 @@
         <w:trPr/>
         <w:tc>
           <w:tcPr>
-            <w:tcW w:w="3240" w:type="dxa"/>
-            <w:tcBorders>
-              <w:left w:val="single" w:sz="6" w:space="0" w:color="808080"/>
-              <w:bottom w:val="single" w:sz="2" w:space="0" w:color="808080"/>
-              <w:right w:val="single" w:sz="6" w:space="0" w:color="808080"/>
-            </w:tcBorders>
+            <w:tcW w:w="3531" w:type="dxa"/>
+            <w:tcBorders/>
             <w:vAlign w:val="center"/>
           </w:tcPr>
           <w:p>
@@ -10954,12 +10274,8 @@
         </w:tc>
         <w:tc>
           <w:tcPr>
-            <w:tcW w:w="3175" w:type="dxa"/>
-            <w:tcBorders>
-              <w:left w:val="single" w:sz="2" w:space="0" w:color="808080"/>
-              <w:bottom w:val="single" w:sz="2" w:space="0" w:color="808080"/>
-              <w:right w:val="single" w:sz="6" w:space="0" w:color="808080"/>
-            </w:tcBorders>
+            <w:tcW w:w="2959" w:type="dxa"/>
+            <w:tcBorders/>
             <w:vAlign w:val="center"/>
           </w:tcPr>
           <w:p>
@@ -10984,12 +10300,8 @@
         </w:tc>
         <w:tc>
           <w:tcPr>
-            <w:tcW w:w="4924" w:type="dxa"/>
-            <w:tcBorders>
-              <w:left w:val="single" w:sz="2" w:space="0" w:color="808080"/>
-              <w:bottom w:val="single" w:sz="2" w:space="0" w:color="808080"/>
-              <w:right w:val="single" w:sz="6" w:space="0" w:color="808080"/>
-            </w:tcBorders>
+            <w:tcW w:w="4849" w:type="dxa"/>
+            <w:tcBorders/>
             <w:vAlign w:val="center"/>
           </w:tcPr>
           <w:p>
@@ -11013,12 +10325,8 @@
         <w:trPr/>
         <w:tc>
           <w:tcPr>
-            <w:tcW w:w="3240" w:type="dxa"/>
-            <w:tcBorders>
-              <w:left w:val="single" w:sz="6" w:space="0" w:color="808080"/>
-              <w:bottom w:val="single" w:sz="2" w:space="0" w:color="808080"/>
-              <w:right w:val="single" w:sz="6" w:space="0" w:color="808080"/>
-            </w:tcBorders>
+            <w:tcW w:w="3531" w:type="dxa"/>
+            <w:tcBorders/>
             <w:vAlign w:val="center"/>
           </w:tcPr>
           <w:p>
@@ -11037,12 +10345,8 @@
         </w:tc>
         <w:tc>
           <w:tcPr>
-            <w:tcW w:w="3175" w:type="dxa"/>
-            <w:tcBorders>
-              <w:left w:val="single" w:sz="2" w:space="0" w:color="808080"/>
-              <w:bottom w:val="single" w:sz="2" w:space="0" w:color="808080"/>
-              <w:right w:val="single" w:sz="6" w:space="0" w:color="808080"/>
-            </w:tcBorders>
+            <w:tcW w:w="2959" w:type="dxa"/>
+            <w:tcBorders/>
             <w:vAlign w:val="center"/>
           </w:tcPr>
           <w:p>
@@ -11061,12 +10365,8 @@
         </w:tc>
         <w:tc>
           <w:tcPr>
-            <w:tcW w:w="4924" w:type="dxa"/>
-            <w:tcBorders>
-              <w:left w:val="single" w:sz="2" w:space="0" w:color="808080"/>
-              <w:bottom w:val="single" w:sz="2" w:space="0" w:color="808080"/>
-              <w:right w:val="single" w:sz="6" w:space="0" w:color="808080"/>
-            </w:tcBorders>
+            <w:tcW w:w="4849" w:type="dxa"/>
+            <w:tcBorders/>
             <w:vAlign w:val="center"/>
           </w:tcPr>
           <w:p>
@@ -11118,12 +10418,8 @@
         <w:trPr/>
         <w:tc>
           <w:tcPr>
-            <w:tcW w:w="3240" w:type="dxa"/>
-            <w:tcBorders>
-              <w:left w:val="single" w:sz="6" w:space="0" w:color="808080"/>
-              <w:bottom w:val="single" w:sz="2" w:space="0" w:color="808080"/>
-              <w:right w:val="single" w:sz="6" w:space="0" w:color="808080"/>
-            </w:tcBorders>
+            <w:tcW w:w="3531" w:type="dxa"/>
+            <w:tcBorders/>
             <w:vAlign w:val="center"/>
           </w:tcPr>
           <w:p>
@@ -11152,12 +10448,8 @@
         </w:tc>
         <w:tc>
           <w:tcPr>
-            <w:tcW w:w="3175" w:type="dxa"/>
-            <w:tcBorders>
-              <w:left w:val="single" w:sz="2" w:space="0" w:color="808080"/>
-              <w:bottom w:val="single" w:sz="2" w:space="0" w:color="808080"/>
-              <w:right w:val="single" w:sz="6" w:space="0" w:color="808080"/>
-            </w:tcBorders>
+            <w:tcW w:w="2959" w:type="dxa"/>
+            <w:tcBorders/>
             <w:vAlign w:val="center"/>
           </w:tcPr>
           <w:p>
@@ -11176,12 +10468,8 @@
         </w:tc>
         <w:tc>
           <w:tcPr>
-            <w:tcW w:w="4924" w:type="dxa"/>
-            <w:tcBorders>
-              <w:left w:val="single" w:sz="2" w:space="0" w:color="808080"/>
-              <w:bottom w:val="single" w:sz="2" w:space="0" w:color="808080"/>
-              <w:right w:val="single" w:sz="6" w:space="0" w:color="808080"/>
-            </w:tcBorders>
+            <w:tcW w:w="4849" w:type="dxa"/>
+            <w:tcBorders/>
             <w:vAlign w:val="center"/>
           </w:tcPr>
           <w:p>
@@ -11213,12 +10501,8 @@
         <w:trPr/>
         <w:tc>
           <w:tcPr>
-            <w:tcW w:w="3240" w:type="dxa"/>
-            <w:tcBorders>
-              <w:left w:val="single" w:sz="6" w:space="0" w:color="808080"/>
-              <w:bottom w:val="single" w:sz="2" w:space="0" w:color="808080"/>
-              <w:right w:val="single" w:sz="6" w:space="0" w:color="808080"/>
-            </w:tcBorders>
+            <w:tcW w:w="3531" w:type="dxa"/>
+            <w:tcBorders/>
             <w:vAlign w:val="center"/>
           </w:tcPr>
           <w:p>
@@ -11243,12 +10527,8 @@
         </w:tc>
         <w:tc>
           <w:tcPr>
-            <w:tcW w:w="3175" w:type="dxa"/>
-            <w:tcBorders>
-              <w:left w:val="single" w:sz="2" w:space="0" w:color="808080"/>
-              <w:bottom w:val="single" w:sz="2" w:space="0" w:color="808080"/>
-              <w:right w:val="single" w:sz="6" w:space="0" w:color="808080"/>
-            </w:tcBorders>
+            <w:tcW w:w="2959" w:type="dxa"/>
+            <w:tcBorders/>
             <w:vAlign w:val="center"/>
           </w:tcPr>
           <w:p>
@@ -11273,12 +10553,8 @@
         </w:tc>
         <w:tc>
           <w:tcPr>
-            <w:tcW w:w="4924" w:type="dxa"/>
-            <w:tcBorders>
-              <w:left w:val="single" w:sz="2" w:space="0" w:color="808080"/>
-              <w:bottom w:val="single" w:sz="2" w:space="0" w:color="808080"/>
-              <w:right w:val="single" w:sz="6" w:space="0" w:color="808080"/>
-            </w:tcBorders>
+            <w:tcW w:w="4849" w:type="dxa"/>
+            <w:tcBorders/>
             <w:vAlign w:val="center"/>
           </w:tcPr>
           <w:p>
@@ -11300,12 +10576,8 @@
         <w:trPr/>
         <w:tc>
           <w:tcPr>
-            <w:tcW w:w="3240" w:type="dxa"/>
-            <w:tcBorders>
-              <w:left w:val="single" w:sz="6" w:space="0" w:color="808080"/>
-              <w:bottom w:val="single" w:sz="2" w:space="0" w:color="808080"/>
-              <w:right w:val="single" w:sz="6" w:space="0" w:color="808080"/>
-            </w:tcBorders>
+            <w:tcW w:w="3531" w:type="dxa"/>
+            <w:tcBorders/>
             <w:vAlign w:val="center"/>
           </w:tcPr>
           <w:p>
@@ -11336,12 +10608,8 @@
         </w:tc>
         <w:tc>
           <w:tcPr>
-            <w:tcW w:w="3175" w:type="dxa"/>
-            <w:tcBorders>
-              <w:left w:val="single" w:sz="2" w:space="0" w:color="808080"/>
-              <w:bottom w:val="single" w:sz="2" w:space="0" w:color="808080"/>
-              <w:right w:val="single" w:sz="6" w:space="0" w:color="808080"/>
-            </w:tcBorders>
+            <w:tcW w:w="2959" w:type="dxa"/>
+            <w:tcBorders/>
             <w:vAlign w:val="center"/>
           </w:tcPr>
           <w:p>
@@ -11360,12 +10628,8 @@
         </w:tc>
         <w:tc>
           <w:tcPr>
-            <w:tcW w:w="4924" w:type="dxa"/>
-            <w:tcBorders>
-              <w:left w:val="single" w:sz="2" w:space="0" w:color="808080"/>
-              <w:bottom w:val="single" w:sz="2" w:space="0" w:color="808080"/>
-              <w:right w:val="single" w:sz="6" w:space="0" w:color="808080"/>
-            </w:tcBorders>
+            <w:tcW w:w="4849" w:type="dxa"/>
+            <w:tcBorders/>
             <w:vAlign w:val="center"/>
           </w:tcPr>
           <w:p>
@@ -11393,12 +10657,8 @@
         <w:trPr/>
         <w:tc>
           <w:tcPr>
-            <w:tcW w:w="3240" w:type="dxa"/>
-            <w:tcBorders>
-              <w:left w:val="single" w:sz="6" w:space="0" w:color="808080"/>
-              <w:bottom w:val="single" w:sz="6" w:space="0" w:color="808080"/>
-              <w:right w:val="single" w:sz="6" w:space="0" w:color="808080"/>
-            </w:tcBorders>
+            <w:tcW w:w="3531" w:type="dxa"/>
+            <w:tcBorders/>
             <w:vAlign w:val="center"/>
           </w:tcPr>
           <w:p>
@@ -11417,12 +10677,8 @@
         </w:tc>
         <w:tc>
           <w:tcPr>
-            <w:tcW w:w="3175" w:type="dxa"/>
-            <w:tcBorders>
-              <w:left w:val="single" w:sz="2" w:space="0" w:color="808080"/>
-              <w:bottom w:val="single" w:sz="6" w:space="0" w:color="808080"/>
-              <w:right w:val="single" w:sz="6" w:space="0" w:color="808080"/>
-            </w:tcBorders>
+            <w:tcW w:w="2959" w:type="dxa"/>
+            <w:tcBorders/>
             <w:vAlign w:val="center"/>
           </w:tcPr>
           <w:p>
@@ -11441,12 +10697,8 @@
         </w:tc>
         <w:tc>
           <w:tcPr>
-            <w:tcW w:w="4924" w:type="dxa"/>
-            <w:tcBorders>
-              <w:left w:val="single" w:sz="2" w:space="0" w:color="808080"/>
-              <w:bottom w:val="single" w:sz="6" w:space="0" w:color="808080"/>
-              <w:right w:val="single" w:sz="6" w:space="0" w:color="808080"/>
-            </w:tcBorders>
+            <w:tcW w:w="4849" w:type="dxa"/>
+            <w:tcBorders/>
             <w:vAlign w:val="center"/>
           </w:tcPr>
           <w:p>
@@ -11521,7 +10773,7 @@
       <w:pgNumType w:fmt="decimal"/>
       <w:formProt w:val="false"/>
       <w:textDirection w:val="lrTb"/>
-      <w:docGrid w:type="default" w:linePitch="600" w:charSpace="36864"/>
+      <w:docGrid w:type="default" w:linePitch="600" w:charSpace="32768"/>
     </w:sectPr>
   </w:body>
 </w:document>
@@ -13902,10 +13154,10 @@
       <w:bidi w:val="0"/>
     </w:pPr>
     <w:rPr>
-      <w:rFonts w:ascii="Calibri;Arial;sans-serif" w:hAnsi="Calibri;Arial;sans-serif" w:eastAsia="Calibri;Arial;sans-serif" w:cs="Calibri;Arial;sans-serif"/>
+      <w:rFonts w:ascii="Liberation Serif" w:hAnsi="Liberation Serif" w:eastAsia="Noto Serif CJK SC" w:cs="Noto Sans Devanagari"/>
       <w:color w:val="auto"/>
-      <w:sz w:val="22"/>
-      <w:szCs w:val="22"/>
+      <w:sz w:val="24"/>
+      <w:szCs w:val="24"/>
       <w:lang w:val="en-US" w:eastAsia="zh-CN" w:bidi="hi-IN"/>
     </w:rPr>
   </w:style>
@@ -13918,9 +13170,8 @@
     <w:rPr>
       <w:b/>
       <w:bCs/>
-      <w:color w:val="1F4E78"/>
-      <w:sz w:val="40"/>
-      <w:szCs w:val="40"/>
+      <w:sz w:val="48"/>
+      <w:szCs w:val="48"/>
     </w:rPr>
   </w:style>
   <w:style w:type="paragraph" w:styleId="Heading2">
@@ -13929,16 +13180,15 @@
     <w:next w:val="BodyText"/>
     <w:qFormat/>
     <w:pPr>
-      <w:spacing w:before="360" w:after="120"/>
+      <w:spacing w:before="200" w:after="120"/>
       <w:outlineLvl w:val="1"/>
     </w:pPr>
     <w:rPr>
       <w:rFonts w:ascii="Liberation Serif" w:hAnsi="Liberation Serif" w:eastAsia="Noto Serif CJK SC" w:cs="Noto Sans Devanagari"/>
       <w:b/>
       <w:bCs/>
-      <w:color w:val="1F4E78"/>
-      <w:sz w:val="30"/>
-      <w:szCs w:val="30"/>
+      <w:sz w:val="36"/>
+      <w:szCs w:val="36"/>
     </w:rPr>
   </w:style>
   <w:style w:type="character" w:styleId="EndnoteReference">
@@ -13974,9 +13224,7 @@
     <w:name w:val="Source Text"/>
     <w:qFormat/>
     <w:rPr>
-      <w:rFonts w:ascii="DejaVu Sans Mono;Consolas;monospace" w:hAnsi="DejaVu Sans Mono;Consolas;monospace" w:eastAsia="DejaVu Sans Mono;Consolas;monospace" w:cs="DejaVu Sans Mono;Consolas;monospace"/>
-      <w:sz w:val="18"/>
-      <w:szCs w:val="18"/>
+      <w:rFonts w:ascii="Liberation Mono" w:hAnsi="Liberation Mono" w:eastAsia="Noto Sans Mono CJK SC" w:cs="Liberation Mono"/>
     </w:rPr>
   </w:style>
   <w:style w:type="character" w:styleId="Strong">
@@ -14035,10 +13283,7 @@
     <w:basedOn w:val="BodyText"/>
     <w:qFormat/>
     <w:pPr/>
-    <w:rPr>
-      <w:sz w:val="19"/>
-      <w:szCs w:val="19"/>
-    </w:rPr>
+    <w:rPr/>
   </w:style>
   <w:style w:type="paragraph" w:styleId="Index">
     <w:name w:val="Index"/>
@@ -14098,40 +13343,30 @@
       <w:szCs w:val="28"/>
     </w:rPr>
   </w:style>
-  <w:style w:type="paragraph" w:styleId="PreformattedText">
-    <w:name w:val="Preformatted Text"/>
-    <w:basedOn w:val="Normal"/>
-    <w:qFormat/>
-    <w:pPr>
-      <w:pBdr>
-        <w:top w:val="single" w:sz="2" w:space="6" w:color="CCCCCC"/>
-        <w:left w:val="single" w:sz="2" w:space="6" w:color="CCCCCC"/>
-        <w:bottom w:val="single" w:sz="2" w:space="6" w:color="CCCCCC"/>
-        <w:right w:val="single" w:sz="2" w:space="6" w:color="CCCCCC"/>
-      </w:pBdr>
-      <w:shd w:fill="F2F2F2" w:val="clear"/>
-      <w:spacing w:before="0" w:after="0"/>
-    </w:pPr>
-    <w:rPr>
-      <w:rFonts w:ascii="DejaVu Sans Mono;Consolas;monospace" w:hAnsi="DejaVu Sans Mono;Consolas;monospace" w:eastAsia="DejaVu Sans Mono;Consolas;monospace" w:cs="DejaVu Sans Mono;Consolas;monospace"/>
-      <w:sz w:val="17"/>
-      <w:szCs w:val="17"/>
-    </w:rPr>
-  </w:style>
   <w:style w:type="paragraph" w:styleId="TableHeading">
     <w:name w:val="Table Heading"/>
     <w:basedOn w:val="TableContents"/>
     <w:qFormat/>
     <w:pPr>
       <w:suppressLineNumbers/>
-      <w:shd w:fill="DDEBF7" w:val="clear"/>
       <w:jc w:val="center"/>
     </w:pPr>
     <w:rPr>
       <w:b/>
       <w:bCs/>
-      <w:sz w:val="19"/>
-      <w:szCs w:val="19"/>
+    </w:rPr>
+  </w:style>
+  <w:style w:type="paragraph" w:styleId="PreformattedText">
+    <w:name w:val="Preformatted Text"/>
+    <w:basedOn w:val="Normal"/>
+    <w:qFormat/>
+    <w:pPr>
+      <w:spacing w:before="0" w:after="0"/>
+    </w:pPr>
+    <w:rPr>
+      <w:rFonts w:ascii="Liberation Mono" w:hAnsi="Liberation Mono" w:eastAsia="Noto Sans Mono CJK SC" w:cs="Liberation Mono"/>
+      <w:sz w:val="20"/>
+      <w:szCs w:val="20"/>
     </w:rPr>
   </w:style>
 </w:styles>

</xml_diff>

<commit_message>
Sistema view behind a per-site password
The system report (hardware, IP, network, connections) is no longer in /live; it comes
from GET /system and GET /system/stats, which need a 12 h token from POST /system/login.
Only a salted PBKDF2 hash is stored (DynamoDB pk=AUTH sk=SYSTEM), set with
tools/set_system_password.py; tokens are HMAC-signed with that hash, so changing the
password signs everyone out. Wrong passwords wait 1 s. Resumen's system card keeps only
gateway, status and report times. CORS allows X-System-Token.

Co-Authored-By: Claude Opus 5.5 <noreply@anthropic.com>
</commit_message>
<xml_diff>
--- a/docs/new-site-manual.docx
+++ b/docs/new-site-manual.docx
@@ -7349,7 +7349,44 @@
       </w:pPr>
       <w:r>
         <w:rPr/>
-        <w:t xml:space="preserve">It refuses to upload if the config's topics don't match the stack's. Then </w:t>
+        <w:t xml:space="preserve">It refuses to upload if the config's topics don't match the stack's. Set the </w:t>
+      </w:r>
+      <w:r>
+        <w:rPr>
+          <w:rStyle w:val="Strong"/>
+        </w:rPr>
+        <w:t>Sistema</w:t>
+      </w:r>
+      <w:r>
+        <w:rPr/>
+        <w:t xml:space="preserve"> tab's password (asks twice; run it in your own terminal):</w:t>
+      </w:r>
+    </w:p>
+    <w:p>
+      <w:pPr>
+        <w:pStyle w:val="PreformattedText"/>
+        <w:bidi w:val="0"/>
+        <w:spacing w:before="0" w:after="283"/>
+        <w:jc w:val="left"/>
+        <w:rPr/>
+      </w:pPr>
+      <w:r>
+        <w:rPr>
+          <w:rStyle w:val="SourceText"/>
+        </w:rPr>
+        <w:t>python3 tools/set_system_password.py $KEY</w:t>
+      </w:r>
+    </w:p>
+    <w:p>
+      <w:pPr>
+        <w:pStyle w:val="BodyText"/>
+        <w:bidi w:val="0"/>
+        <w:jc w:val="left"/>
+        <w:rPr/>
+      </w:pPr>
+      <w:r>
+        <w:rPr/>
+        <w:t xml:space="preserve">Then </w:t>
       </w:r>
       <w:r>
         <w:rPr>

</xml_diff>